<commit_message>
Fix Coptic font rendering: theta/parenthesis artifacts and gamma/ginga mapping
</commit_message>
<xml_diff>
--- a/copticreader/vesper-matins_deacon_responses.docx
+++ b/copticreader/vesper-matins_deacon_responses.docx
@@ -142,7 +142,39 @@
                 <w:rFonts w:ascii="Avva_Shenouda" w:hAnsi="Avva_Shenouda" w:eastAsia="Avva_Shenouda" w:cs="Avva_Shenouda"/>
                 <w:sz w:val="10"/>
               </w:rPr>
-              <w:t>Epi `procevx3 `cta03te.</w:t>
+              <w:t>Epi</w:t>
+            </w:r>
+            <w:r>
+              <w:rPr>
+                <w:sz w:val="10"/>
+              </w:rPr>
+              <w:t xml:space="preserve"> </w:t>
+            </w:r>
+            <w:r>
+              <w:rPr>
+                <w:rFonts w:ascii="Avva_Shenouda" w:hAnsi="Avva_Shenouda" w:eastAsia="Avva_Shenouda" w:cs="Avva_Shenouda"/>
+                <w:sz w:val="10"/>
+              </w:rPr>
+              <w:t>`procevx3</w:t>
+            </w:r>
+            <w:r>
+              <w:rPr>
+                <w:sz w:val="10"/>
+              </w:rPr>
+              <w:t xml:space="preserve"> </w:t>
+            </w:r>
+            <w:r>
+              <w:rPr>
+                <w:rFonts w:ascii="Avva_Shenouda" w:hAnsi="Avva_Shenouda" w:eastAsia="Avva_Shenouda" w:cs="Avva_Shenouda"/>
+                <w:sz w:val="10"/>
+              </w:rPr>
+              <w:t>`cta03te</w:t>
+            </w:r>
+            <w:r>
+              <w:rPr>
+                <w:sz w:val="10"/>
+              </w:rPr>
+              <w:t>.</w:t>
             </w:r>
           </w:p>
         </w:tc>
@@ -213,7 +245,13 @@
                 <w:rFonts w:ascii="Avva_Shenouda" w:hAnsi="Avva_Shenouda" w:eastAsia="Avva_Shenouda" w:cs="Avva_Shenouda"/>
                 <w:sz w:val="10"/>
               </w:rPr>
-              <w:t>Procev7ac0e.</w:t>
+              <w:t>Procev7ac0e</w:t>
+            </w:r>
+            <w:r>
+              <w:rPr>
+                <w:sz w:val="10"/>
+              </w:rPr>
+              <w:t>.</w:t>
             </w:r>
           </w:p>
         </w:tc>
@@ -284,7 +322,390 @@
                 <w:rFonts w:ascii="Avva_Shenouda" w:hAnsi="Avva_Shenouda" w:eastAsia="Avva_Shenouda" w:cs="Avva_Shenouda"/>
                 <w:sz w:val="10"/>
               </w:rPr>
-              <w:t>Twbh hina `nte `Fnov5 nai nan: `nte42enh3t qaron: `nte4cwtem `eron: `nte4`erbo30in `eron: `nte4[i `nni5ho nem nitwbh `nte n3 e0ovab `nta4 `ntotov `e`hr3i `egwn `epi`aga0on `nc3ov niben: `nte4xa nennobi nan `ebol.</w:t>
+              <w:t>Twbh</w:t>
+            </w:r>
+            <w:r>
+              <w:rPr>
+                <w:sz w:val="10"/>
+              </w:rPr>
+              <w:t xml:space="preserve"> </w:t>
+            </w:r>
+            <w:r>
+              <w:rPr>
+                <w:rFonts w:ascii="Avva_Shenouda" w:hAnsi="Avva_Shenouda" w:eastAsia="Avva_Shenouda" w:cs="Avva_Shenouda"/>
+                <w:sz w:val="10"/>
+              </w:rPr>
+              <w:t>hina</w:t>
+            </w:r>
+            <w:r>
+              <w:rPr>
+                <w:sz w:val="10"/>
+              </w:rPr>
+              <w:t xml:space="preserve"> </w:t>
+            </w:r>
+            <w:r>
+              <w:rPr>
+                <w:rFonts w:ascii="Avva_Shenouda" w:hAnsi="Avva_Shenouda" w:eastAsia="Avva_Shenouda" w:cs="Avva_Shenouda"/>
+                <w:sz w:val="10"/>
+              </w:rPr>
+              <w:t>`nte</w:t>
+            </w:r>
+            <w:r>
+              <w:rPr>
+                <w:sz w:val="10"/>
+              </w:rPr>
+              <w:t xml:space="preserve"> </w:t>
+            </w:r>
+            <w:r>
+              <w:rPr>
+                <w:rFonts w:ascii="Avva_Shenouda" w:hAnsi="Avva_Shenouda" w:eastAsia="Avva_Shenouda" w:cs="Avva_Shenouda"/>
+                <w:sz w:val="10"/>
+              </w:rPr>
+              <w:t>`Fnov5</w:t>
+            </w:r>
+            <w:r>
+              <w:rPr>
+                <w:sz w:val="10"/>
+              </w:rPr>
+              <w:t xml:space="preserve"> </w:t>
+            </w:r>
+            <w:r>
+              <w:rPr>
+                <w:rFonts w:ascii="Avva_Shenouda" w:hAnsi="Avva_Shenouda" w:eastAsia="Avva_Shenouda" w:cs="Avva_Shenouda"/>
+                <w:sz w:val="10"/>
+              </w:rPr>
+              <w:t>nai</w:t>
+            </w:r>
+            <w:r>
+              <w:rPr>
+                <w:sz w:val="10"/>
+              </w:rPr>
+              <w:t xml:space="preserve"> </w:t>
+            </w:r>
+            <w:r>
+              <w:rPr>
+                <w:rFonts w:ascii="Avva_Shenouda" w:hAnsi="Avva_Shenouda" w:eastAsia="Avva_Shenouda" w:cs="Avva_Shenouda"/>
+                <w:sz w:val="10"/>
+              </w:rPr>
+              <w:t>nan</w:t>
+            </w:r>
+            <w:r>
+              <w:rPr>
+                <w:sz w:val="10"/>
+              </w:rPr>
+              <w:t xml:space="preserve">: </w:t>
+            </w:r>
+            <w:r>
+              <w:rPr>
+                <w:rFonts w:ascii="Avva_Shenouda" w:hAnsi="Avva_Shenouda" w:eastAsia="Avva_Shenouda" w:cs="Avva_Shenouda"/>
+                <w:sz w:val="10"/>
+              </w:rPr>
+              <w:t>`nte42enh3t</w:t>
+            </w:r>
+            <w:r>
+              <w:rPr>
+                <w:sz w:val="10"/>
+              </w:rPr>
+              <w:t xml:space="preserve"> </w:t>
+            </w:r>
+            <w:r>
+              <w:rPr>
+                <w:rFonts w:ascii="Avva_Shenouda" w:hAnsi="Avva_Shenouda" w:eastAsia="Avva_Shenouda" w:cs="Avva_Shenouda"/>
+                <w:sz w:val="10"/>
+              </w:rPr>
+              <w:t>qaron</w:t>
+            </w:r>
+            <w:r>
+              <w:rPr>
+                <w:sz w:val="10"/>
+              </w:rPr>
+              <w:t xml:space="preserve">: </w:t>
+            </w:r>
+            <w:r>
+              <w:rPr>
+                <w:rFonts w:ascii="Avva_Shenouda" w:hAnsi="Avva_Shenouda" w:eastAsia="Avva_Shenouda" w:cs="Avva_Shenouda"/>
+                <w:sz w:val="10"/>
+              </w:rPr>
+              <w:t>`nte4cwtem</w:t>
+            </w:r>
+            <w:r>
+              <w:rPr>
+                <w:sz w:val="10"/>
+              </w:rPr>
+              <w:t xml:space="preserve"> </w:t>
+            </w:r>
+            <w:r>
+              <w:rPr>
+                <w:rFonts w:ascii="Avva_Shenouda" w:hAnsi="Avva_Shenouda" w:eastAsia="Avva_Shenouda" w:cs="Avva_Shenouda"/>
+                <w:sz w:val="10"/>
+              </w:rPr>
+              <w:t>`eron</w:t>
+            </w:r>
+            <w:r>
+              <w:rPr>
+                <w:sz w:val="10"/>
+              </w:rPr>
+              <w:t xml:space="preserve">: </w:t>
+            </w:r>
+            <w:r>
+              <w:rPr>
+                <w:rFonts w:ascii="Avva_Shenouda" w:hAnsi="Avva_Shenouda" w:eastAsia="Avva_Shenouda" w:cs="Avva_Shenouda"/>
+                <w:sz w:val="10"/>
+              </w:rPr>
+              <w:t>`nte4`erbo30in</w:t>
+            </w:r>
+            <w:r>
+              <w:rPr>
+                <w:sz w:val="10"/>
+              </w:rPr>
+              <w:t xml:space="preserve"> </w:t>
+            </w:r>
+            <w:r>
+              <w:rPr>
+                <w:rFonts w:ascii="Avva_Shenouda" w:hAnsi="Avva_Shenouda" w:eastAsia="Avva_Shenouda" w:cs="Avva_Shenouda"/>
+                <w:sz w:val="10"/>
+              </w:rPr>
+              <w:t>`eron</w:t>
+            </w:r>
+            <w:r>
+              <w:rPr>
+                <w:sz w:val="10"/>
+              </w:rPr>
+              <w:t xml:space="preserve">: </w:t>
+            </w:r>
+            <w:r>
+              <w:rPr>
+                <w:rFonts w:ascii="Avva_Shenouda" w:hAnsi="Avva_Shenouda" w:eastAsia="Avva_Shenouda" w:cs="Avva_Shenouda"/>
+                <w:sz w:val="10"/>
+              </w:rPr>
+              <w:t>`nte4si</w:t>
+            </w:r>
+            <w:r>
+              <w:rPr>
+                <w:sz w:val="10"/>
+              </w:rPr>
+              <w:t xml:space="preserve"> </w:t>
+            </w:r>
+            <w:r>
+              <w:rPr>
+                <w:rFonts w:ascii="Avva_Shenouda" w:hAnsi="Avva_Shenouda" w:eastAsia="Avva_Shenouda" w:cs="Avva_Shenouda"/>
+                <w:sz w:val="10"/>
+              </w:rPr>
+              <w:t>`nni5ho</w:t>
+            </w:r>
+            <w:r>
+              <w:rPr>
+                <w:sz w:val="10"/>
+              </w:rPr>
+              <w:t xml:space="preserve"> </w:t>
+            </w:r>
+            <w:r>
+              <w:rPr>
+                <w:rFonts w:ascii="Avva_Shenouda" w:hAnsi="Avva_Shenouda" w:eastAsia="Avva_Shenouda" w:cs="Avva_Shenouda"/>
+                <w:sz w:val="10"/>
+              </w:rPr>
+              <w:t>nem</w:t>
+            </w:r>
+            <w:r>
+              <w:rPr>
+                <w:sz w:val="10"/>
+              </w:rPr>
+              <w:t xml:space="preserve"> </w:t>
+            </w:r>
+            <w:r>
+              <w:rPr>
+                <w:rFonts w:ascii="Avva_Shenouda" w:hAnsi="Avva_Shenouda" w:eastAsia="Avva_Shenouda" w:cs="Avva_Shenouda"/>
+                <w:sz w:val="10"/>
+              </w:rPr>
+              <w:t>nitwbh</w:t>
+            </w:r>
+            <w:r>
+              <w:rPr>
+                <w:sz w:val="10"/>
+              </w:rPr>
+              <w:t xml:space="preserve"> </w:t>
+            </w:r>
+            <w:r>
+              <w:rPr>
+                <w:rFonts w:ascii="Avva_Shenouda" w:hAnsi="Avva_Shenouda" w:eastAsia="Avva_Shenouda" w:cs="Avva_Shenouda"/>
+                <w:sz w:val="10"/>
+              </w:rPr>
+              <w:t>`nte</w:t>
+            </w:r>
+            <w:r>
+              <w:rPr>
+                <w:sz w:val="10"/>
+              </w:rPr>
+              <w:t xml:space="preserve"> </w:t>
+            </w:r>
+            <w:r>
+              <w:rPr>
+                <w:rFonts w:ascii="Avva_Shenouda" w:hAnsi="Avva_Shenouda" w:eastAsia="Avva_Shenouda" w:cs="Avva_Shenouda"/>
+                <w:sz w:val="10"/>
+              </w:rPr>
+              <w:t>n3</w:t>
+            </w:r>
+            <w:r>
+              <w:rPr>
+                <w:sz w:val="10"/>
+              </w:rPr>
+              <w:t xml:space="preserve"> </w:t>
+            </w:r>
+            <w:r>
+              <w:rPr>
+                <w:rFonts w:ascii="Avva_Shenouda" w:hAnsi="Avva_Shenouda" w:eastAsia="Avva_Shenouda" w:cs="Avva_Shenouda"/>
+                <w:sz w:val="10"/>
+              </w:rPr>
+              <w:t>e0ovab</w:t>
+            </w:r>
+            <w:r>
+              <w:rPr>
+                <w:sz w:val="10"/>
+              </w:rPr>
+              <w:t xml:space="preserve"> </w:t>
+            </w:r>
+            <w:r>
+              <w:rPr>
+                <w:rFonts w:ascii="Avva_Shenouda" w:hAnsi="Avva_Shenouda" w:eastAsia="Avva_Shenouda" w:cs="Avva_Shenouda"/>
+                <w:sz w:val="10"/>
+              </w:rPr>
+              <w:t>`nta4</w:t>
+            </w:r>
+            <w:r>
+              <w:rPr>
+                <w:sz w:val="10"/>
+              </w:rPr>
+              <w:t xml:space="preserve"> </w:t>
+            </w:r>
+            <w:r>
+              <w:rPr>
+                <w:rFonts w:ascii="Avva_Shenouda" w:hAnsi="Avva_Shenouda" w:eastAsia="Avva_Shenouda" w:cs="Avva_Shenouda"/>
+                <w:sz w:val="10"/>
+              </w:rPr>
+              <w:t>`ntotov</w:t>
+            </w:r>
+            <w:r>
+              <w:rPr>
+                <w:sz w:val="10"/>
+              </w:rPr>
+              <w:t xml:space="preserve"> </w:t>
+            </w:r>
+            <w:r>
+              <w:rPr>
+                <w:rFonts w:ascii="Avva_Shenouda" w:hAnsi="Avva_Shenouda" w:eastAsia="Avva_Shenouda" w:cs="Avva_Shenouda"/>
+                <w:sz w:val="10"/>
+              </w:rPr>
+              <w:t>`e`hr3i</w:t>
+            </w:r>
+            <w:r>
+              <w:rPr>
+                <w:sz w:val="10"/>
+              </w:rPr>
+              <w:t xml:space="preserve"> </w:t>
+            </w:r>
+            <w:r>
+              <w:rPr>
+                <w:rFonts w:ascii="Avva_Shenouda" w:hAnsi="Avva_Shenouda" w:eastAsia="Avva_Shenouda" w:cs="Avva_Shenouda"/>
+                <w:sz w:val="10"/>
+              </w:rPr>
+              <w:t>`egwn</w:t>
+            </w:r>
+            <w:r>
+              <w:rPr>
+                <w:sz w:val="10"/>
+              </w:rPr>
+              <w:t xml:space="preserve"> </w:t>
+            </w:r>
+            <w:r>
+              <w:rPr>
+                <w:rFonts w:ascii="Avva_Shenouda" w:hAnsi="Avva_Shenouda" w:eastAsia="Avva_Shenouda" w:cs="Avva_Shenouda"/>
+                <w:sz w:val="10"/>
+              </w:rPr>
+              <w:t>`epi`aja0on</w:t>
+            </w:r>
+            <w:r>
+              <w:rPr>
+                <w:sz w:val="10"/>
+              </w:rPr>
+              <w:t xml:space="preserve"> </w:t>
+            </w:r>
+            <w:r>
+              <w:rPr>
+                <w:rFonts w:ascii="Avva_Shenouda" w:hAnsi="Avva_Shenouda" w:eastAsia="Avva_Shenouda" w:cs="Avva_Shenouda"/>
+                <w:sz w:val="10"/>
+              </w:rPr>
+              <w:t>`nc3ov</w:t>
+            </w:r>
+            <w:r>
+              <w:rPr>
+                <w:sz w:val="10"/>
+              </w:rPr>
+              <w:t xml:space="preserve"> </w:t>
+            </w:r>
+            <w:r>
+              <w:rPr>
+                <w:rFonts w:ascii="Avva_Shenouda" w:hAnsi="Avva_Shenouda" w:eastAsia="Avva_Shenouda" w:cs="Avva_Shenouda"/>
+                <w:sz w:val="10"/>
+              </w:rPr>
+              <w:t>niben</w:t>
+            </w:r>
+            <w:r>
+              <w:rPr>
+                <w:sz w:val="10"/>
+              </w:rPr>
+              <w:t xml:space="preserve">: </w:t>
+            </w:r>
+            <w:r>
+              <w:rPr>
+                <w:rFonts w:ascii="Avva_Shenouda" w:hAnsi="Avva_Shenouda" w:eastAsia="Avva_Shenouda" w:cs="Avva_Shenouda"/>
+                <w:sz w:val="10"/>
+              </w:rPr>
+              <w:t>`nte4xa</w:t>
+            </w:r>
+            <w:r>
+              <w:rPr>
+                <w:sz w:val="10"/>
+              </w:rPr>
+              <w:t xml:space="preserve"> </w:t>
+            </w:r>
+            <w:r>
+              <w:rPr>
+                <w:rFonts w:ascii="Avva_Shenouda" w:hAnsi="Avva_Shenouda" w:eastAsia="Avva_Shenouda" w:cs="Avva_Shenouda"/>
+                <w:sz w:val="10"/>
+              </w:rPr>
+              <w:t>nennobi</w:t>
+            </w:r>
+            <w:r>
+              <w:rPr>
+                <w:sz w:val="10"/>
+              </w:rPr>
+              <w:t xml:space="preserve"> </w:t>
+            </w:r>
+            <w:r>
+              <w:rPr>
+                <w:rFonts w:ascii="Avva_Shenouda" w:hAnsi="Avva_Shenouda" w:eastAsia="Avva_Shenouda" w:cs="Avva_Shenouda"/>
+                <w:sz w:val="10"/>
+              </w:rPr>
+              <w:t>nan</w:t>
+            </w:r>
+            <w:r>
+              <w:rPr>
+                <w:sz w:val="10"/>
+              </w:rPr>
+              <w:t xml:space="preserve"> </w:t>
+            </w:r>
+            <w:r>
+              <w:rPr>
+                <w:rFonts w:ascii="Avva_Shenouda" w:hAnsi="Avva_Shenouda" w:eastAsia="Avva_Shenouda" w:cs="Avva_Shenouda"/>
+                <w:sz w:val="10"/>
+              </w:rPr>
+              <w:t>`ebol</w:t>
+            </w:r>
+            <w:r>
+              <w:rPr>
+                <w:sz w:val="10"/>
+              </w:rPr>
+              <w:t>.</w:t>
             </w:r>
           </w:p>
         </w:tc>
@@ -355,7 +776,780 @@
                 <w:rFonts w:ascii="Avva_Shenouda" w:hAnsi="Avva_Shenouda" w:eastAsia="Avva_Shenouda" w:cs="Avva_Shenouda"/>
                 <w:sz w:val="10"/>
               </w:rPr>
-              <w:t>Twbh `egen nenio5 nem nen`cn3ov `etav`enkot av`mton `mmwov qen `fnah5 mP=x=c icgen `p`eneh: nenio5 `e0ovab `n`arx3`epickopoc ke nenio5 `n`epickopoc: nenio5 `nh3govmenoc ke nenio5 `m`precbvteroc nem nen`cn3ov `ndiakwn: nenio5 `mmonaxoc: ke nenio5 `nlaikoc: nem `ehr3i egen 5`anapavcic t3rc `nte ni`xrictianoc. Hina `nte P=x=c pennov5 5`mton `nnovyvx3 t3rov qen piparadicoc `nte `povno4: `anon de hwn `nte4`er pinai neman: `nte4xa nennobi nan `ebol.</w:t>
+              <w:t>Twbh</w:t>
+            </w:r>
+            <w:r>
+              <w:rPr>
+                <w:sz w:val="10"/>
+              </w:rPr>
+              <w:t xml:space="preserve"> </w:t>
+            </w:r>
+            <w:r>
+              <w:rPr>
+                <w:rFonts w:ascii="Avva_Shenouda" w:hAnsi="Avva_Shenouda" w:eastAsia="Avva_Shenouda" w:cs="Avva_Shenouda"/>
+                <w:sz w:val="10"/>
+              </w:rPr>
+              <w:t>`egen</w:t>
+            </w:r>
+            <w:r>
+              <w:rPr>
+                <w:sz w:val="10"/>
+              </w:rPr>
+              <w:t xml:space="preserve"> </w:t>
+            </w:r>
+            <w:r>
+              <w:rPr>
+                <w:rFonts w:ascii="Avva_Shenouda" w:hAnsi="Avva_Shenouda" w:eastAsia="Avva_Shenouda" w:cs="Avva_Shenouda"/>
+                <w:sz w:val="10"/>
+              </w:rPr>
+              <w:t>nenio5</w:t>
+            </w:r>
+            <w:r>
+              <w:rPr>
+                <w:sz w:val="10"/>
+              </w:rPr>
+              <w:t xml:space="preserve"> </w:t>
+            </w:r>
+            <w:r>
+              <w:rPr>
+                <w:rFonts w:ascii="Avva_Shenouda" w:hAnsi="Avva_Shenouda" w:eastAsia="Avva_Shenouda" w:cs="Avva_Shenouda"/>
+                <w:sz w:val="10"/>
+              </w:rPr>
+              <w:t>nem</w:t>
+            </w:r>
+            <w:r>
+              <w:rPr>
+                <w:sz w:val="10"/>
+              </w:rPr>
+              <w:t xml:space="preserve"> </w:t>
+            </w:r>
+            <w:r>
+              <w:rPr>
+                <w:rFonts w:ascii="Avva_Shenouda" w:hAnsi="Avva_Shenouda" w:eastAsia="Avva_Shenouda" w:cs="Avva_Shenouda"/>
+                <w:sz w:val="10"/>
+              </w:rPr>
+              <w:t>nen`cn3ov</w:t>
+            </w:r>
+            <w:r>
+              <w:rPr>
+                <w:sz w:val="10"/>
+              </w:rPr>
+              <w:t xml:space="preserve"> </w:t>
+            </w:r>
+            <w:r>
+              <w:rPr>
+                <w:rFonts w:ascii="Avva_Shenouda" w:hAnsi="Avva_Shenouda" w:eastAsia="Avva_Shenouda" w:cs="Avva_Shenouda"/>
+                <w:sz w:val="10"/>
+              </w:rPr>
+              <w:t>`etav`enkot</w:t>
+            </w:r>
+            <w:r>
+              <w:rPr>
+                <w:sz w:val="10"/>
+              </w:rPr>
+              <w:t xml:space="preserve"> </w:t>
+            </w:r>
+            <w:r>
+              <w:rPr>
+                <w:rFonts w:ascii="Avva_Shenouda" w:hAnsi="Avva_Shenouda" w:eastAsia="Avva_Shenouda" w:cs="Avva_Shenouda"/>
+                <w:sz w:val="10"/>
+              </w:rPr>
+              <w:t>av`mton</w:t>
+            </w:r>
+            <w:r>
+              <w:rPr>
+                <w:sz w:val="10"/>
+              </w:rPr>
+              <w:t xml:space="preserve"> </w:t>
+            </w:r>
+            <w:r>
+              <w:rPr>
+                <w:rFonts w:ascii="Avva_Shenouda" w:hAnsi="Avva_Shenouda" w:eastAsia="Avva_Shenouda" w:cs="Avva_Shenouda"/>
+                <w:sz w:val="10"/>
+              </w:rPr>
+              <w:t>`mmwov</w:t>
+            </w:r>
+            <w:r>
+              <w:rPr>
+                <w:sz w:val="10"/>
+              </w:rPr>
+              <w:t xml:space="preserve"> </w:t>
+            </w:r>
+            <w:r>
+              <w:rPr>
+                <w:rFonts w:ascii="Avva_Shenouda" w:hAnsi="Avva_Shenouda" w:eastAsia="Avva_Shenouda" w:cs="Avva_Shenouda"/>
+                <w:sz w:val="10"/>
+              </w:rPr>
+              <w:t>qen</w:t>
+            </w:r>
+            <w:r>
+              <w:rPr>
+                <w:sz w:val="10"/>
+              </w:rPr>
+              <w:t xml:space="preserve"> </w:t>
+            </w:r>
+            <w:r>
+              <w:rPr>
+                <w:rFonts w:ascii="Avva_Shenouda" w:hAnsi="Avva_Shenouda" w:eastAsia="Avva_Shenouda" w:cs="Avva_Shenouda"/>
+                <w:sz w:val="10"/>
+              </w:rPr>
+              <w:t>`fnah5</w:t>
+            </w:r>
+            <w:r>
+              <w:rPr>
+                <w:sz w:val="10"/>
+              </w:rPr>
+              <w:t xml:space="preserve"> </w:t>
+            </w:r>
+            <w:r>
+              <w:rPr>
+                <w:rFonts w:ascii="Avva_Shenouda" w:hAnsi="Avva_Shenouda" w:eastAsia="Avva_Shenouda" w:cs="Avva_Shenouda"/>
+                <w:sz w:val="10"/>
+              </w:rPr>
+              <w:t>mP=x=c</w:t>
+            </w:r>
+            <w:r>
+              <w:rPr>
+                <w:sz w:val="10"/>
+              </w:rPr>
+              <w:t xml:space="preserve"> </w:t>
+            </w:r>
+            <w:r>
+              <w:rPr>
+                <w:rFonts w:ascii="Avva_Shenouda" w:hAnsi="Avva_Shenouda" w:eastAsia="Avva_Shenouda" w:cs="Avva_Shenouda"/>
+                <w:sz w:val="10"/>
+              </w:rPr>
+              <w:t>icgen</w:t>
+            </w:r>
+            <w:r>
+              <w:rPr>
+                <w:sz w:val="10"/>
+              </w:rPr>
+              <w:t xml:space="preserve"> </w:t>
+            </w:r>
+            <w:r>
+              <w:rPr>
+                <w:rFonts w:ascii="Avva_Shenouda" w:hAnsi="Avva_Shenouda" w:eastAsia="Avva_Shenouda" w:cs="Avva_Shenouda"/>
+                <w:sz w:val="10"/>
+              </w:rPr>
+              <w:t>`p`eneh</w:t>
+            </w:r>
+            <w:r>
+              <w:rPr>
+                <w:sz w:val="10"/>
+              </w:rPr>
+              <w:t xml:space="preserve">: </w:t>
+            </w:r>
+            <w:r>
+              <w:rPr>
+                <w:rFonts w:ascii="Avva_Shenouda" w:hAnsi="Avva_Shenouda" w:eastAsia="Avva_Shenouda" w:cs="Avva_Shenouda"/>
+                <w:sz w:val="10"/>
+              </w:rPr>
+              <w:t>nenio5</w:t>
+            </w:r>
+            <w:r>
+              <w:rPr>
+                <w:sz w:val="10"/>
+              </w:rPr>
+              <w:t xml:space="preserve"> </w:t>
+            </w:r>
+            <w:r>
+              <w:rPr>
+                <w:rFonts w:ascii="Avva_Shenouda" w:hAnsi="Avva_Shenouda" w:eastAsia="Avva_Shenouda" w:cs="Avva_Shenouda"/>
+                <w:sz w:val="10"/>
+              </w:rPr>
+              <w:t>`e0ovab</w:t>
+            </w:r>
+            <w:r>
+              <w:rPr>
+                <w:sz w:val="10"/>
+              </w:rPr>
+              <w:t xml:space="preserve"> </w:t>
+            </w:r>
+            <w:r>
+              <w:rPr>
+                <w:rFonts w:ascii="Avva_Shenouda" w:hAnsi="Avva_Shenouda" w:eastAsia="Avva_Shenouda" w:cs="Avva_Shenouda"/>
+                <w:sz w:val="10"/>
+              </w:rPr>
+              <w:t>`n`arx3`epickopoc</w:t>
+            </w:r>
+            <w:r>
+              <w:rPr>
+                <w:sz w:val="10"/>
+              </w:rPr>
+              <w:t xml:space="preserve"> </w:t>
+            </w:r>
+            <w:r>
+              <w:rPr>
+                <w:rFonts w:ascii="Avva_Shenouda" w:hAnsi="Avva_Shenouda" w:eastAsia="Avva_Shenouda" w:cs="Avva_Shenouda"/>
+                <w:sz w:val="10"/>
+              </w:rPr>
+              <w:t>ke</w:t>
+            </w:r>
+            <w:r>
+              <w:rPr>
+                <w:sz w:val="10"/>
+              </w:rPr>
+              <w:t xml:space="preserve"> </w:t>
+            </w:r>
+            <w:r>
+              <w:rPr>
+                <w:rFonts w:ascii="Avva_Shenouda" w:hAnsi="Avva_Shenouda" w:eastAsia="Avva_Shenouda" w:cs="Avva_Shenouda"/>
+                <w:sz w:val="10"/>
+              </w:rPr>
+              <w:t>nenio5</w:t>
+            </w:r>
+            <w:r>
+              <w:rPr>
+                <w:sz w:val="10"/>
+              </w:rPr>
+              <w:t xml:space="preserve"> </w:t>
+            </w:r>
+            <w:r>
+              <w:rPr>
+                <w:rFonts w:ascii="Avva_Shenouda" w:hAnsi="Avva_Shenouda" w:eastAsia="Avva_Shenouda" w:cs="Avva_Shenouda"/>
+                <w:sz w:val="10"/>
+              </w:rPr>
+              <w:t>`n`epickopoc</w:t>
+            </w:r>
+            <w:r>
+              <w:rPr>
+                <w:sz w:val="10"/>
+              </w:rPr>
+              <w:t xml:space="preserve">: </w:t>
+            </w:r>
+            <w:r>
+              <w:rPr>
+                <w:rFonts w:ascii="Avva_Shenouda" w:hAnsi="Avva_Shenouda" w:eastAsia="Avva_Shenouda" w:cs="Avva_Shenouda"/>
+                <w:sz w:val="10"/>
+              </w:rPr>
+              <w:t>nenio5</w:t>
+            </w:r>
+            <w:r>
+              <w:rPr>
+                <w:sz w:val="10"/>
+              </w:rPr>
+              <w:t xml:space="preserve"> </w:t>
+            </w:r>
+            <w:r>
+              <w:rPr>
+                <w:rFonts w:ascii="Avva_Shenouda" w:hAnsi="Avva_Shenouda" w:eastAsia="Avva_Shenouda" w:cs="Avva_Shenouda"/>
+                <w:sz w:val="10"/>
+              </w:rPr>
+              <w:t>`nh3jovmenoc</w:t>
+            </w:r>
+            <w:r>
+              <w:rPr>
+                <w:sz w:val="10"/>
+              </w:rPr>
+              <w:t xml:space="preserve"> </w:t>
+            </w:r>
+            <w:r>
+              <w:rPr>
+                <w:rFonts w:ascii="Avva_Shenouda" w:hAnsi="Avva_Shenouda" w:eastAsia="Avva_Shenouda" w:cs="Avva_Shenouda"/>
+                <w:sz w:val="10"/>
+              </w:rPr>
+              <w:t>ke</w:t>
+            </w:r>
+            <w:r>
+              <w:rPr>
+                <w:sz w:val="10"/>
+              </w:rPr>
+              <w:t xml:space="preserve"> </w:t>
+            </w:r>
+            <w:r>
+              <w:rPr>
+                <w:rFonts w:ascii="Avva_Shenouda" w:hAnsi="Avva_Shenouda" w:eastAsia="Avva_Shenouda" w:cs="Avva_Shenouda"/>
+                <w:sz w:val="10"/>
+              </w:rPr>
+              <w:t>nenio5</w:t>
+            </w:r>
+            <w:r>
+              <w:rPr>
+                <w:sz w:val="10"/>
+              </w:rPr>
+              <w:t xml:space="preserve"> </w:t>
+            </w:r>
+            <w:r>
+              <w:rPr>
+                <w:rFonts w:ascii="Avva_Shenouda" w:hAnsi="Avva_Shenouda" w:eastAsia="Avva_Shenouda" w:cs="Avva_Shenouda"/>
+                <w:sz w:val="10"/>
+              </w:rPr>
+              <w:t>`m`precbvteroc</w:t>
+            </w:r>
+            <w:r>
+              <w:rPr>
+                <w:sz w:val="10"/>
+              </w:rPr>
+              <w:t xml:space="preserve"> </w:t>
+            </w:r>
+            <w:r>
+              <w:rPr>
+                <w:rFonts w:ascii="Avva_Shenouda" w:hAnsi="Avva_Shenouda" w:eastAsia="Avva_Shenouda" w:cs="Avva_Shenouda"/>
+                <w:sz w:val="10"/>
+              </w:rPr>
+              <w:t>nem</w:t>
+            </w:r>
+            <w:r>
+              <w:rPr>
+                <w:sz w:val="10"/>
+              </w:rPr>
+              <w:t xml:space="preserve"> </w:t>
+            </w:r>
+            <w:r>
+              <w:rPr>
+                <w:rFonts w:ascii="Avva_Shenouda" w:hAnsi="Avva_Shenouda" w:eastAsia="Avva_Shenouda" w:cs="Avva_Shenouda"/>
+                <w:sz w:val="10"/>
+              </w:rPr>
+              <w:t>nen`cn3ov</w:t>
+            </w:r>
+            <w:r>
+              <w:rPr>
+                <w:sz w:val="10"/>
+              </w:rPr>
+              <w:t xml:space="preserve"> </w:t>
+            </w:r>
+            <w:r>
+              <w:rPr>
+                <w:rFonts w:ascii="Avva_Shenouda" w:hAnsi="Avva_Shenouda" w:eastAsia="Avva_Shenouda" w:cs="Avva_Shenouda"/>
+                <w:sz w:val="10"/>
+              </w:rPr>
+              <w:t>`ndiakwn</w:t>
+            </w:r>
+            <w:r>
+              <w:rPr>
+                <w:sz w:val="10"/>
+              </w:rPr>
+              <w:t xml:space="preserve">: </w:t>
+            </w:r>
+            <w:r>
+              <w:rPr>
+                <w:rFonts w:ascii="Avva_Shenouda" w:hAnsi="Avva_Shenouda" w:eastAsia="Avva_Shenouda" w:cs="Avva_Shenouda"/>
+                <w:sz w:val="10"/>
+              </w:rPr>
+              <w:t>nenio5</w:t>
+            </w:r>
+            <w:r>
+              <w:rPr>
+                <w:sz w:val="10"/>
+              </w:rPr>
+              <w:t xml:space="preserve"> </w:t>
+            </w:r>
+            <w:r>
+              <w:rPr>
+                <w:rFonts w:ascii="Avva_Shenouda" w:hAnsi="Avva_Shenouda" w:eastAsia="Avva_Shenouda" w:cs="Avva_Shenouda"/>
+                <w:sz w:val="10"/>
+              </w:rPr>
+              <w:t>`mmonaxoc</w:t>
+            </w:r>
+            <w:r>
+              <w:rPr>
+                <w:sz w:val="10"/>
+              </w:rPr>
+              <w:t xml:space="preserve">: </w:t>
+            </w:r>
+            <w:r>
+              <w:rPr>
+                <w:rFonts w:ascii="Avva_Shenouda" w:hAnsi="Avva_Shenouda" w:eastAsia="Avva_Shenouda" w:cs="Avva_Shenouda"/>
+                <w:sz w:val="10"/>
+              </w:rPr>
+              <w:t>ke</w:t>
+            </w:r>
+            <w:r>
+              <w:rPr>
+                <w:sz w:val="10"/>
+              </w:rPr>
+              <w:t xml:space="preserve"> </w:t>
+            </w:r>
+            <w:r>
+              <w:rPr>
+                <w:rFonts w:ascii="Avva_Shenouda" w:hAnsi="Avva_Shenouda" w:eastAsia="Avva_Shenouda" w:cs="Avva_Shenouda"/>
+                <w:sz w:val="10"/>
+              </w:rPr>
+              <w:t>nenio5</w:t>
+            </w:r>
+            <w:r>
+              <w:rPr>
+                <w:sz w:val="10"/>
+              </w:rPr>
+              <w:t xml:space="preserve"> </w:t>
+            </w:r>
+            <w:r>
+              <w:rPr>
+                <w:rFonts w:ascii="Avva_Shenouda" w:hAnsi="Avva_Shenouda" w:eastAsia="Avva_Shenouda" w:cs="Avva_Shenouda"/>
+                <w:sz w:val="10"/>
+              </w:rPr>
+              <w:t>`nlaikoc</w:t>
+            </w:r>
+            <w:r>
+              <w:rPr>
+                <w:sz w:val="10"/>
+              </w:rPr>
+              <w:t xml:space="preserve">: </w:t>
+            </w:r>
+            <w:r>
+              <w:rPr>
+                <w:rFonts w:ascii="Avva_Shenouda" w:hAnsi="Avva_Shenouda" w:eastAsia="Avva_Shenouda" w:cs="Avva_Shenouda"/>
+                <w:sz w:val="10"/>
+              </w:rPr>
+              <w:t>nem</w:t>
+            </w:r>
+            <w:r>
+              <w:rPr>
+                <w:sz w:val="10"/>
+              </w:rPr>
+              <w:t xml:space="preserve"> </w:t>
+            </w:r>
+            <w:r>
+              <w:rPr>
+                <w:rFonts w:ascii="Avva_Shenouda" w:hAnsi="Avva_Shenouda" w:eastAsia="Avva_Shenouda" w:cs="Avva_Shenouda"/>
+                <w:sz w:val="10"/>
+              </w:rPr>
+              <w:t>`ehr3i</w:t>
+            </w:r>
+            <w:r>
+              <w:rPr>
+                <w:sz w:val="10"/>
+              </w:rPr>
+              <w:t xml:space="preserve"> </w:t>
+            </w:r>
+            <w:r>
+              <w:rPr>
+                <w:rFonts w:ascii="Avva_Shenouda" w:hAnsi="Avva_Shenouda" w:eastAsia="Avva_Shenouda" w:cs="Avva_Shenouda"/>
+                <w:sz w:val="10"/>
+              </w:rPr>
+              <w:t>egen</w:t>
+            </w:r>
+            <w:r>
+              <w:rPr>
+                <w:sz w:val="10"/>
+              </w:rPr>
+              <w:t xml:space="preserve"> </w:t>
+            </w:r>
+            <w:r>
+              <w:rPr>
+                <w:rFonts w:ascii="Avva_Shenouda" w:hAnsi="Avva_Shenouda" w:eastAsia="Avva_Shenouda" w:cs="Avva_Shenouda"/>
+                <w:sz w:val="10"/>
+              </w:rPr>
+              <w:t>5`anapavcic</w:t>
+            </w:r>
+            <w:r>
+              <w:rPr>
+                <w:sz w:val="10"/>
+              </w:rPr>
+              <w:t xml:space="preserve"> </w:t>
+            </w:r>
+            <w:r>
+              <w:rPr>
+                <w:rFonts w:ascii="Avva_Shenouda" w:hAnsi="Avva_Shenouda" w:eastAsia="Avva_Shenouda" w:cs="Avva_Shenouda"/>
+                <w:sz w:val="10"/>
+              </w:rPr>
+              <w:t>t3rc</w:t>
+            </w:r>
+            <w:r>
+              <w:rPr>
+                <w:sz w:val="10"/>
+              </w:rPr>
+              <w:t xml:space="preserve"> </w:t>
+            </w:r>
+            <w:r>
+              <w:rPr>
+                <w:rFonts w:ascii="Avva_Shenouda" w:hAnsi="Avva_Shenouda" w:eastAsia="Avva_Shenouda" w:cs="Avva_Shenouda"/>
+                <w:sz w:val="10"/>
+              </w:rPr>
+              <w:t>`nte</w:t>
+            </w:r>
+            <w:r>
+              <w:rPr>
+                <w:sz w:val="10"/>
+              </w:rPr>
+              <w:t xml:space="preserve"> </w:t>
+            </w:r>
+            <w:r>
+              <w:rPr>
+                <w:rFonts w:ascii="Avva_Shenouda" w:hAnsi="Avva_Shenouda" w:eastAsia="Avva_Shenouda" w:cs="Avva_Shenouda"/>
+                <w:sz w:val="10"/>
+              </w:rPr>
+              <w:t>ni`xrictianoc</w:t>
+            </w:r>
+            <w:r>
+              <w:rPr>
+                <w:sz w:val="10"/>
+              </w:rPr>
+              <w:t xml:space="preserve">. </w:t>
+            </w:r>
+            <w:r>
+              <w:rPr>
+                <w:rFonts w:ascii="Avva_Shenouda" w:hAnsi="Avva_Shenouda" w:eastAsia="Avva_Shenouda" w:cs="Avva_Shenouda"/>
+                <w:sz w:val="10"/>
+              </w:rPr>
+              <w:t>Hina</w:t>
+            </w:r>
+            <w:r>
+              <w:rPr>
+                <w:sz w:val="10"/>
+              </w:rPr>
+              <w:t xml:space="preserve"> </w:t>
+            </w:r>
+            <w:r>
+              <w:rPr>
+                <w:rFonts w:ascii="Avva_Shenouda" w:hAnsi="Avva_Shenouda" w:eastAsia="Avva_Shenouda" w:cs="Avva_Shenouda"/>
+                <w:sz w:val="10"/>
+              </w:rPr>
+              <w:t>`nte</w:t>
+            </w:r>
+            <w:r>
+              <w:rPr>
+                <w:sz w:val="10"/>
+              </w:rPr>
+              <w:t xml:space="preserve"> </w:t>
+            </w:r>
+            <w:r>
+              <w:rPr>
+                <w:rFonts w:ascii="Avva_Shenouda" w:hAnsi="Avva_Shenouda" w:eastAsia="Avva_Shenouda" w:cs="Avva_Shenouda"/>
+                <w:sz w:val="10"/>
+              </w:rPr>
+              <w:t>P=x=c</w:t>
+            </w:r>
+            <w:r>
+              <w:rPr>
+                <w:sz w:val="10"/>
+              </w:rPr>
+              <w:t xml:space="preserve"> </w:t>
+            </w:r>
+            <w:r>
+              <w:rPr>
+                <w:rFonts w:ascii="Avva_Shenouda" w:hAnsi="Avva_Shenouda" w:eastAsia="Avva_Shenouda" w:cs="Avva_Shenouda"/>
+                <w:sz w:val="10"/>
+              </w:rPr>
+              <w:t>pennov5</w:t>
+            </w:r>
+            <w:r>
+              <w:rPr>
+                <w:sz w:val="10"/>
+              </w:rPr>
+              <w:t xml:space="preserve"> </w:t>
+            </w:r>
+            <w:r>
+              <w:rPr>
+                <w:rFonts w:ascii="Avva_Shenouda" w:hAnsi="Avva_Shenouda" w:eastAsia="Avva_Shenouda" w:cs="Avva_Shenouda"/>
+                <w:sz w:val="10"/>
+              </w:rPr>
+              <w:t>5`mton</w:t>
+            </w:r>
+            <w:r>
+              <w:rPr>
+                <w:sz w:val="10"/>
+              </w:rPr>
+              <w:t xml:space="preserve"> </w:t>
+            </w:r>
+            <w:r>
+              <w:rPr>
+                <w:rFonts w:ascii="Avva_Shenouda" w:hAnsi="Avva_Shenouda" w:eastAsia="Avva_Shenouda" w:cs="Avva_Shenouda"/>
+                <w:sz w:val="10"/>
+              </w:rPr>
+              <w:t>`nnovyvx3</w:t>
+            </w:r>
+            <w:r>
+              <w:rPr>
+                <w:sz w:val="10"/>
+              </w:rPr>
+              <w:t xml:space="preserve"> </w:t>
+            </w:r>
+            <w:r>
+              <w:rPr>
+                <w:rFonts w:ascii="Avva_Shenouda" w:hAnsi="Avva_Shenouda" w:eastAsia="Avva_Shenouda" w:cs="Avva_Shenouda"/>
+                <w:sz w:val="10"/>
+              </w:rPr>
+              <w:t>t3rov</w:t>
+            </w:r>
+            <w:r>
+              <w:rPr>
+                <w:sz w:val="10"/>
+              </w:rPr>
+              <w:t xml:space="preserve"> </w:t>
+            </w:r>
+            <w:r>
+              <w:rPr>
+                <w:rFonts w:ascii="Avva_Shenouda" w:hAnsi="Avva_Shenouda" w:eastAsia="Avva_Shenouda" w:cs="Avva_Shenouda"/>
+                <w:sz w:val="10"/>
+              </w:rPr>
+              <w:t>qen</w:t>
+            </w:r>
+            <w:r>
+              <w:rPr>
+                <w:sz w:val="10"/>
+              </w:rPr>
+              <w:t xml:space="preserve"> </w:t>
+            </w:r>
+            <w:r>
+              <w:rPr>
+                <w:rFonts w:ascii="Avva_Shenouda" w:hAnsi="Avva_Shenouda" w:eastAsia="Avva_Shenouda" w:cs="Avva_Shenouda"/>
+                <w:sz w:val="10"/>
+              </w:rPr>
+              <w:t>piparadicoc</w:t>
+            </w:r>
+            <w:r>
+              <w:rPr>
+                <w:sz w:val="10"/>
+              </w:rPr>
+              <w:t xml:space="preserve"> </w:t>
+            </w:r>
+            <w:r>
+              <w:rPr>
+                <w:rFonts w:ascii="Avva_Shenouda" w:hAnsi="Avva_Shenouda" w:eastAsia="Avva_Shenouda" w:cs="Avva_Shenouda"/>
+                <w:sz w:val="10"/>
+              </w:rPr>
+              <w:t>`nte</w:t>
+            </w:r>
+            <w:r>
+              <w:rPr>
+                <w:sz w:val="10"/>
+              </w:rPr>
+              <w:t xml:space="preserve"> </w:t>
+            </w:r>
+            <w:r>
+              <w:rPr>
+                <w:rFonts w:ascii="Avva_Shenouda" w:hAnsi="Avva_Shenouda" w:eastAsia="Avva_Shenouda" w:cs="Avva_Shenouda"/>
+                <w:sz w:val="10"/>
+              </w:rPr>
+              <w:t>`povno4</w:t>
+            </w:r>
+            <w:r>
+              <w:rPr>
+                <w:sz w:val="10"/>
+              </w:rPr>
+              <w:t xml:space="preserve">: </w:t>
+            </w:r>
+            <w:r>
+              <w:rPr>
+                <w:rFonts w:ascii="Avva_Shenouda" w:hAnsi="Avva_Shenouda" w:eastAsia="Avva_Shenouda" w:cs="Avva_Shenouda"/>
+                <w:sz w:val="10"/>
+              </w:rPr>
+              <w:t>`anon</w:t>
+            </w:r>
+            <w:r>
+              <w:rPr>
+                <w:sz w:val="10"/>
+              </w:rPr>
+              <w:t xml:space="preserve"> </w:t>
+            </w:r>
+            <w:r>
+              <w:rPr>
+                <w:rFonts w:ascii="Avva_Shenouda" w:hAnsi="Avva_Shenouda" w:eastAsia="Avva_Shenouda" w:cs="Avva_Shenouda"/>
+                <w:sz w:val="10"/>
+              </w:rPr>
+              <w:t>de</w:t>
+            </w:r>
+            <w:r>
+              <w:rPr>
+                <w:sz w:val="10"/>
+              </w:rPr>
+              <w:t xml:space="preserve"> </w:t>
+            </w:r>
+            <w:r>
+              <w:rPr>
+                <w:rFonts w:ascii="Avva_Shenouda" w:hAnsi="Avva_Shenouda" w:eastAsia="Avva_Shenouda" w:cs="Avva_Shenouda"/>
+                <w:sz w:val="10"/>
+              </w:rPr>
+              <w:t>hwn</w:t>
+            </w:r>
+            <w:r>
+              <w:rPr>
+                <w:sz w:val="10"/>
+              </w:rPr>
+              <w:t xml:space="preserve"> </w:t>
+            </w:r>
+            <w:r>
+              <w:rPr>
+                <w:rFonts w:ascii="Avva_Shenouda" w:hAnsi="Avva_Shenouda" w:eastAsia="Avva_Shenouda" w:cs="Avva_Shenouda"/>
+                <w:sz w:val="10"/>
+              </w:rPr>
+              <w:t>`nte4`er</w:t>
+            </w:r>
+            <w:r>
+              <w:rPr>
+                <w:sz w:val="10"/>
+              </w:rPr>
+              <w:t xml:space="preserve"> </w:t>
+            </w:r>
+            <w:r>
+              <w:rPr>
+                <w:rFonts w:ascii="Avva_Shenouda" w:hAnsi="Avva_Shenouda" w:eastAsia="Avva_Shenouda" w:cs="Avva_Shenouda"/>
+                <w:sz w:val="10"/>
+              </w:rPr>
+              <w:t>pinai</w:t>
+            </w:r>
+            <w:r>
+              <w:rPr>
+                <w:sz w:val="10"/>
+              </w:rPr>
+              <w:t xml:space="preserve"> </w:t>
+            </w:r>
+            <w:r>
+              <w:rPr>
+                <w:rFonts w:ascii="Avva_Shenouda" w:hAnsi="Avva_Shenouda" w:eastAsia="Avva_Shenouda" w:cs="Avva_Shenouda"/>
+                <w:sz w:val="10"/>
+              </w:rPr>
+              <w:t>neman</w:t>
+            </w:r>
+            <w:r>
+              <w:rPr>
+                <w:sz w:val="10"/>
+              </w:rPr>
+              <w:t xml:space="preserve">: </w:t>
+            </w:r>
+            <w:r>
+              <w:rPr>
+                <w:rFonts w:ascii="Avva_Shenouda" w:hAnsi="Avva_Shenouda" w:eastAsia="Avva_Shenouda" w:cs="Avva_Shenouda"/>
+                <w:sz w:val="10"/>
+              </w:rPr>
+              <w:t>`nte4xa</w:t>
+            </w:r>
+            <w:r>
+              <w:rPr>
+                <w:sz w:val="10"/>
+              </w:rPr>
+              <w:t xml:space="preserve"> </w:t>
+            </w:r>
+            <w:r>
+              <w:rPr>
+                <w:rFonts w:ascii="Avva_Shenouda" w:hAnsi="Avva_Shenouda" w:eastAsia="Avva_Shenouda" w:cs="Avva_Shenouda"/>
+                <w:sz w:val="10"/>
+              </w:rPr>
+              <w:t>nennobi</w:t>
+            </w:r>
+            <w:r>
+              <w:rPr>
+                <w:sz w:val="10"/>
+              </w:rPr>
+              <w:t xml:space="preserve"> </w:t>
+            </w:r>
+            <w:r>
+              <w:rPr>
+                <w:rFonts w:ascii="Avva_Shenouda" w:hAnsi="Avva_Shenouda" w:eastAsia="Avva_Shenouda" w:cs="Avva_Shenouda"/>
+                <w:sz w:val="10"/>
+              </w:rPr>
+              <w:t>nan</w:t>
+            </w:r>
+            <w:r>
+              <w:rPr>
+                <w:sz w:val="10"/>
+              </w:rPr>
+              <w:t xml:space="preserve"> </w:t>
+            </w:r>
+            <w:r>
+              <w:rPr>
+                <w:rFonts w:ascii="Avva_Shenouda" w:hAnsi="Avva_Shenouda" w:eastAsia="Avva_Shenouda" w:cs="Avva_Shenouda"/>
+                <w:sz w:val="10"/>
+              </w:rPr>
+              <w:t>`ebol</w:t>
+            </w:r>
+            <w:r>
+              <w:rPr>
+                <w:sz w:val="10"/>
+              </w:rPr>
+              <w:t>.</w:t>
             </w:r>
           </w:p>
         </w:tc>
@@ -426,7 +1620,390 @@
                 <w:rFonts w:ascii="Avva_Shenouda" w:hAnsi="Avva_Shenouda" w:eastAsia="Avva_Shenouda" w:cs="Avva_Shenouda"/>
                 <w:sz w:val="10"/>
               </w:rPr>
-              <w:t>Twbh `egen nenio5 nem nen`cn3ov et2wni qen gin2wni niben, ite qen paitopoc `ite qen mai niben, hina `nte P=x=c pennov5 er`hmot nan nemwov `mpiovgai nem pital[o: `nte4xa nennobi nan `ebol.</w:t>
+              <w:t>Twbh</w:t>
+            </w:r>
+            <w:r>
+              <w:rPr>
+                <w:sz w:val="10"/>
+              </w:rPr>
+              <w:t xml:space="preserve"> </w:t>
+            </w:r>
+            <w:r>
+              <w:rPr>
+                <w:rFonts w:ascii="Avva_Shenouda" w:hAnsi="Avva_Shenouda" w:eastAsia="Avva_Shenouda" w:cs="Avva_Shenouda"/>
+                <w:sz w:val="10"/>
+              </w:rPr>
+              <w:t>`egen</w:t>
+            </w:r>
+            <w:r>
+              <w:rPr>
+                <w:sz w:val="10"/>
+              </w:rPr>
+              <w:t xml:space="preserve"> </w:t>
+            </w:r>
+            <w:r>
+              <w:rPr>
+                <w:rFonts w:ascii="Avva_Shenouda" w:hAnsi="Avva_Shenouda" w:eastAsia="Avva_Shenouda" w:cs="Avva_Shenouda"/>
+                <w:sz w:val="10"/>
+              </w:rPr>
+              <w:t>nenio5</w:t>
+            </w:r>
+            <w:r>
+              <w:rPr>
+                <w:sz w:val="10"/>
+              </w:rPr>
+              <w:t xml:space="preserve"> </w:t>
+            </w:r>
+            <w:r>
+              <w:rPr>
+                <w:rFonts w:ascii="Avva_Shenouda" w:hAnsi="Avva_Shenouda" w:eastAsia="Avva_Shenouda" w:cs="Avva_Shenouda"/>
+                <w:sz w:val="10"/>
+              </w:rPr>
+              <w:t>nem</w:t>
+            </w:r>
+            <w:r>
+              <w:rPr>
+                <w:sz w:val="10"/>
+              </w:rPr>
+              <w:t xml:space="preserve"> </w:t>
+            </w:r>
+            <w:r>
+              <w:rPr>
+                <w:rFonts w:ascii="Avva_Shenouda" w:hAnsi="Avva_Shenouda" w:eastAsia="Avva_Shenouda" w:cs="Avva_Shenouda"/>
+                <w:sz w:val="10"/>
+              </w:rPr>
+              <w:t>nen`cn3ov</w:t>
+            </w:r>
+            <w:r>
+              <w:rPr>
+                <w:sz w:val="10"/>
+              </w:rPr>
+              <w:t xml:space="preserve"> </w:t>
+            </w:r>
+            <w:r>
+              <w:rPr>
+                <w:rFonts w:ascii="Avva_Shenouda" w:hAnsi="Avva_Shenouda" w:eastAsia="Avva_Shenouda" w:cs="Avva_Shenouda"/>
+                <w:sz w:val="10"/>
+              </w:rPr>
+              <w:t>et2wni</w:t>
+            </w:r>
+            <w:r>
+              <w:rPr>
+                <w:sz w:val="10"/>
+              </w:rPr>
+              <w:t xml:space="preserve"> </w:t>
+            </w:r>
+            <w:r>
+              <w:rPr>
+                <w:rFonts w:ascii="Avva_Shenouda" w:hAnsi="Avva_Shenouda" w:eastAsia="Avva_Shenouda" w:cs="Avva_Shenouda"/>
+                <w:sz w:val="10"/>
+              </w:rPr>
+              <w:t>qen</w:t>
+            </w:r>
+            <w:r>
+              <w:rPr>
+                <w:sz w:val="10"/>
+              </w:rPr>
+              <w:t xml:space="preserve"> </w:t>
+            </w:r>
+            <w:r>
+              <w:rPr>
+                <w:rFonts w:ascii="Avva_Shenouda" w:hAnsi="Avva_Shenouda" w:eastAsia="Avva_Shenouda" w:cs="Avva_Shenouda"/>
+                <w:sz w:val="10"/>
+              </w:rPr>
+              <w:t>gin2wni</w:t>
+            </w:r>
+            <w:r>
+              <w:rPr>
+                <w:sz w:val="10"/>
+              </w:rPr>
+              <w:t xml:space="preserve"> </w:t>
+            </w:r>
+            <w:r>
+              <w:rPr>
+                <w:rFonts w:ascii="Avva_Shenouda" w:hAnsi="Avva_Shenouda" w:eastAsia="Avva_Shenouda" w:cs="Avva_Shenouda"/>
+                <w:sz w:val="10"/>
+              </w:rPr>
+              <w:t>niben</w:t>
+            </w:r>
+            <w:r>
+              <w:rPr>
+                <w:sz w:val="10"/>
+              </w:rPr>
+              <w:t xml:space="preserve">, </w:t>
+            </w:r>
+            <w:r>
+              <w:rPr>
+                <w:rFonts w:ascii="Avva_Shenouda" w:hAnsi="Avva_Shenouda" w:eastAsia="Avva_Shenouda" w:cs="Avva_Shenouda"/>
+                <w:sz w:val="10"/>
+              </w:rPr>
+              <w:t>ite</w:t>
+            </w:r>
+            <w:r>
+              <w:rPr>
+                <w:sz w:val="10"/>
+              </w:rPr>
+              <w:t xml:space="preserve"> </w:t>
+            </w:r>
+            <w:r>
+              <w:rPr>
+                <w:rFonts w:ascii="Avva_Shenouda" w:hAnsi="Avva_Shenouda" w:eastAsia="Avva_Shenouda" w:cs="Avva_Shenouda"/>
+                <w:sz w:val="10"/>
+              </w:rPr>
+              <w:t>qen</w:t>
+            </w:r>
+            <w:r>
+              <w:rPr>
+                <w:sz w:val="10"/>
+              </w:rPr>
+              <w:t xml:space="preserve"> </w:t>
+            </w:r>
+            <w:r>
+              <w:rPr>
+                <w:rFonts w:ascii="Avva_Shenouda" w:hAnsi="Avva_Shenouda" w:eastAsia="Avva_Shenouda" w:cs="Avva_Shenouda"/>
+                <w:sz w:val="10"/>
+              </w:rPr>
+              <w:t>paitopoc</w:t>
+            </w:r>
+            <w:r>
+              <w:rPr>
+                <w:sz w:val="10"/>
+              </w:rPr>
+              <w:t xml:space="preserve"> </w:t>
+            </w:r>
+            <w:r>
+              <w:rPr>
+                <w:rFonts w:ascii="Avva_Shenouda" w:hAnsi="Avva_Shenouda" w:eastAsia="Avva_Shenouda" w:cs="Avva_Shenouda"/>
+                <w:sz w:val="10"/>
+              </w:rPr>
+              <w:t>`ite</w:t>
+            </w:r>
+            <w:r>
+              <w:rPr>
+                <w:sz w:val="10"/>
+              </w:rPr>
+              <w:t xml:space="preserve"> </w:t>
+            </w:r>
+            <w:r>
+              <w:rPr>
+                <w:rFonts w:ascii="Avva_Shenouda" w:hAnsi="Avva_Shenouda" w:eastAsia="Avva_Shenouda" w:cs="Avva_Shenouda"/>
+                <w:sz w:val="10"/>
+              </w:rPr>
+              <w:t>qen</w:t>
+            </w:r>
+            <w:r>
+              <w:rPr>
+                <w:sz w:val="10"/>
+              </w:rPr>
+              <w:t xml:space="preserve"> </w:t>
+            </w:r>
+            <w:r>
+              <w:rPr>
+                <w:rFonts w:ascii="Avva_Shenouda" w:hAnsi="Avva_Shenouda" w:eastAsia="Avva_Shenouda" w:cs="Avva_Shenouda"/>
+                <w:sz w:val="10"/>
+              </w:rPr>
+              <w:t>mai</w:t>
+            </w:r>
+            <w:r>
+              <w:rPr>
+                <w:sz w:val="10"/>
+              </w:rPr>
+              <w:t xml:space="preserve"> </w:t>
+            </w:r>
+            <w:r>
+              <w:rPr>
+                <w:rFonts w:ascii="Avva_Shenouda" w:hAnsi="Avva_Shenouda" w:eastAsia="Avva_Shenouda" w:cs="Avva_Shenouda"/>
+                <w:sz w:val="10"/>
+              </w:rPr>
+              <w:t>niben</w:t>
+            </w:r>
+            <w:r>
+              <w:rPr>
+                <w:sz w:val="10"/>
+              </w:rPr>
+              <w:t xml:space="preserve">, </w:t>
+            </w:r>
+            <w:r>
+              <w:rPr>
+                <w:rFonts w:ascii="Avva_Shenouda" w:hAnsi="Avva_Shenouda" w:eastAsia="Avva_Shenouda" w:cs="Avva_Shenouda"/>
+                <w:sz w:val="10"/>
+              </w:rPr>
+              <w:t>hina</w:t>
+            </w:r>
+            <w:r>
+              <w:rPr>
+                <w:sz w:val="10"/>
+              </w:rPr>
+              <w:t xml:space="preserve"> </w:t>
+            </w:r>
+            <w:r>
+              <w:rPr>
+                <w:rFonts w:ascii="Avva_Shenouda" w:hAnsi="Avva_Shenouda" w:eastAsia="Avva_Shenouda" w:cs="Avva_Shenouda"/>
+                <w:sz w:val="10"/>
+              </w:rPr>
+              <w:t>`nte</w:t>
+            </w:r>
+            <w:r>
+              <w:rPr>
+                <w:sz w:val="10"/>
+              </w:rPr>
+              <w:t xml:space="preserve"> </w:t>
+            </w:r>
+            <w:r>
+              <w:rPr>
+                <w:rFonts w:ascii="Avva_Shenouda" w:hAnsi="Avva_Shenouda" w:eastAsia="Avva_Shenouda" w:cs="Avva_Shenouda"/>
+                <w:sz w:val="10"/>
+              </w:rPr>
+              <w:t>P=x=c</w:t>
+            </w:r>
+            <w:r>
+              <w:rPr>
+                <w:sz w:val="10"/>
+              </w:rPr>
+              <w:t xml:space="preserve"> </w:t>
+            </w:r>
+            <w:r>
+              <w:rPr>
+                <w:rFonts w:ascii="Avva_Shenouda" w:hAnsi="Avva_Shenouda" w:eastAsia="Avva_Shenouda" w:cs="Avva_Shenouda"/>
+                <w:sz w:val="10"/>
+              </w:rPr>
+              <w:t>pennov5</w:t>
+            </w:r>
+            <w:r>
+              <w:rPr>
+                <w:sz w:val="10"/>
+              </w:rPr>
+              <w:t xml:space="preserve"> </w:t>
+            </w:r>
+            <w:r>
+              <w:rPr>
+                <w:rFonts w:ascii="Avva_Shenouda" w:hAnsi="Avva_Shenouda" w:eastAsia="Avva_Shenouda" w:cs="Avva_Shenouda"/>
+                <w:sz w:val="10"/>
+              </w:rPr>
+              <w:t>er`hmot</w:t>
+            </w:r>
+            <w:r>
+              <w:rPr>
+                <w:sz w:val="10"/>
+              </w:rPr>
+              <w:t xml:space="preserve"> </w:t>
+            </w:r>
+            <w:r>
+              <w:rPr>
+                <w:rFonts w:ascii="Avva_Shenouda" w:hAnsi="Avva_Shenouda" w:eastAsia="Avva_Shenouda" w:cs="Avva_Shenouda"/>
+                <w:sz w:val="10"/>
+              </w:rPr>
+              <w:t>nan</w:t>
+            </w:r>
+            <w:r>
+              <w:rPr>
+                <w:sz w:val="10"/>
+              </w:rPr>
+              <w:t xml:space="preserve"> </w:t>
+            </w:r>
+            <w:r>
+              <w:rPr>
+                <w:rFonts w:ascii="Avva_Shenouda" w:hAnsi="Avva_Shenouda" w:eastAsia="Avva_Shenouda" w:cs="Avva_Shenouda"/>
+                <w:sz w:val="10"/>
+              </w:rPr>
+              <w:t>nemwov</w:t>
+            </w:r>
+            <w:r>
+              <w:rPr>
+                <w:sz w:val="10"/>
+              </w:rPr>
+              <w:t xml:space="preserve"> </w:t>
+            </w:r>
+            <w:r>
+              <w:rPr>
+                <w:rFonts w:ascii="Avva_Shenouda" w:hAnsi="Avva_Shenouda" w:eastAsia="Avva_Shenouda" w:cs="Avva_Shenouda"/>
+                <w:sz w:val="10"/>
+              </w:rPr>
+              <w:t>`mpiovgai</w:t>
+            </w:r>
+            <w:r>
+              <w:rPr>
+                <w:sz w:val="10"/>
+              </w:rPr>
+              <w:t xml:space="preserve"> </w:t>
+            </w:r>
+            <w:r>
+              <w:rPr>
+                <w:rFonts w:ascii="Avva_Shenouda" w:hAnsi="Avva_Shenouda" w:eastAsia="Avva_Shenouda" w:cs="Avva_Shenouda"/>
+                <w:sz w:val="10"/>
+              </w:rPr>
+              <w:t>nem</w:t>
+            </w:r>
+            <w:r>
+              <w:rPr>
+                <w:sz w:val="10"/>
+              </w:rPr>
+              <w:t xml:space="preserve"> </w:t>
+            </w:r>
+            <w:r>
+              <w:rPr>
+                <w:rFonts w:ascii="Avva_Shenouda" w:hAnsi="Avva_Shenouda" w:eastAsia="Avva_Shenouda" w:cs="Avva_Shenouda"/>
+                <w:sz w:val="10"/>
+              </w:rPr>
+              <w:t>pitalso</w:t>
+            </w:r>
+            <w:r>
+              <w:rPr>
+                <w:sz w:val="10"/>
+              </w:rPr>
+              <w:t xml:space="preserve">: </w:t>
+            </w:r>
+            <w:r>
+              <w:rPr>
+                <w:rFonts w:ascii="Avva_Shenouda" w:hAnsi="Avva_Shenouda" w:eastAsia="Avva_Shenouda" w:cs="Avva_Shenouda"/>
+                <w:sz w:val="10"/>
+              </w:rPr>
+              <w:t>`nte4xa</w:t>
+            </w:r>
+            <w:r>
+              <w:rPr>
+                <w:sz w:val="10"/>
+              </w:rPr>
+              <w:t xml:space="preserve"> </w:t>
+            </w:r>
+            <w:r>
+              <w:rPr>
+                <w:rFonts w:ascii="Avva_Shenouda" w:hAnsi="Avva_Shenouda" w:eastAsia="Avva_Shenouda" w:cs="Avva_Shenouda"/>
+                <w:sz w:val="10"/>
+              </w:rPr>
+              <w:t>nennobi</w:t>
+            </w:r>
+            <w:r>
+              <w:rPr>
+                <w:sz w:val="10"/>
+              </w:rPr>
+              <w:t xml:space="preserve"> </w:t>
+            </w:r>
+            <w:r>
+              <w:rPr>
+                <w:rFonts w:ascii="Avva_Shenouda" w:hAnsi="Avva_Shenouda" w:eastAsia="Avva_Shenouda" w:cs="Avva_Shenouda"/>
+                <w:sz w:val="10"/>
+              </w:rPr>
+              <w:t>nan</w:t>
+            </w:r>
+            <w:r>
+              <w:rPr>
+                <w:sz w:val="10"/>
+              </w:rPr>
+              <w:t xml:space="preserve"> </w:t>
+            </w:r>
+            <w:r>
+              <w:rPr>
+                <w:rFonts w:ascii="Avva_Shenouda" w:hAnsi="Avva_Shenouda" w:eastAsia="Avva_Shenouda" w:cs="Avva_Shenouda"/>
+                <w:sz w:val="10"/>
+              </w:rPr>
+              <w:t>`ebol</w:t>
+            </w:r>
+            <w:r>
+              <w:rPr>
+                <w:sz w:val="10"/>
+              </w:rPr>
+              <w:t>.</w:t>
             </w:r>
           </w:p>
         </w:tc>
@@ -497,7 +2074,624 @@
                 <w:rFonts w:ascii="Avva_Shenouda" w:hAnsi="Avva_Shenouda" w:eastAsia="Avva_Shenouda" w:cs="Avva_Shenouda"/>
                 <w:sz w:val="10"/>
               </w:rPr>
-              <w:t>Twbh `egen nenio5 nem nen`cn3ov `etav2e `e`p2emmo: ie n3e0mev`i `e2e qen mai niben: covtwn novmwit t3rov: `ite `ebol hiten `fiom ie niiarwov ie nilvmn3 ie nimwit `mmo2i: (ie pia3r) ie ev`iri `mpovginmo2i `nr35 niben: hina `nte P=x=c pennov5 tac0wov `en3`ete novov `mma`n2wni qen ovhir3n3: `nte4xa nennobi nan `ebol.</w:t>
+              <w:t>Twbh</w:t>
+            </w:r>
+            <w:r>
+              <w:rPr>
+                <w:sz w:val="10"/>
+              </w:rPr>
+              <w:t xml:space="preserve"> </w:t>
+            </w:r>
+            <w:r>
+              <w:rPr>
+                <w:rFonts w:ascii="Avva_Shenouda" w:hAnsi="Avva_Shenouda" w:eastAsia="Avva_Shenouda" w:cs="Avva_Shenouda"/>
+                <w:sz w:val="10"/>
+              </w:rPr>
+              <w:t>`egen</w:t>
+            </w:r>
+            <w:r>
+              <w:rPr>
+                <w:sz w:val="10"/>
+              </w:rPr>
+              <w:t xml:space="preserve"> </w:t>
+            </w:r>
+            <w:r>
+              <w:rPr>
+                <w:rFonts w:ascii="Avva_Shenouda" w:hAnsi="Avva_Shenouda" w:eastAsia="Avva_Shenouda" w:cs="Avva_Shenouda"/>
+                <w:sz w:val="10"/>
+              </w:rPr>
+              <w:t>nenio5</w:t>
+            </w:r>
+            <w:r>
+              <w:rPr>
+                <w:sz w:val="10"/>
+              </w:rPr>
+              <w:t xml:space="preserve"> </w:t>
+            </w:r>
+            <w:r>
+              <w:rPr>
+                <w:rFonts w:ascii="Avva_Shenouda" w:hAnsi="Avva_Shenouda" w:eastAsia="Avva_Shenouda" w:cs="Avva_Shenouda"/>
+                <w:sz w:val="10"/>
+              </w:rPr>
+              <w:t>nem</w:t>
+            </w:r>
+            <w:r>
+              <w:rPr>
+                <w:sz w:val="10"/>
+              </w:rPr>
+              <w:t xml:space="preserve"> </w:t>
+            </w:r>
+            <w:r>
+              <w:rPr>
+                <w:rFonts w:ascii="Avva_Shenouda" w:hAnsi="Avva_Shenouda" w:eastAsia="Avva_Shenouda" w:cs="Avva_Shenouda"/>
+                <w:sz w:val="10"/>
+              </w:rPr>
+              <w:t>nen`cn3ov</w:t>
+            </w:r>
+            <w:r>
+              <w:rPr>
+                <w:sz w:val="10"/>
+              </w:rPr>
+              <w:t xml:space="preserve"> </w:t>
+            </w:r>
+            <w:r>
+              <w:rPr>
+                <w:rFonts w:ascii="Avva_Shenouda" w:hAnsi="Avva_Shenouda" w:eastAsia="Avva_Shenouda" w:cs="Avva_Shenouda"/>
+                <w:sz w:val="10"/>
+              </w:rPr>
+              <w:t>`etav2e</w:t>
+            </w:r>
+            <w:r>
+              <w:rPr>
+                <w:sz w:val="10"/>
+              </w:rPr>
+              <w:t xml:space="preserve"> </w:t>
+            </w:r>
+            <w:r>
+              <w:rPr>
+                <w:rFonts w:ascii="Avva_Shenouda" w:hAnsi="Avva_Shenouda" w:eastAsia="Avva_Shenouda" w:cs="Avva_Shenouda"/>
+                <w:sz w:val="10"/>
+              </w:rPr>
+              <w:t>`e`p2emmo</w:t>
+            </w:r>
+            <w:r>
+              <w:rPr>
+                <w:sz w:val="10"/>
+              </w:rPr>
+              <w:t xml:space="preserve">: </w:t>
+            </w:r>
+            <w:r>
+              <w:rPr>
+                <w:rFonts w:ascii="Avva_Shenouda" w:hAnsi="Avva_Shenouda" w:eastAsia="Avva_Shenouda" w:cs="Avva_Shenouda"/>
+                <w:sz w:val="10"/>
+              </w:rPr>
+              <w:t>ie</w:t>
+            </w:r>
+            <w:r>
+              <w:rPr>
+                <w:sz w:val="10"/>
+              </w:rPr>
+              <w:t xml:space="preserve"> </w:t>
+            </w:r>
+            <w:r>
+              <w:rPr>
+                <w:rFonts w:ascii="Avva_Shenouda" w:hAnsi="Avva_Shenouda" w:eastAsia="Avva_Shenouda" w:cs="Avva_Shenouda"/>
+                <w:sz w:val="10"/>
+              </w:rPr>
+              <w:t>n3e0mev`i</w:t>
+            </w:r>
+            <w:r>
+              <w:rPr>
+                <w:sz w:val="10"/>
+              </w:rPr>
+              <w:t xml:space="preserve"> </w:t>
+            </w:r>
+            <w:r>
+              <w:rPr>
+                <w:rFonts w:ascii="Avva_Shenouda" w:hAnsi="Avva_Shenouda" w:eastAsia="Avva_Shenouda" w:cs="Avva_Shenouda"/>
+                <w:sz w:val="10"/>
+              </w:rPr>
+              <w:t>`e2e</w:t>
+            </w:r>
+            <w:r>
+              <w:rPr>
+                <w:sz w:val="10"/>
+              </w:rPr>
+              <w:t xml:space="preserve"> </w:t>
+            </w:r>
+            <w:r>
+              <w:rPr>
+                <w:rFonts w:ascii="Avva_Shenouda" w:hAnsi="Avva_Shenouda" w:eastAsia="Avva_Shenouda" w:cs="Avva_Shenouda"/>
+                <w:sz w:val="10"/>
+              </w:rPr>
+              <w:t>qen</w:t>
+            </w:r>
+            <w:r>
+              <w:rPr>
+                <w:sz w:val="10"/>
+              </w:rPr>
+              <w:t xml:space="preserve"> </w:t>
+            </w:r>
+            <w:r>
+              <w:rPr>
+                <w:rFonts w:ascii="Avva_Shenouda" w:hAnsi="Avva_Shenouda" w:eastAsia="Avva_Shenouda" w:cs="Avva_Shenouda"/>
+                <w:sz w:val="10"/>
+              </w:rPr>
+              <w:t>mai</w:t>
+            </w:r>
+            <w:r>
+              <w:rPr>
+                <w:sz w:val="10"/>
+              </w:rPr>
+              <w:t xml:space="preserve"> </w:t>
+            </w:r>
+            <w:r>
+              <w:rPr>
+                <w:rFonts w:ascii="Avva_Shenouda" w:hAnsi="Avva_Shenouda" w:eastAsia="Avva_Shenouda" w:cs="Avva_Shenouda"/>
+                <w:sz w:val="10"/>
+              </w:rPr>
+              <w:t>niben</w:t>
+            </w:r>
+            <w:r>
+              <w:rPr>
+                <w:sz w:val="10"/>
+              </w:rPr>
+              <w:t xml:space="preserve">: </w:t>
+            </w:r>
+            <w:r>
+              <w:rPr>
+                <w:rFonts w:ascii="Avva_Shenouda" w:hAnsi="Avva_Shenouda" w:eastAsia="Avva_Shenouda" w:cs="Avva_Shenouda"/>
+                <w:sz w:val="10"/>
+              </w:rPr>
+              <w:t>covtwn</w:t>
+            </w:r>
+            <w:r>
+              <w:rPr>
+                <w:sz w:val="10"/>
+              </w:rPr>
+              <w:t xml:space="preserve"> </w:t>
+            </w:r>
+            <w:r>
+              <w:rPr>
+                <w:rFonts w:ascii="Avva_Shenouda" w:hAnsi="Avva_Shenouda" w:eastAsia="Avva_Shenouda" w:cs="Avva_Shenouda"/>
+                <w:sz w:val="10"/>
+              </w:rPr>
+              <w:t>novmwit</w:t>
+            </w:r>
+            <w:r>
+              <w:rPr>
+                <w:sz w:val="10"/>
+              </w:rPr>
+              <w:t xml:space="preserve"> </w:t>
+            </w:r>
+            <w:r>
+              <w:rPr>
+                <w:rFonts w:ascii="Avva_Shenouda" w:hAnsi="Avva_Shenouda" w:eastAsia="Avva_Shenouda" w:cs="Avva_Shenouda"/>
+                <w:sz w:val="10"/>
+              </w:rPr>
+              <w:t>t3rov</w:t>
+            </w:r>
+            <w:r>
+              <w:rPr>
+                <w:sz w:val="10"/>
+              </w:rPr>
+              <w:t xml:space="preserve">: </w:t>
+            </w:r>
+            <w:r>
+              <w:rPr>
+                <w:rFonts w:ascii="Avva_Shenouda" w:hAnsi="Avva_Shenouda" w:eastAsia="Avva_Shenouda" w:cs="Avva_Shenouda"/>
+                <w:sz w:val="10"/>
+              </w:rPr>
+              <w:t>`ite</w:t>
+            </w:r>
+            <w:r>
+              <w:rPr>
+                <w:sz w:val="10"/>
+              </w:rPr>
+              <w:t xml:space="preserve"> </w:t>
+            </w:r>
+            <w:r>
+              <w:rPr>
+                <w:rFonts w:ascii="Avva_Shenouda" w:hAnsi="Avva_Shenouda" w:eastAsia="Avva_Shenouda" w:cs="Avva_Shenouda"/>
+                <w:sz w:val="10"/>
+              </w:rPr>
+              <w:t>`ebol</w:t>
+            </w:r>
+            <w:r>
+              <w:rPr>
+                <w:sz w:val="10"/>
+              </w:rPr>
+              <w:t xml:space="preserve"> </w:t>
+            </w:r>
+            <w:r>
+              <w:rPr>
+                <w:rFonts w:ascii="Avva_Shenouda" w:hAnsi="Avva_Shenouda" w:eastAsia="Avva_Shenouda" w:cs="Avva_Shenouda"/>
+                <w:sz w:val="10"/>
+              </w:rPr>
+              <w:t>hiten</w:t>
+            </w:r>
+            <w:r>
+              <w:rPr>
+                <w:sz w:val="10"/>
+              </w:rPr>
+              <w:t xml:space="preserve"> </w:t>
+            </w:r>
+            <w:r>
+              <w:rPr>
+                <w:rFonts w:ascii="Avva_Shenouda" w:hAnsi="Avva_Shenouda" w:eastAsia="Avva_Shenouda" w:cs="Avva_Shenouda"/>
+                <w:sz w:val="10"/>
+              </w:rPr>
+              <w:t>`fiom</w:t>
+            </w:r>
+            <w:r>
+              <w:rPr>
+                <w:sz w:val="10"/>
+              </w:rPr>
+              <w:t xml:space="preserve"> </w:t>
+            </w:r>
+            <w:r>
+              <w:rPr>
+                <w:rFonts w:ascii="Avva_Shenouda" w:hAnsi="Avva_Shenouda" w:eastAsia="Avva_Shenouda" w:cs="Avva_Shenouda"/>
+                <w:sz w:val="10"/>
+              </w:rPr>
+              <w:t>ie</w:t>
+            </w:r>
+            <w:r>
+              <w:rPr>
+                <w:sz w:val="10"/>
+              </w:rPr>
+              <w:t xml:space="preserve"> </w:t>
+            </w:r>
+            <w:r>
+              <w:rPr>
+                <w:rFonts w:ascii="Avva_Shenouda" w:hAnsi="Avva_Shenouda" w:eastAsia="Avva_Shenouda" w:cs="Avva_Shenouda"/>
+                <w:sz w:val="10"/>
+              </w:rPr>
+              <w:t>niiarwov</w:t>
+            </w:r>
+            <w:r>
+              <w:rPr>
+                <w:sz w:val="10"/>
+              </w:rPr>
+              <w:t xml:space="preserve"> </w:t>
+            </w:r>
+            <w:r>
+              <w:rPr>
+                <w:rFonts w:ascii="Avva_Shenouda" w:hAnsi="Avva_Shenouda" w:eastAsia="Avva_Shenouda" w:cs="Avva_Shenouda"/>
+                <w:sz w:val="10"/>
+              </w:rPr>
+              <w:t>ie</w:t>
+            </w:r>
+            <w:r>
+              <w:rPr>
+                <w:sz w:val="10"/>
+              </w:rPr>
+              <w:t xml:space="preserve"> </w:t>
+            </w:r>
+            <w:r>
+              <w:rPr>
+                <w:rFonts w:ascii="Avva_Shenouda" w:hAnsi="Avva_Shenouda" w:eastAsia="Avva_Shenouda" w:cs="Avva_Shenouda"/>
+                <w:sz w:val="10"/>
+              </w:rPr>
+              <w:t>nilvmn3</w:t>
+            </w:r>
+            <w:r>
+              <w:rPr>
+                <w:sz w:val="10"/>
+              </w:rPr>
+              <w:t xml:space="preserve"> </w:t>
+            </w:r>
+            <w:r>
+              <w:rPr>
+                <w:rFonts w:ascii="Avva_Shenouda" w:hAnsi="Avva_Shenouda" w:eastAsia="Avva_Shenouda" w:cs="Avva_Shenouda"/>
+                <w:sz w:val="10"/>
+              </w:rPr>
+              <w:t>ie</w:t>
+            </w:r>
+            <w:r>
+              <w:rPr>
+                <w:sz w:val="10"/>
+              </w:rPr>
+              <w:t xml:space="preserve"> </w:t>
+            </w:r>
+            <w:r>
+              <w:rPr>
+                <w:rFonts w:ascii="Avva_Shenouda" w:hAnsi="Avva_Shenouda" w:eastAsia="Avva_Shenouda" w:cs="Avva_Shenouda"/>
+                <w:sz w:val="10"/>
+              </w:rPr>
+              <w:t>nimwit</w:t>
+            </w:r>
+            <w:r>
+              <w:rPr>
+                <w:sz w:val="10"/>
+              </w:rPr>
+              <w:t xml:space="preserve"> </w:t>
+            </w:r>
+            <w:r>
+              <w:rPr>
+                <w:rFonts w:ascii="Avva_Shenouda" w:hAnsi="Avva_Shenouda" w:eastAsia="Avva_Shenouda" w:cs="Avva_Shenouda"/>
+                <w:sz w:val="10"/>
+              </w:rPr>
+              <w:t>`mmo2i</w:t>
+            </w:r>
+            <w:r>
+              <w:rPr>
+                <w:sz w:val="10"/>
+              </w:rPr>
+              <w:t>: (</w:t>
+            </w:r>
+            <w:r>
+              <w:rPr>
+                <w:rFonts w:ascii="Avva_Shenouda" w:hAnsi="Avva_Shenouda" w:eastAsia="Avva_Shenouda" w:cs="Avva_Shenouda"/>
+                <w:sz w:val="10"/>
+              </w:rPr>
+              <w:t>ie</w:t>
+            </w:r>
+            <w:r>
+              <w:rPr>
+                <w:sz w:val="10"/>
+              </w:rPr>
+              <w:t xml:space="preserve"> </w:t>
+            </w:r>
+            <w:r>
+              <w:rPr>
+                <w:rFonts w:ascii="Avva_Shenouda" w:hAnsi="Avva_Shenouda" w:eastAsia="Avva_Shenouda" w:cs="Avva_Shenouda"/>
+                <w:sz w:val="10"/>
+              </w:rPr>
+              <w:t>pia3r</w:t>
+            </w:r>
+            <w:r>
+              <w:rPr>
+                <w:sz w:val="10"/>
+              </w:rPr>
+              <w:t xml:space="preserve">) </w:t>
+            </w:r>
+            <w:r>
+              <w:rPr>
+                <w:rFonts w:ascii="Avva_Shenouda" w:hAnsi="Avva_Shenouda" w:eastAsia="Avva_Shenouda" w:cs="Avva_Shenouda"/>
+                <w:sz w:val="10"/>
+              </w:rPr>
+              <w:t>ie</w:t>
+            </w:r>
+            <w:r>
+              <w:rPr>
+                <w:sz w:val="10"/>
+              </w:rPr>
+              <w:t xml:space="preserve"> </w:t>
+            </w:r>
+            <w:r>
+              <w:rPr>
+                <w:rFonts w:ascii="Avva_Shenouda" w:hAnsi="Avva_Shenouda" w:eastAsia="Avva_Shenouda" w:cs="Avva_Shenouda"/>
+                <w:sz w:val="10"/>
+              </w:rPr>
+              <w:t>ev`iri</w:t>
+            </w:r>
+            <w:r>
+              <w:rPr>
+                <w:sz w:val="10"/>
+              </w:rPr>
+              <w:t xml:space="preserve"> </w:t>
+            </w:r>
+            <w:r>
+              <w:rPr>
+                <w:rFonts w:ascii="Avva_Shenouda" w:hAnsi="Avva_Shenouda" w:eastAsia="Avva_Shenouda" w:cs="Avva_Shenouda"/>
+                <w:sz w:val="10"/>
+              </w:rPr>
+              <w:t>`mpovginmo2i</w:t>
+            </w:r>
+            <w:r>
+              <w:rPr>
+                <w:sz w:val="10"/>
+              </w:rPr>
+              <w:t xml:space="preserve"> </w:t>
+            </w:r>
+            <w:r>
+              <w:rPr>
+                <w:rFonts w:ascii="Avva_Shenouda" w:hAnsi="Avva_Shenouda" w:eastAsia="Avva_Shenouda" w:cs="Avva_Shenouda"/>
+                <w:sz w:val="10"/>
+              </w:rPr>
+              <w:t>`nr35</w:t>
+            </w:r>
+            <w:r>
+              <w:rPr>
+                <w:sz w:val="10"/>
+              </w:rPr>
+              <w:t xml:space="preserve"> </w:t>
+            </w:r>
+            <w:r>
+              <w:rPr>
+                <w:rFonts w:ascii="Avva_Shenouda" w:hAnsi="Avva_Shenouda" w:eastAsia="Avva_Shenouda" w:cs="Avva_Shenouda"/>
+                <w:sz w:val="10"/>
+              </w:rPr>
+              <w:t>niben</w:t>
+            </w:r>
+            <w:r>
+              <w:rPr>
+                <w:sz w:val="10"/>
+              </w:rPr>
+              <w:t xml:space="preserve">: </w:t>
+            </w:r>
+            <w:r>
+              <w:rPr>
+                <w:rFonts w:ascii="Avva_Shenouda" w:hAnsi="Avva_Shenouda" w:eastAsia="Avva_Shenouda" w:cs="Avva_Shenouda"/>
+                <w:sz w:val="10"/>
+              </w:rPr>
+              <w:t>hina</w:t>
+            </w:r>
+            <w:r>
+              <w:rPr>
+                <w:sz w:val="10"/>
+              </w:rPr>
+              <w:t xml:space="preserve"> </w:t>
+            </w:r>
+            <w:r>
+              <w:rPr>
+                <w:rFonts w:ascii="Avva_Shenouda" w:hAnsi="Avva_Shenouda" w:eastAsia="Avva_Shenouda" w:cs="Avva_Shenouda"/>
+                <w:sz w:val="10"/>
+              </w:rPr>
+              <w:t>`nte</w:t>
+            </w:r>
+            <w:r>
+              <w:rPr>
+                <w:sz w:val="10"/>
+              </w:rPr>
+              <w:t xml:space="preserve"> </w:t>
+            </w:r>
+            <w:r>
+              <w:rPr>
+                <w:rFonts w:ascii="Avva_Shenouda" w:hAnsi="Avva_Shenouda" w:eastAsia="Avva_Shenouda" w:cs="Avva_Shenouda"/>
+                <w:sz w:val="10"/>
+              </w:rPr>
+              <w:t>P=x=c</w:t>
+            </w:r>
+            <w:r>
+              <w:rPr>
+                <w:sz w:val="10"/>
+              </w:rPr>
+              <w:t xml:space="preserve"> </w:t>
+            </w:r>
+            <w:r>
+              <w:rPr>
+                <w:rFonts w:ascii="Avva_Shenouda" w:hAnsi="Avva_Shenouda" w:eastAsia="Avva_Shenouda" w:cs="Avva_Shenouda"/>
+                <w:sz w:val="10"/>
+              </w:rPr>
+              <w:t>pennov5</w:t>
+            </w:r>
+            <w:r>
+              <w:rPr>
+                <w:sz w:val="10"/>
+              </w:rPr>
+              <w:t xml:space="preserve"> </w:t>
+            </w:r>
+            <w:r>
+              <w:rPr>
+                <w:rFonts w:ascii="Avva_Shenouda" w:hAnsi="Avva_Shenouda" w:eastAsia="Avva_Shenouda" w:cs="Avva_Shenouda"/>
+                <w:sz w:val="10"/>
+              </w:rPr>
+              <w:t>tac0wov</w:t>
+            </w:r>
+            <w:r>
+              <w:rPr>
+                <w:sz w:val="10"/>
+              </w:rPr>
+              <w:t xml:space="preserve"> </w:t>
+            </w:r>
+            <w:r>
+              <w:rPr>
+                <w:rFonts w:ascii="Avva_Shenouda" w:hAnsi="Avva_Shenouda" w:eastAsia="Avva_Shenouda" w:cs="Avva_Shenouda"/>
+                <w:sz w:val="10"/>
+              </w:rPr>
+              <w:t>`en3`ete</w:t>
+            </w:r>
+            <w:r>
+              <w:rPr>
+                <w:sz w:val="10"/>
+              </w:rPr>
+              <w:t xml:space="preserve"> </w:t>
+            </w:r>
+            <w:r>
+              <w:rPr>
+                <w:rFonts w:ascii="Avva_Shenouda" w:hAnsi="Avva_Shenouda" w:eastAsia="Avva_Shenouda" w:cs="Avva_Shenouda"/>
+                <w:sz w:val="10"/>
+              </w:rPr>
+              <w:t>novov</w:t>
+            </w:r>
+            <w:r>
+              <w:rPr>
+                <w:sz w:val="10"/>
+              </w:rPr>
+              <w:t xml:space="preserve"> </w:t>
+            </w:r>
+            <w:r>
+              <w:rPr>
+                <w:rFonts w:ascii="Avva_Shenouda" w:hAnsi="Avva_Shenouda" w:eastAsia="Avva_Shenouda" w:cs="Avva_Shenouda"/>
+                <w:sz w:val="10"/>
+              </w:rPr>
+              <w:t>`mma`n2wpi</w:t>
+            </w:r>
+            <w:r>
+              <w:rPr>
+                <w:sz w:val="10"/>
+              </w:rPr>
+              <w:t xml:space="preserve"> </w:t>
+            </w:r>
+            <w:r>
+              <w:rPr>
+                <w:rFonts w:ascii="Avva_Shenouda" w:hAnsi="Avva_Shenouda" w:eastAsia="Avva_Shenouda" w:cs="Avva_Shenouda"/>
+                <w:sz w:val="10"/>
+              </w:rPr>
+              <w:t>qen</w:t>
+            </w:r>
+            <w:r>
+              <w:rPr>
+                <w:sz w:val="10"/>
+              </w:rPr>
+              <w:t xml:space="preserve"> </w:t>
+            </w:r>
+            <w:r>
+              <w:rPr>
+                <w:rFonts w:ascii="Avva_Shenouda" w:hAnsi="Avva_Shenouda" w:eastAsia="Avva_Shenouda" w:cs="Avva_Shenouda"/>
+                <w:sz w:val="10"/>
+              </w:rPr>
+              <w:t>ovhir3n3</w:t>
+            </w:r>
+            <w:r>
+              <w:rPr>
+                <w:sz w:val="10"/>
+              </w:rPr>
+              <w:t xml:space="preserve">: </w:t>
+            </w:r>
+            <w:r>
+              <w:rPr>
+                <w:rFonts w:ascii="Avva_Shenouda" w:hAnsi="Avva_Shenouda" w:eastAsia="Avva_Shenouda" w:cs="Avva_Shenouda"/>
+                <w:sz w:val="10"/>
+              </w:rPr>
+              <w:t>`nte4xa</w:t>
+            </w:r>
+            <w:r>
+              <w:rPr>
+                <w:sz w:val="10"/>
+              </w:rPr>
+              <w:t xml:space="preserve"> </w:t>
+            </w:r>
+            <w:r>
+              <w:rPr>
+                <w:rFonts w:ascii="Avva_Shenouda" w:hAnsi="Avva_Shenouda" w:eastAsia="Avva_Shenouda" w:cs="Avva_Shenouda"/>
+                <w:sz w:val="10"/>
+              </w:rPr>
+              <w:t>nennobi</w:t>
+            </w:r>
+            <w:r>
+              <w:rPr>
+                <w:sz w:val="10"/>
+              </w:rPr>
+              <w:t xml:space="preserve"> </w:t>
+            </w:r>
+            <w:r>
+              <w:rPr>
+                <w:rFonts w:ascii="Avva_Shenouda" w:hAnsi="Avva_Shenouda" w:eastAsia="Avva_Shenouda" w:cs="Avva_Shenouda"/>
+                <w:sz w:val="10"/>
+              </w:rPr>
+              <w:t>nan</w:t>
+            </w:r>
+            <w:r>
+              <w:rPr>
+                <w:sz w:val="10"/>
+              </w:rPr>
+              <w:t xml:space="preserve"> </w:t>
+            </w:r>
+            <w:r>
+              <w:rPr>
+                <w:rFonts w:ascii="Avva_Shenouda" w:hAnsi="Avva_Shenouda" w:eastAsia="Avva_Shenouda" w:cs="Avva_Shenouda"/>
+                <w:sz w:val="10"/>
+              </w:rPr>
+              <w:t>`ebol</w:t>
+            </w:r>
+            <w:r>
+              <w:rPr>
+                <w:sz w:val="10"/>
+              </w:rPr>
+              <w:t>.</w:t>
             </w:r>
           </w:p>
         </w:tc>
@@ -568,7 +2762,377 @@
                 <w:rFonts w:ascii="Avva_Shenouda" w:hAnsi="Avva_Shenouda" w:eastAsia="Avva_Shenouda" w:cs="Avva_Shenouda"/>
                 <w:sz w:val="10"/>
               </w:rPr>
-              <w:t>Twbh `egen n3`et4i `m`frwov2 `nni0vcia ni`procfora ni`ap`arx3 nineh ni`c0oinov4i ni`ckepacma nigwm `nw2 nikvmillion `nte pima`ner2wov2i: hina `nte P=x=c Pennov5 52ebiw nwov qen I=l=3=m `nte `tfe: `nte4xa nennobi nan `ebol.</w:t>
+              <w:t>Twbh</w:t>
+            </w:r>
+            <w:r>
+              <w:rPr>
+                <w:sz w:val="10"/>
+              </w:rPr>
+              <w:t xml:space="preserve"> </w:t>
+            </w:r>
+            <w:r>
+              <w:rPr>
+                <w:rFonts w:ascii="Avva_Shenouda" w:hAnsi="Avva_Shenouda" w:eastAsia="Avva_Shenouda" w:cs="Avva_Shenouda"/>
+                <w:sz w:val="10"/>
+              </w:rPr>
+              <w:t>`egen</w:t>
+            </w:r>
+            <w:r>
+              <w:rPr>
+                <w:sz w:val="10"/>
+              </w:rPr>
+              <w:t xml:space="preserve"> </w:t>
+            </w:r>
+            <w:r>
+              <w:rPr>
+                <w:rFonts w:ascii="Avva_Shenouda" w:hAnsi="Avva_Shenouda" w:eastAsia="Avva_Shenouda" w:cs="Avva_Shenouda"/>
+                <w:sz w:val="10"/>
+              </w:rPr>
+              <w:t>n3`et4i</w:t>
+            </w:r>
+            <w:r>
+              <w:rPr>
+                <w:sz w:val="10"/>
+              </w:rPr>
+              <w:t xml:space="preserve"> </w:t>
+            </w:r>
+            <w:r>
+              <w:rPr>
+                <w:rFonts w:ascii="Avva_Shenouda" w:hAnsi="Avva_Shenouda" w:eastAsia="Avva_Shenouda" w:cs="Avva_Shenouda"/>
+                <w:sz w:val="10"/>
+              </w:rPr>
+              <w:t>`m`frwov2</w:t>
+            </w:r>
+            <w:r>
+              <w:rPr>
+                <w:sz w:val="10"/>
+              </w:rPr>
+              <w:t xml:space="preserve"> </w:t>
+            </w:r>
+            <w:r>
+              <w:rPr>
+                <w:rFonts w:ascii="Avva_Shenouda" w:hAnsi="Avva_Shenouda" w:eastAsia="Avva_Shenouda" w:cs="Avva_Shenouda"/>
+                <w:sz w:val="10"/>
+              </w:rPr>
+              <w:t>`nni0vcia</w:t>
+            </w:r>
+            <w:r>
+              <w:rPr>
+                <w:sz w:val="10"/>
+              </w:rPr>
+              <w:t xml:space="preserve"> </w:t>
+            </w:r>
+            <w:r>
+              <w:rPr>
+                <w:rFonts w:ascii="Avva_Shenouda" w:hAnsi="Avva_Shenouda" w:eastAsia="Avva_Shenouda" w:cs="Avva_Shenouda"/>
+                <w:sz w:val="10"/>
+              </w:rPr>
+              <w:t>ni`procfora</w:t>
+            </w:r>
+            <w:r>
+              <w:rPr>
+                <w:sz w:val="10"/>
+              </w:rPr>
+              <w:t xml:space="preserve"> </w:t>
+            </w:r>
+            <w:r>
+              <w:rPr>
+                <w:rFonts w:ascii="Avva_Shenouda" w:hAnsi="Avva_Shenouda" w:eastAsia="Avva_Shenouda" w:cs="Avva_Shenouda"/>
+                <w:sz w:val="10"/>
+              </w:rPr>
+              <w:t>ni`ap`arx3</w:t>
+            </w:r>
+            <w:r>
+              <w:rPr>
+                <w:sz w:val="10"/>
+              </w:rPr>
+              <w:t xml:space="preserve"> </w:t>
+            </w:r>
+            <w:r>
+              <w:rPr>
+                <w:rFonts w:ascii="Avva_Shenouda" w:hAnsi="Avva_Shenouda" w:eastAsia="Avva_Shenouda" w:cs="Avva_Shenouda"/>
+                <w:sz w:val="10"/>
+              </w:rPr>
+              <w:t>nineh</w:t>
+            </w:r>
+            <w:r>
+              <w:rPr>
+                <w:sz w:val="10"/>
+              </w:rPr>
+              <w:t xml:space="preserve"> </w:t>
+            </w:r>
+            <w:r>
+              <w:rPr>
+                <w:rFonts w:ascii="Avva_Shenouda" w:hAnsi="Avva_Shenouda" w:eastAsia="Avva_Shenouda" w:cs="Avva_Shenouda"/>
+                <w:sz w:val="10"/>
+              </w:rPr>
+              <w:t>ni`c0oinov4i</w:t>
+            </w:r>
+            <w:r>
+              <w:rPr>
+                <w:sz w:val="10"/>
+              </w:rPr>
+              <w:t xml:space="preserve"> </w:t>
+            </w:r>
+            <w:r>
+              <w:rPr>
+                <w:rFonts w:ascii="Avva_Shenouda" w:hAnsi="Avva_Shenouda" w:eastAsia="Avva_Shenouda" w:cs="Avva_Shenouda"/>
+                <w:sz w:val="10"/>
+              </w:rPr>
+              <w:t>ni`ckepacma</w:t>
+            </w:r>
+            <w:r>
+              <w:rPr>
+                <w:sz w:val="10"/>
+              </w:rPr>
+              <w:t xml:space="preserve"> </w:t>
+            </w:r>
+            <w:r>
+              <w:rPr>
+                <w:rFonts w:ascii="Avva_Shenouda" w:hAnsi="Avva_Shenouda" w:eastAsia="Avva_Shenouda" w:cs="Avva_Shenouda"/>
+                <w:sz w:val="10"/>
+              </w:rPr>
+              <w:t>nigwm</w:t>
+            </w:r>
+            <w:r>
+              <w:rPr>
+                <w:sz w:val="10"/>
+              </w:rPr>
+              <w:t xml:space="preserve"> </w:t>
+            </w:r>
+            <w:r>
+              <w:rPr>
+                <w:rFonts w:ascii="Avva_Shenouda" w:hAnsi="Avva_Shenouda" w:eastAsia="Avva_Shenouda" w:cs="Avva_Shenouda"/>
+                <w:sz w:val="10"/>
+              </w:rPr>
+              <w:t>`nw2</w:t>
+            </w:r>
+            <w:r>
+              <w:rPr>
+                <w:sz w:val="10"/>
+              </w:rPr>
+              <w:t xml:space="preserve"> </w:t>
+            </w:r>
+            <w:r>
+              <w:rPr>
+                <w:rFonts w:ascii="Avva_Shenouda" w:hAnsi="Avva_Shenouda" w:eastAsia="Avva_Shenouda" w:cs="Avva_Shenouda"/>
+                <w:sz w:val="10"/>
+              </w:rPr>
+              <w:t>nikvmillion</w:t>
+            </w:r>
+            <w:r>
+              <w:rPr>
+                <w:sz w:val="10"/>
+              </w:rPr>
+              <w:t xml:space="preserve"> </w:t>
+            </w:r>
+            <w:r>
+              <w:rPr>
+                <w:rFonts w:ascii="Avva_Shenouda" w:hAnsi="Avva_Shenouda" w:eastAsia="Avva_Shenouda" w:cs="Avva_Shenouda"/>
+                <w:sz w:val="10"/>
+              </w:rPr>
+              <w:t>`nte</w:t>
+            </w:r>
+            <w:r>
+              <w:rPr>
+                <w:sz w:val="10"/>
+              </w:rPr>
+              <w:t xml:space="preserve"> </w:t>
+            </w:r>
+            <w:r>
+              <w:rPr>
+                <w:rFonts w:ascii="Avva_Shenouda" w:hAnsi="Avva_Shenouda" w:eastAsia="Avva_Shenouda" w:cs="Avva_Shenouda"/>
+                <w:sz w:val="10"/>
+              </w:rPr>
+              <w:t>pima`ner2wov2i</w:t>
+            </w:r>
+            <w:r>
+              <w:rPr>
+                <w:sz w:val="10"/>
+              </w:rPr>
+              <w:t xml:space="preserve">: </w:t>
+            </w:r>
+            <w:r>
+              <w:rPr>
+                <w:rFonts w:ascii="Avva_Shenouda" w:hAnsi="Avva_Shenouda" w:eastAsia="Avva_Shenouda" w:cs="Avva_Shenouda"/>
+                <w:sz w:val="10"/>
+              </w:rPr>
+              <w:t>hina</w:t>
+            </w:r>
+            <w:r>
+              <w:rPr>
+                <w:sz w:val="10"/>
+              </w:rPr>
+              <w:t xml:space="preserve"> </w:t>
+            </w:r>
+            <w:r>
+              <w:rPr>
+                <w:rFonts w:ascii="Avva_Shenouda" w:hAnsi="Avva_Shenouda" w:eastAsia="Avva_Shenouda" w:cs="Avva_Shenouda"/>
+                <w:sz w:val="10"/>
+              </w:rPr>
+              <w:t>`nte</w:t>
+            </w:r>
+            <w:r>
+              <w:rPr>
+                <w:sz w:val="10"/>
+              </w:rPr>
+              <w:t xml:space="preserve"> </w:t>
+            </w:r>
+            <w:r>
+              <w:rPr>
+                <w:rFonts w:ascii="Avva_Shenouda" w:hAnsi="Avva_Shenouda" w:eastAsia="Avva_Shenouda" w:cs="Avva_Shenouda"/>
+                <w:sz w:val="10"/>
+              </w:rPr>
+              <w:t>P=x=c</w:t>
+            </w:r>
+            <w:r>
+              <w:rPr>
+                <w:sz w:val="10"/>
+              </w:rPr>
+              <w:t xml:space="preserve"> </w:t>
+            </w:r>
+            <w:r>
+              <w:rPr>
+                <w:rFonts w:ascii="Avva_Shenouda" w:hAnsi="Avva_Shenouda" w:eastAsia="Avva_Shenouda" w:cs="Avva_Shenouda"/>
+                <w:sz w:val="10"/>
+              </w:rPr>
+              <w:t>Pennov5</w:t>
+            </w:r>
+            <w:r>
+              <w:rPr>
+                <w:sz w:val="10"/>
+              </w:rPr>
+              <w:t xml:space="preserve"> </w:t>
+            </w:r>
+            <w:r>
+              <w:rPr>
+                <w:rFonts w:ascii="Avva_Shenouda" w:hAnsi="Avva_Shenouda" w:eastAsia="Avva_Shenouda" w:cs="Avva_Shenouda"/>
+                <w:sz w:val="10"/>
+              </w:rPr>
+              <w:t>52ebiw</w:t>
+            </w:r>
+            <w:r>
+              <w:rPr>
+                <w:sz w:val="10"/>
+              </w:rPr>
+              <w:t xml:space="preserve"> </w:t>
+            </w:r>
+            <w:r>
+              <w:rPr>
+                <w:rFonts w:ascii="Avva_Shenouda" w:hAnsi="Avva_Shenouda" w:eastAsia="Avva_Shenouda" w:cs="Avva_Shenouda"/>
+                <w:sz w:val="10"/>
+              </w:rPr>
+              <w:t>nwov</w:t>
+            </w:r>
+            <w:r>
+              <w:rPr>
+                <w:sz w:val="10"/>
+              </w:rPr>
+              <w:t xml:space="preserve"> </w:t>
+            </w:r>
+            <w:r>
+              <w:rPr>
+                <w:rFonts w:ascii="Avva_Shenouda" w:hAnsi="Avva_Shenouda" w:eastAsia="Avva_Shenouda" w:cs="Avva_Shenouda"/>
+                <w:sz w:val="10"/>
+              </w:rPr>
+              <w:t>qen</w:t>
+            </w:r>
+            <w:r>
+              <w:rPr>
+                <w:sz w:val="10"/>
+              </w:rPr>
+              <w:t xml:space="preserve"> </w:t>
+            </w:r>
+            <w:r>
+              <w:rPr>
+                <w:rFonts w:ascii="Avva_Shenouda" w:hAnsi="Avva_Shenouda" w:eastAsia="Avva_Shenouda" w:cs="Avva_Shenouda"/>
+                <w:sz w:val="10"/>
+              </w:rPr>
+              <w:t>I=l=3=m</w:t>
+            </w:r>
+            <w:r>
+              <w:rPr>
+                <w:sz w:val="10"/>
+              </w:rPr>
+              <w:t xml:space="preserve"> </w:t>
+            </w:r>
+            <w:r>
+              <w:rPr>
+                <w:rFonts w:ascii="Avva_Shenouda" w:hAnsi="Avva_Shenouda" w:eastAsia="Avva_Shenouda" w:cs="Avva_Shenouda"/>
+                <w:sz w:val="10"/>
+              </w:rPr>
+              <w:t>`nte</w:t>
+            </w:r>
+            <w:r>
+              <w:rPr>
+                <w:sz w:val="10"/>
+              </w:rPr>
+              <w:t xml:space="preserve"> </w:t>
+            </w:r>
+            <w:r>
+              <w:rPr>
+                <w:rFonts w:ascii="Avva_Shenouda" w:hAnsi="Avva_Shenouda" w:eastAsia="Avva_Shenouda" w:cs="Avva_Shenouda"/>
+                <w:sz w:val="10"/>
+              </w:rPr>
+              <w:t>`tfe</w:t>
+            </w:r>
+            <w:r>
+              <w:rPr>
+                <w:sz w:val="10"/>
+              </w:rPr>
+              <w:t xml:space="preserve">: </w:t>
+            </w:r>
+            <w:r>
+              <w:rPr>
+                <w:rFonts w:ascii="Avva_Shenouda" w:hAnsi="Avva_Shenouda" w:eastAsia="Avva_Shenouda" w:cs="Avva_Shenouda"/>
+                <w:sz w:val="10"/>
+              </w:rPr>
+              <w:t>`nte4xa</w:t>
+            </w:r>
+            <w:r>
+              <w:rPr>
+                <w:sz w:val="10"/>
+              </w:rPr>
+              <w:t xml:space="preserve"> </w:t>
+            </w:r>
+            <w:r>
+              <w:rPr>
+                <w:rFonts w:ascii="Avva_Shenouda" w:hAnsi="Avva_Shenouda" w:eastAsia="Avva_Shenouda" w:cs="Avva_Shenouda"/>
+                <w:sz w:val="10"/>
+              </w:rPr>
+              <w:t>nennobi</w:t>
+            </w:r>
+            <w:r>
+              <w:rPr>
+                <w:sz w:val="10"/>
+              </w:rPr>
+              <w:t xml:space="preserve"> </w:t>
+            </w:r>
+            <w:r>
+              <w:rPr>
+                <w:rFonts w:ascii="Avva_Shenouda" w:hAnsi="Avva_Shenouda" w:eastAsia="Avva_Shenouda" w:cs="Avva_Shenouda"/>
+                <w:sz w:val="10"/>
+              </w:rPr>
+              <w:t>nan</w:t>
+            </w:r>
+            <w:r>
+              <w:rPr>
+                <w:sz w:val="10"/>
+              </w:rPr>
+              <w:t xml:space="preserve"> </w:t>
+            </w:r>
+            <w:r>
+              <w:rPr>
+                <w:rFonts w:ascii="Avva_Shenouda" w:hAnsi="Avva_Shenouda" w:eastAsia="Avva_Shenouda" w:cs="Avva_Shenouda"/>
+                <w:sz w:val="10"/>
+              </w:rPr>
+              <w:t>`ebol</w:t>
+            </w:r>
+            <w:r>
+              <w:rPr>
+                <w:sz w:val="10"/>
+              </w:rPr>
+              <w:t>.</w:t>
             </w:r>
           </w:p>
         </w:tc>
@@ -639,7 +3203,65 @@
                 <w:rFonts w:ascii="Avva_Shenouda" w:hAnsi="Avva_Shenouda" w:eastAsia="Avva_Shenouda" w:cs="Avva_Shenouda"/>
                 <w:sz w:val="10"/>
               </w:rPr>
-              <w:t>Proc`ev7ac0e `vper tov `agiov evaggeliov.</w:t>
+              <w:t>Proc`ev7ac0e</w:t>
+            </w:r>
+            <w:r>
+              <w:rPr>
+                <w:sz w:val="10"/>
+              </w:rPr>
+              <w:t xml:space="preserve"> </w:t>
+            </w:r>
+            <w:r>
+              <w:rPr>
+                <w:rFonts w:ascii="Avva_Shenouda" w:hAnsi="Avva_Shenouda" w:eastAsia="Avva_Shenouda" w:cs="Avva_Shenouda"/>
+                <w:sz w:val="10"/>
+              </w:rPr>
+              <w:t>`vper</w:t>
+            </w:r>
+            <w:r>
+              <w:rPr>
+                <w:sz w:val="10"/>
+              </w:rPr>
+              <w:t xml:space="preserve"> </w:t>
+            </w:r>
+            <w:r>
+              <w:rPr>
+                <w:rFonts w:ascii="Avva_Shenouda" w:hAnsi="Avva_Shenouda" w:eastAsia="Avva_Shenouda" w:cs="Avva_Shenouda"/>
+                <w:sz w:val="10"/>
+              </w:rPr>
+              <w:t>tov</w:t>
+            </w:r>
+            <w:r>
+              <w:rPr>
+                <w:sz w:val="10"/>
+              </w:rPr>
+              <w:t xml:space="preserve"> </w:t>
+            </w:r>
+            <w:r>
+              <w:rPr>
+                <w:rFonts w:ascii="Avva_Shenouda" w:hAnsi="Avva_Shenouda" w:eastAsia="Avva_Shenouda" w:cs="Avva_Shenouda"/>
+                <w:sz w:val="10"/>
+              </w:rPr>
+              <w:t>`ajiov</w:t>
+            </w:r>
+            <w:r>
+              <w:rPr>
+                <w:sz w:val="10"/>
+              </w:rPr>
+              <w:t xml:space="preserve"> </w:t>
+            </w:r>
+            <w:r>
+              <w:rPr>
+                <w:rFonts w:ascii="Avva_Shenouda" w:hAnsi="Avva_Shenouda" w:eastAsia="Avva_Shenouda" w:cs="Avva_Shenouda"/>
+                <w:sz w:val="10"/>
+              </w:rPr>
+              <w:t>evajjeliov</w:t>
+            </w:r>
+            <w:r>
+              <w:rPr>
+                <w:sz w:val="10"/>
+              </w:rPr>
+              <w:t>.</w:t>
             </w:r>
           </w:p>
         </w:tc>
@@ -710,7 +3332,104 @@
                 <w:rFonts w:ascii="Avva_Shenouda" w:hAnsi="Avva_Shenouda" w:eastAsia="Avva_Shenouda" w:cs="Avva_Shenouda"/>
                 <w:sz w:val="10"/>
               </w:rPr>
-              <w:t>Cta03te meta fobov )eov `akovcwmen tov `agiov ev`aggeliov.</w:t>
+              <w:t>Cta03te</w:t>
+            </w:r>
+            <w:r>
+              <w:rPr>
+                <w:sz w:val="10"/>
+              </w:rPr>
+              <w:t xml:space="preserve"> </w:t>
+            </w:r>
+            <w:r>
+              <w:rPr>
+                <w:rFonts w:ascii="Avva_Shenouda" w:hAnsi="Avva_Shenouda" w:eastAsia="Avva_Shenouda" w:cs="Avva_Shenouda"/>
+                <w:sz w:val="10"/>
+              </w:rPr>
+              <w:t>meta</w:t>
+            </w:r>
+            <w:r>
+              <w:rPr>
+                <w:sz w:val="10"/>
+              </w:rPr>
+              <w:t xml:space="preserve"> </w:t>
+            </w:r>
+            <w:r>
+              <w:rPr>
+                <w:rFonts w:ascii="Avva_Shenouda" w:hAnsi="Avva_Shenouda" w:eastAsia="Avva_Shenouda" w:cs="Avva_Shenouda"/>
+                <w:sz w:val="10"/>
+              </w:rPr>
+              <w:t>fobov</w:t>
+            </w:r>
+            <w:r>
+              <w:rPr>
+                <w:sz w:val="10"/>
+              </w:rPr>
+              <w:t xml:space="preserve"> </w:t>
+            </w:r>
+            <w:r>
+              <w:rPr>
+                <w:rFonts w:ascii="Avva_Shenouda" w:hAnsi="Avva_Shenouda" w:eastAsia="Avva_Shenouda" w:cs="Avva_Shenouda"/>
+                <w:sz w:val="10"/>
+              </w:rPr>
+              <w:t>)eov</w:t>
+            </w:r>
+            <w:r>
+              <w:rPr>
+                <w:sz w:val="10"/>
+              </w:rPr>
+              <w:t xml:space="preserve"> </w:t>
+            </w:r>
+            <w:r>
+              <w:rPr>
+                <w:rFonts w:ascii="Avva_Shenouda" w:hAnsi="Avva_Shenouda" w:eastAsia="Avva_Shenouda" w:cs="Avva_Shenouda"/>
+                <w:sz w:val="10"/>
+              </w:rPr>
+              <w:t>`akovcwmen</w:t>
+            </w:r>
+            <w:r>
+              <w:rPr>
+                <w:sz w:val="10"/>
+              </w:rPr>
+              <w:t xml:space="preserve"> </w:t>
+            </w:r>
+            <w:r>
+              <w:rPr>
+                <w:rFonts w:ascii="Avva_Shenouda" w:hAnsi="Avva_Shenouda" w:eastAsia="Avva_Shenouda" w:cs="Avva_Shenouda"/>
+                <w:sz w:val="10"/>
+              </w:rPr>
+              <w:t>tov</w:t>
+            </w:r>
+            <w:r>
+              <w:rPr>
+                <w:sz w:val="10"/>
+              </w:rPr>
+              <w:t xml:space="preserve"> </w:t>
+            </w:r>
+            <w:r>
+              <w:rPr>
+                <w:rFonts w:ascii="Avva_Shenouda" w:hAnsi="Avva_Shenouda" w:eastAsia="Avva_Shenouda" w:cs="Avva_Shenouda"/>
+                <w:sz w:val="10"/>
+              </w:rPr>
+              <w:t>`ajiov</w:t>
+            </w:r>
+            <w:r>
+              <w:rPr>
+                <w:sz w:val="10"/>
+              </w:rPr>
+              <w:t xml:space="preserve"> </w:t>
+            </w:r>
+            <w:r>
+              <w:rPr>
+                <w:rFonts w:ascii="Avva_Shenouda" w:hAnsi="Avva_Shenouda" w:eastAsia="Avva_Shenouda" w:cs="Avva_Shenouda"/>
+                <w:sz w:val="10"/>
+              </w:rPr>
+              <w:t>ev`ajjeliov</w:t>
+            </w:r>
+            <w:r>
+              <w:rPr>
+                <w:sz w:val="10"/>
+              </w:rPr>
+              <w:t>.</w:t>
             </w:r>
           </w:p>
         </w:tc>
@@ -781,7 +3500,182 @@
                 <w:rFonts w:ascii="Avva_Shenouda" w:hAnsi="Avva_Shenouda" w:eastAsia="Avva_Shenouda" w:cs="Avva_Shenouda"/>
                 <w:sz w:val="10"/>
               </w:rPr>
-              <w:t>Procev7ac0e `vper t3c `ir3n3c t3c `agiac mon3c ka0olik3c ke `apoctolik3c or0odo7ov tov )eov ekkl3ciac.</w:t>
+              <w:t>Procev7ac0e</w:t>
+            </w:r>
+            <w:r>
+              <w:rPr>
+                <w:sz w:val="10"/>
+              </w:rPr>
+              <w:t xml:space="preserve"> </w:t>
+            </w:r>
+            <w:r>
+              <w:rPr>
+                <w:rFonts w:ascii="Avva_Shenouda" w:hAnsi="Avva_Shenouda" w:eastAsia="Avva_Shenouda" w:cs="Avva_Shenouda"/>
+                <w:sz w:val="10"/>
+              </w:rPr>
+              <w:t>`vper</w:t>
+            </w:r>
+            <w:r>
+              <w:rPr>
+                <w:sz w:val="10"/>
+              </w:rPr>
+              <w:t xml:space="preserve"> </w:t>
+            </w:r>
+            <w:r>
+              <w:rPr>
+                <w:rFonts w:ascii="Avva_Shenouda" w:hAnsi="Avva_Shenouda" w:eastAsia="Avva_Shenouda" w:cs="Avva_Shenouda"/>
+                <w:sz w:val="10"/>
+              </w:rPr>
+              <w:t>t3c</w:t>
+            </w:r>
+            <w:r>
+              <w:rPr>
+                <w:sz w:val="10"/>
+              </w:rPr>
+              <w:t xml:space="preserve"> </w:t>
+            </w:r>
+            <w:r>
+              <w:rPr>
+                <w:rFonts w:ascii="Avva_Shenouda" w:hAnsi="Avva_Shenouda" w:eastAsia="Avva_Shenouda" w:cs="Avva_Shenouda"/>
+                <w:sz w:val="10"/>
+              </w:rPr>
+              <w:t>`ir3n3c</w:t>
+            </w:r>
+            <w:r>
+              <w:rPr>
+                <w:sz w:val="10"/>
+              </w:rPr>
+              <w:t xml:space="preserve"> </w:t>
+            </w:r>
+            <w:r>
+              <w:rPr>
+                <w:rFonts w:ascii="Avva_Shenouda" w:hAnsi="Avva_Shenouda" w:eastAsia="Avva_Shenouda" w:cs="Avva_Shenouda"/>
+                <w:sz w:val="10"/>
+              </w:rPr>
+              <w:t>t3c</w:t>
+            </w:r>
+            <w:r>
+              <w:rPr>
+                <w:sz w:val="10"/>
+              </w:rPr>
+              <w:t xml:space="preserve"> </w:t>
+            </w:r>
+            <w:r>
+              <w:rPr>
+                <w:rFonts w:ascii="Avva_Shenouda" w:hAnsi="Avva_Shenouda" w:eastAsia="Avva_Shenouda" w:cs="Avva_Shenouda"/>
+                <w:sz w:val="10"/>
+              </w:rPr>
+              <w:t>`ajiac</w:t>
+            </w:r>
+            <w:r>
+              <w:rPr>
+                <w:sz w:val="10"/>
+              </w:rPr>
+              <w:t xml:space="preserve"> </w:t>
+            </w:r>
+            <w:r>
+              <w:rPr>
+                <w:rFonts w:ascii="Avva_Shenouda" w:hAnsi="Avva_Shenouda" w:eastAsia="Avva_Shenouda" w:cs="Avva_Shenouda"/>
+                <w:sz w:val="10"/>
+              </w:rPr>
+              <w:t>mon3c</w:t>
+            </w:r>
+            <w:r>
+              <w:rPr>
+                <w:sz w:val="10"/>
+              </w:rPr>
+              <w:t xml:space="preserve"> </w:t>
+            </w:r>
+            <w:r>
+              <w:rPr>
+                <w:rFonts w:ascii="Avva_Shenouda" w:hAnsi="Avva_Shenouda" w:eastAsia="Avva_Shenouda" w:cs="Avva_Shenouda"/>
+                <w:sz w:val="10"/>
+              </w:rPr>
+              <w:t>ka0olik3c</w:t>
+            </w:r>
+            <w:r>
+              <w:rPr>
+                <w:sz w:val="10"/>
+              </w:rPr>
+              <w:t xml:space="preserve"> </w:t>
+            </w:r>
+            <w:r>
+              <w:rPr>
+                <w:rFonts w:ascii="Avva_Shenouda" w:hAnsi="Avva_Shenouda" w:eastAsia="Avva_Shenouda" w:cs="Avva_Shenouda"/>
+                <w:sz w:val="10"/>
+              </w:rPr>
+              <w:t>ke</w:t>
+            </w:r>
+            <w:r>
+              <w:rPr>
+                <w:sz w:val="10"/>
+              </w:rPr>
+              <w:t xml:space="preserve"> </w:t>
+            </w:r>
+            <w:r>
+              <w:rPr>
+                <w:rFonts w:ascii="Avva_Shenouda" w:hAnsi="Avva_Shenouda" w:eastAsia="Avva_Shenouda" w:cs="Avva_Shenouda"/>
+                <w:sz w:val="10"/>
+              </w:rPr>
+              <w:t>`apoctolik3c</w:t>
+            </w:r>
+            <w:r>
+              <w:rPr>
+                <w:sz w:val="10"/>
+              </w:rPr>
+              <w:t xml:space="preserve"> </w:t>
+            </w:r>
+            <w:r>
+              <w:rPr>
+                <w:rFonts w:ascii="Avva_Shenouda" w:hAnsi="Avva_Shenouda" w:eastAsia="Avva_Shenouda" w:cs="Avva_Shenouda"/>
+                <w:sz w:val="10"/>
+              </w:rPr>
+              <w:t>or0odo7ov</w:t>
+            </w:r>
+            <w:r>
+              <w:rPr>
+                <w:sz w:val="10"/>
+              </w:rPr>
+              <w:t xml:space="preserve"> </w:t>
+            </w:r>
+            <w:r>
+              <w:rPr>
+                <w:rFonts w:ascii="Avva_Shenouda" w:hAnsi="Avva_Shenouda" w:eastAsia="Avva_Shenouda" w:cs="Avva_Shenouda"/>
+                <w:sz w:val="10"/>
+              </w:rPr>
+              <w:t>tov</w:t>
+            </w:r>
+            <w:r>
+              <w:rPr>
+                <w:sz w:val="10"/>
+              </w:rPr>
+              <w:t xml:space="preserve"> </w:t>
+            </w:r>
+            <w:r>
+              <w:rPr>
+                <w:rFonts w:ascii="Avva_Shenouda" w:hAnsi="Avva_Shenouda" w:eastAsia="Avva_Shenouda" w:cs="Avva_Shenouda"/>
+                <w:sz w:val="10"/>
+              </w:rPr>
+              <w:t>)eov</w:t>
+            </w:r>
+            <w:r>
+              <w:rPr>
+                <w:sz w:val="10"/>
+              </w:rPr>
+              <w:t xml:space="preserve"> </w:t>
+            </w:r>
+            <w:r>
+              <w:rPr>
+                <w:rFonts w:ascii="Avva_Shenouda" w:hAnsi="Avva_Shenouda" w:eastAsia="Avva_Shenouda" w:cs="Avva_Shenouda"/>
+                <w:sz w:val="10"/>
+              </w:rPr>
+              <w:t>ekkl3ciac</w:t>
+            </w:r>
+            <w:r>
+              <w:rPr>
+                <w:sz w:val="10"/>
+              </w:rPr>
+              <w:t>.</w:t>
             </w:r>
           </w:p>
         </w:tc>
@@ -852,7 +3746,741 @@
                 <w:rFonts w:ascii="Avva_Shenouda" w:hAnsi="Avva_Shenouda" w:eastAsia="Avva_Shenouda" w:cs="Avva_Shenouda"/>
                 <w:sz w:val="10"/>
               </w:rPr>
-              <w:t>`Procev7ac0e `vper tovarx3`erewc `3mwn papa abba )eodwroc: papa ke patriarxov ke arx3`epickopov t3c megalo polewc `Ale7an`driac: ke twn `adelfwn avtov en t3 `apoctolik3 litovrgia: Mar Ignatiov Afrem tov patriarxov t3c Antioxiac: ke `Apovna Bacilioc tov patriarxov t3c `Eritreac. Ke tov cvnkoinwnov en t3 litovrgia tov patroc `3mwn tov `epickopov (m3tropolitov) abba Iwc3f. Ke ton `or0odo7wn `3mwn `epickopwn.</w:t>
+              <w:t>`Procev7ac0e</w:t>
+            </w:r>
+            <w:r>
+              <w:rPr>
+                <w:sz w:val="10"/>
+              </w:rPr>
+              <w:t xml:space="preserve"> </w:t>
+            </w:r>
+            <w:r>
+              <w:rPr>
+                <w:rFonts w:ascii="Avva_Shenouda" w:hAnsi="Avva_Shenouda" w:eastAsia="Avva_Shenouda" w:cs="Avva_Shenouda"/>
+                <w:sz w:val="10"/>
+              </w:rPr>
+              <w:t>`vper</w:t>
+            </w:r>
+            <w:r>
+              <w:rPr>
+                <w:sz w:val="10"/>
+              </w:rPr>
+              <w:t xml:space="preserve"> </w:t>
+            </w:r>
+            <w:r>
+              <w:rPr>
+                <w:rFonts w:ascii="Avva_Shenouda" w:hAnsi="Avva_Shenouda" w:eastAsia="Avva_Shenouda" w:cs="Avva_Shenouda"/>
+                <w:sz w:val="10"/>
+              </w:rPr>
+              <w:t>tovarx3`erewc</w:t>
+            </w:r>
+            <w:r>
+              <w:rPr>
+                <w:sz w:val="10"/>
+              </w:rPr>
+              <w:t xml:space="preserve"> </w:t>
+            </w:r>
+            <w:r>
+              <w:rPr>
+                <w:rFonts w:ascii="Avva_Shenouda" w:hAnsi="Avva_Shenouda" w:eastAsia="Avva_Shenouda" w:cs="Avva_Shenouda"/>
+                <w:sz w:val="10"/>
+              </w:rPr>
+              <w:t>`3mwn</w:t>
+            </w:r>
+            <w:r>
+              <w:rPr>
+                <w:sz w:val="10"/>
+              </w:rPr>
+              <w:t xml:space="preserve"> </w:t>
+            </w:r>
+            <w:r>
+              <w:rPr>
+                <w:rFonts w:ascii="Avva_Shenouda" w:hAnsi="Avva_Shenouda" w:eastAsia="Avva_Shenouda" w:cs="Avva_Shenouda"/>
+                <w:sz w:val="10"/>
+              </w:rPr>
+              <w:t>papa</w:t>
+            </w:r>
+            <w:r>
+              <w:rPr>
+                <w:sz w:val="10"/>
+              </w:rPr>
+              <w:t xml:space="preserve"> </w:t>
+            </w:r>
+            <w:r>
+              <w:rPr>
+                <w:rFonts w:ascii="Avva_Shenouda" w:hAnsi="Avva_Shenouda" w:eastAsia="Avva_Shenouda" w:cs="Avva_Shenouda"/>
+                <w:sz w:val="10"/>
+              </w:rPr>
+              <w:t>abba</w:t>
+            </w:r>
+            <w:r>
+              <w:rPr>
+                <w:sz w:val="10"/>
+              </w:rPr>
+              <w:t xml:space="preserve"> </w:t>
+            </w:r>
+            <w:r>
+              <w:rPr>
+                <w:rFonts w:ascii="Avva_Shenouda" w:hAnsi="Avva_Shenouda" w:eastAsia="Avva_Shenouda" w:cs="Avva_Shenouda"/>
+                <w:sz w:val="10"/>
+              </w:rPr>
+              <w:t>)eodwroc</w:t>
+            </w:r>
+            <w:r>
+              <w:rPr>
+                <w:sz w:val="10"/>
+              </w:rPr>
+              <w:t xml:space="preserve">: </w:t>
+            </w:r>
+            <w:r>
+              <w:rPr>
+                <w:rFonts w:ascii="Avva_Shenouda" w:hAnsi="Avva_Shenouda" w:eastAsia="Avva_Shenouda" w:cs="Avva_Shenouda"/>
+                <w:sz w:val="10"/>
+              </w:rPr>
+              <w:t>papa</w:t>
+            </w:r>
+            <w:r>
+              <w:rPr>
+                <w:sz w:val="10"/>
+              </w:rPr>
+              <w:t xml:space="preserve"> </w:t>
+            </w:r>
+            <w:r>
+              <w:rPr>
+                <w:rFonts w:ascii="Avva_Shenouda" w:hAnsi="Avva_Shenouda" w:eastAsia="Avva_Shenouda" w:cs="Avva_Shenouda"/>
+                <w:sz w:val="10"/>
+              </w:rPr>
+              <w:t>ke</w:t>
+            </w:r>
+            <w:r>
+              <w:rPr>
+                <w:sz w:val="10"/>
+              </w:rPr>
+              <w:t xml:space="preserve"> </w:t>
+            </w:r>
+            <w:r>
+              <w:rPr>
+                <w:rFonts w:ascii="Avva_Shenouda" w:hAnsi="Avva_Shenouda" w:eastAsia="Avva_Shenouda" w:cs="Avva_Shenouda"/>
+                <w:sz w:val="10"/>
+              </w:rPr>
+              <w:t>patriarxov</w:t>
+            </w:r>
+            <w:r>
+              <w:rPr>
+                <w:sz w:val="10"/>
+              </w:rPr>
+              <w:t xml:space="preserve"> </w:t>
+            </w:r>
+            <w:r>
+              <w:rPr>
+                <w:rFonts w:ascii="Avva_Shenouda" w:hAnsi="Avva_Shenouda" w:eastAsia="Avva_Shenouda" w:cs="Avva_Shenouda"/>
+                <w:sz w:val="10"/>
+              </w:rPr>
+              <w:t>ke</w:t>
+            </w:r>
+            <w:r>
+              <w:rPr>
+                <w:sz w:val="10"/>
+              </w:rPr>
+              <w:t xml:space="preserve"> </w:t>
+            </w:r>
+            <w:r>
+              <w:rPr>
+                <w:rFonts w:ascii="Avva_Shenouda" w:hAnsi="Avva_Shenouda" w:eastAsia="Avva_Shenouda" w:cs="Avva_Shenouda"/>
+                <w:sz w:val="10"/>
+              </w:rPr>
+              <w:t>arx3`epickopov</w:t>
+            </w:r>
+            <w:r>
+              <w:rPr>
+                <w:sz w:val="10"/>
+              </w:rPr>
+              <w:t xml:space="preserve"> </w:t>
+            </w:r>
+            <w:r>
+              <w:rPr>
+                <w:rFonts w:ascii="Avva_Shenouda" w:hAnsi="Avva_Shenouda" w:eastAsia="Avva_Shenouda" w:cs="Avva_Shenouda"/>
+                <w:sz w:val="10"/>
+              </w:rPr>
+              <w:t>t3c</w:t>
+            </w:r>
+            <w:r>
+              <w:rPr>
+                <w:sz w:val="10"/>
+              </w:rPr>
+              <w:t xml:space="preserve"> </w:t>
+            </w:r>
+            <w:r>
+              <w:rPr>
+                <w:rFonts w:ascii="Avva_Shenouda" w:hAnsi="Avva_Shenouda" w:eastAsia="Avva_Shenouda" w:cs="Avva_Shenouda"/>
+                <w:sz w:val="10"/>
+              </w:rPr>
+              <w:t>mejalo</w:t>
+            </w:r>
+            <w:r>
+              <w:rPr>
+                <w:sz w:val="10"/>
+              </w:rPr>
+              <w:t xml:space="preserve"> </w:t>
+            </w:r>
+            <w:r>
+              <w:rPr>
+                <w:rFonts w:ascii="Avva_Shenouda" w:hAnsi="Avva_Shenouda" w:eastAsia="Avva_Shenouda" w:cs="Avva_Shenouda"/>
+                <w:sz w:val="10"/>
+              </w:rPr>
+              <w:t>polewc</w:t>
+            </w:r>
+            <w:r>
+              <w:rPr>
+                <w:sz w:val="10"/>
+              </w:rPr>
+              <w:t xml:space="preserve"> </w:t>
+            </w:r>
+            <w:r>
+              <w:rPr>
+                <w:rFonts w:ascii="Avva_Shenouda" w:hAnsi="Avva_Shenouda" w:eastAsia="Avva_Shenouda" w:cs="Avva_Shenouda"/>
+                <w:sz w:val="10"/>
+              </w:rPr>
+              <w:t>`Ale7an`driac</w:t>
+            </w:r>
+            <w:r>
+              <w:rPr>
+                <w:sz w:val="10"/>
+              </w:rPr>
+              <w:t xml:space="preserve">: </w:t>
+            </w:r>
+            <w:r>
+              <w:rPr>
+                <w:rFonts w:ascii="Avva_Shenouda" w:hAnsi="Avva_Shenouda" w:eastAsia="Avva_Shenouda" w:cs="Avva_Shenouda"/>
+                <w:sz w:val="10"/>
+              </w:rPr>
+              <w:t>ke</w:t>
+            </w:r>
+            <w:r>
+              <w:rPr>
+                <w:sz w:val="10"/>
+              </w:rPr>
+              <w:t xml:space="preserve"> </w:t>
+            </w:r>
+            <w:r>
+              <w:rPr>
+                <w:rFonts w:ascii="Avva_Shenouda" w:hAnsi="Avva_Shenouda" w:eastAsia="Avva_Shenouda" w:cs="Avva_Shenouda"/>
+                <w:sz w:val="10"/>
+              </w:rPr>
+              <w:t>twn</w:t>
+            </w:r>
+            <w:r>
+              <w:rPr>
+                <w:sz w:val="10"/>
+              </w:rPr>
+              <w:t xml:space="preserve"> </w:t>
+            </w:r>
+            <w:r>
+              <w:rPr>
+                <w:rFonts w:ascii="Avva_Shenouda" w:hAnsi="Avva_Shenouda" w:eastAsia="Avva_Shenouda" w:cs="Avva_Shenouda"/>
+                <w:sz w:val="10"/>
+              </w:rPr>
+              <w:t>`adelfwn</w:t>
+            </w:r>
+            <w:r>
+              <w:rPr>
+                <w:sz w:val="10"/>
+              </w:rPr>
+              <w:t xml:space="preserve"> </w:t>
+            </w:r>
+            <w:r>
+              <w:rPr>
+                <w:rFonts w:ascii="Avva_Shenouda" w:hAnsi="Avva_Shenouda" w:eastAsia="Avva_Shenouda" w:cs="Avva_Shenouda"/>
+                <w:sz w:val="10"/>
+              </w:rPr>
+              <w:t>avtov</w:t>
+            </w:r>
+            <w:r>
+              <w:rPr>
+                <w:sz w:val="10"/>
+              </w:rPr>
+              <w:t xml:space="preserve"> </w:t>
+            </w:r>
+            <w:r>
+              <w:rPr>
+                <w:rFonts w:ascii="Avva_Shenouda" w:hAnsi="Avva_Shenouda" w:eastAsia="Avva_Shenouda" w:cs="Avva_Shenouda"/>
+                <w:sz w:val="10"/>
+              </w:rPr>
+              <w:t>en</w:t>
+            </w:r>
+            <w:r>
+              <w:rPr>
+                <w:sz w:val="10"/>
+              </w:rPr>
+              <w:t xml:space="preserve"> </w:t>
+            </w:r>
+            <w:r>
+              <w:rPr>
+                <w:rFonts w:ascii="Avva_Shenouda" w:hAnsi="Avva_Shenouda" w:eastAsia="Avva_Shenouda" w:cs="Avva_Shenouda"/>
+                <w:sz w:val="10"/>
+              </w:rPr>
+              <w:t>t3</w:t>
+            </w:r>
+            <w:r>
+              <w:rPr>
+                <w:sz w:val="10"/>
+              </w:rPr>
+              <w:t xml:space="preserve"> </w:t>
+            </w:r>
+            <w:r>
+              <w:rPr>
+                <w:rFonts w:ascii="Avva_Shenouda" w:hAnsi="Avva_Shenouda" w:eastAsia="Avva_Shenouda" w:cs="Avva_Shenouda"/>
+                <w:sz w:val="10"/>
+              </w:rPr>
+              <w:t>`apoctolik3</w:t>
+            </w:r>
+            <w:r>
+              <w:rPr>
+                <w:sz w:val="10"/>
+              </w:rPr>
+              <w:t xml:space="preserve"> </w:t>
+            </w:r>
+            <w:r>
+              <w:rPr>
+                <w:rFonts w:ascii="Avva_Shenouda" w:hAnsi="Avva_Shenouda" w:eastAsia="Avva_Shenouda" w:cs="Avva_Shenouda"/>
+                <w:sz w:val="10"/>
+              </w:rPr>
+              <w:t>litovrjia</w:t>
+            </w:r>
+            <w:r>
+              <w:rPr>
+                <w:sz w:val="10"/>
+              </w:rPr>
+              <w:t xml:space="preserve">: </w:t>
+            </w:r>
+            <w:r>
+              <w:rPr>
+                <w:rFonts w:ascii="Avva_Shenouda" w:hAnsi="Avva_Shenouda" w:eastAsia="Avva_Shenouda" w:cs="Avva_Shenouda"/>
+                <w:sz w:val="10"/>
+              </w:rPr>
+              <w:t>Mar</w:t>
+            </w:r>
+            <w:r>
+              <w:rPr>
+                <w:sz w:val="10"/>
+              </w:rPr>
+              <w:t xml:space="preserve"> </w:t>
+            </w:r>
+            <w:r>
+              <w:rPr>
+                <w:rFonts w:ascii="Avva_Shenouda" w:hAnsi="Avva_Shenouda" w:eastAsia="Avva_Shenouda" w:cs="Avva_Shenouda"/>
+                <w:sz w:val="10"/>
+              </w:rPr>
+              <w:t>Ijnatiov</w:t>
+            </w:r>
+            <w:r>
+              <w:rPr>
+                <w:sz w:val="10"/>
+              </w:rPr>
+              <w:t xml:space="preserve"> </w:t>
+            </w:r>
+            <w:r>
+              <w:rPr>
+                <w:rFonts w:ascii="Avva_Shenouda" w:hAnsi="Avva_Shenouda" w:eastAsia="Avva_Shenouda" w:cs="Avva_Shenouda"/>
+                <w:sz w:val="10"/>
+              </w:rPr>
+              <w:t>Afrem</w:t>
+            </w:r>
+            <w:r>
+              <w:rPr>
+                <w:sz w:val="10"/>
+              </w:rPr>
+              <w:t xml:space="preserve"> </w:t>
+            </w:r>
+            <w:r>
+              <w:rPr>
+                <w:rFonts w:ascii="Avva_Shenouda" w:hAnsi="Avva_Shenouda" w:eastAsia="Avva_Shenouda" w:cs="Avva_Shenouda"/>
+                <w:sz w:val="10"/>
+              </w:rPr>
+              <w:t>tov</w:t>
+            </w:r>
+            <w:r>
+              <w:rPr>
+                <w:sz w:val="10"/>
+              </w:rPr>
+              <w:t xml:space="preserve"> </w:t>
+            </w:r>
+            <w:r>
+              <w:rPr>
+                <w:rFonts w:ascii="Avva_Shenouda" w:hAnsi="Avva_Shenouda" w:eastAsia="Avva_Shenouda" w:cs="Avva_Shenouda"/>
+                <w:sz w:val="10"/>
+              </w:rPr>
+              <w:t>patriarxov</w:t>
+            </w:r>
+            <w:r>
+              <w:rPr>
+                <w:sz w:val="10"/>
+              </w:rPr>
+              <w:t xml:space="preserve"> </w:t>
+            </w:r>
+            <w:r>
+              <w:rPr>
+                <w:rFonts w:ascii="Avva_Shenouda" w:hAnsi="Avva_Shenouda" w:eastAsia="Avva_Shenouda" w:cs="Avva_Shenouda"/>
+                <w:sz w:val="10"/>
+              </w:rPr>
+              <w:t>t3c</w:t>
+            </w:r>
+            <w:r>
+              <w:rPr>
+                <w:sz w:val="10"/>
+              </w:rPr>
+              <w:t xml:space="preserve"> </w:t>
+            </w:r>
+            <w:r>
+              <w:rPr>
+                <w:rFonts w:ascii="Avva_Shenouda" w:hAnsi="Avva_Shenouda" w:eastAsia="Avva_Shenouda" w:cs="Avva_Shenouda"/>
+                <w:sz w:val="10"/>
+              </w:rPr>
+              <w:t>Antioxiac</w:t>
+            </w:r>
+            <w:r>
+              <w:rPr>
+                <w:sz w:val="10"/>
+              </w:rPr>
+              <w:t xml:space="preserve">: </w:t>
+            </w:r>
+            <w:r>
+              <w:rPr>
+                <w:rFonts w:ascii="Avva_Shenouda" w:hAnsi="Avva_Shenouda" w:eastAsia="Avva_Shenouda" w:cs="Avva_Shenouda"/>
+                <w:sz w:val="10"/>
+              </w:rPr>
+              <w:t>ke</w:t>
+            </w:r>
+            <w:r>
+              <w:rPr>
+                <w:sz w:val="10"/>
+              </w:rPr>
+              <w:t xml:space="preserve"> </w:t>
+            </w:r>
+            <w:r>
+              <w:rPr>
+                <w:rFonts w:ascii="Avva_Shenouda" w:hAnsi="Avva_Shenouda" w:eastAsia="Avva_Shenouda" w:cs="Avva_Shenouda"/>
+                <w:sz w:val="10"/>
+              </w:rPr>
+              <w:t>`Apovna</w:t>
+            </w:r>
+            <w:r>
+              <w:rPr>
+                <w:sz w:val="10"/>
+              </w:rPr>
+              <w:t xml:space="preserve"> </w:t>
+            </w:r>
+            <w:r>
+              <w:rPr>
+                <w:rFonts w:ascii="Avva_Shenouda" w:hAnsi="Avva_Shenouda" w:eastAsia="Avva_Shenouda" w:cs="Avva_Shenouda"/>
+                <w:sz w:val="10"/>
+              </w:rPr>
+              <w:t>Bacilioc</w:t>
+            </w:r>
+            <w:r>
+              <w:rPr>
+                <w:sz w:val="10"/>
+              </w:rPr>
+              <w:t xml:space="preserve"> </w:t>
+            </w:r>
+            <w:r>
+              <w:rPr>
+                <w:rFonts w:ascii="Avva_Shenouda" w:hAnsi="Avva_Shenouda" w:eastAsia="Avva_Shenouda" w:cs="Avva_Shenouda"/>
+                <w:sz w:val="10"/>
+              </w:rPr>
+              <w:t>tov</w:t>
+            </w:r>
+            <w:r>
+              <w:rPr>
+                <w:sz w:val="10"/>
+              </w:rPr>
+              <w:t xml:space="preserve"> </w:t>
+            </w:r>
+            <w:r>
+              <w:rPr>
+                <w:rFonts w:ascii="Avva_Shenouda" w:hAnsi="Avva_Shenouda" w:eastAsia="Avva_Shenouda" w:cs="Avva_Shenouda"/>
+                <w:sz w:val="10"/>
+              </w:rPr>
+              <w:t>patriarxov</w:t>
+            </w:r>
+            <w:r>
+              <w:rPr>
+                <w:sz w:val="10"/>
+              </w:rPr>
+              <w:t xml:space="preserve"> </w:t>
+            </w:r>
+            <w:r>
+              <w:rPr>
+                <w:rFonts w:ascii="Avva_Shenouda" w:hAnsi="Avva_Shenouda" w:eastAsia="Avva_Shenouda" w:cs="Avva_Shenouda"/>
+                <w:sz w:val="10"/>
+              </w:rPr>
+              <w:t>t3c</w:t>
+            </w:r>
+            <w:r>
+              <w:rPr>
+                <w:sz w:val="10"/>
+              </w:rPr>
+              <w:t xml:space="preserve"> </w:t>
+            </w:r>
+            <w:r>
+              <w:rPr>
+                <w:rFonts w:ascii="Avva_Shenouda" w:hAnsi="Avva_Shenouda" w:eastAsia="Avva_Shenouda" w:cs="Avva_Shenouda"/>
+                <w:sz w:val="10"/>
+              </w:rPr>
+              <w:t>`Eritreac</w:t>
+            </w:r>
+            <w:r>
+              <w:rPr>
+                <w:sz w:val="10"/>
+              </w:rPr>
+              <w:t xml:space="preserve">. </w:t>
+            </w:r>
+            <w:r>
+              <w:rPr>
+                <w:rFonts w:ascii="Avva_Shenouda" w:hAnsi="Avva_Shenouda" w:eastAsia="Avva_Shenouda" w:cs="Avva_Shenouda"/>
+                <w:sz w:val="10"/>
+              </w:rPr>
+              <w:t>Ke</w:t>
+            </w:r>
+            <w:r>
+              <w:rPr>
+                <w:sz w:val="10"/>
+              </w:rPr>
+              <w:t xml:space="preserve"> </w:t>
+            </w:r>
+            <w:r>
+              <w:rPr>
+                <w:rFonts w:ascii="Avva_Shenouda" w:hAnsi="Avva_Shenouda" w:eastAsia="Avva_Shenouda" w:cs="Avva_Shenouda"/>
+                <w:sz w:val="10"/>
+              </w:rPr>
+              <w:t>tov</w:t>
+            </w:r>
+            <w:r>
+              <w:rPr>
+                <w:sz w:val="10"/>
+              </w:rPr>
+              <w:t xml:space="preserve"> </w:t>
+            </w:r>
+            <w:r>
+              <w:rPr>
+                <w:rFonts w:ascii="Avva_Shenouda" w:hAnsi="Avva_Shenouda" w:eastAsia="Avva_Shenouda" w:cs="Avva_Shenouda"/>
+                <w:sz w:val="10"/>
+              </w:rPr>
+              <w:t>cvnkoinwnov</w:t>
+            </w:r>
+            <w:r>
+              <w:rPr>
+                <w:sz w:val="10"/>
+              </w:rPr>
+              <w:t xml:space="preserve"> </w:t>
+            </w:r>
+            <w:r>
+              <w:rPr>
+                <w:rFonts w:ascii="Avva_Shenouda" w:hAnsi="Avva_Shenouda" w:eastAsia="Avva_Shenouda" w:cs="Avva_Shenouda"/>
+                <w:sz w:val="10"/>
+              </w:rPr>
+              <w:t>en</w:t>
+            </w:r>
+            <w:r>
+              <w:rPr>
+                <w:sz w:val="10"/>
+              </w:rPr>
+              <w:t xml:space="preserve"> </w:t>
+            </w:r>
+            <w:r>
+              <w:rPr>
+                <w:rFonts w:ascii="Avva_Shenouda" w:hAnsi="Avva_Shenouda" w:eastAsia="Avva_Shenouda" w:cs="Avva_Shenouda"/>
+                <w:sz w:val="10"/>
+              </w:rPr>
+              <w:t>t3</w:t>
+            </w:r>
+            <w:r>
+              <w:rPr>
+                <w:sz w:val="10"/>
+              </w:rPr>
+              <w:t xml:space="preserve"> </w:t>
+            </w:r>
+            <w:r>
+              <w:rPr>
+                <w:rFonts w:ascii="Avva_Shenouda" w:hAnsi="Avva_Shenouda" w:eastAsia="Avva_Shenouda" w:cs="Avva_Shenouda"/>
+                <w:sz w:val="10"/>
+              </w:rPr>
+              <w:t>litovrjia</w:t>
+            </w:r>
+            <w:r>
+              <w:rPr>
+                <w:sz w:val="10"/>
+              </w:rPr>
+              <w:t xml:space="preserve"> </w:t>
+            </w:r>
+            <w:r>
+              <w:rPr>
+                <w:rFonts w:ascii="Avva_Shenouda" w:hAnsi="Avva_Shenouda" w:eastAsia="Avva_Shenouda" w:cs="Avva_Shenouda"/>
+                <w:sz w:val="10"/>
+              </w:rPr>
+              <w:t>tov</w:t>
+            </w:r>
+            <w:r>
+              <w:rPr>
+                <w:sz w:val="10"/>
+              </w:rPr>
+              <w:t xml:space="preserve"> </w:t>
+            </w:r>
+            <w:r>
+              <w:rPr>
+                <w:rFonts w:ascii="Avva_Shenouda" w:hAnsi="Avva_Shenouda" w:eastAsia="Avva_Shenouda" w:cs="Avva_Shenouda"/>
+                <w:sz w:val="10"/>
+              </w:rPr>
+              <w:t>patroc</w:t>
+            </w:r>
+            <w:r>
+              <w:rPr>
+                <w:sz w:val="10"/>
+              </w:rPr>
+              <w:t xml:space="preserve"> </w:t>
+            </w:r>
+            <w:r>
+              <w:rPr>
+                <w:rFonts w:ascii="Avva_Shenouda" w:hAnsi="Avva_Shenouda" w:eastAsia="Avva_Shenouda" w:cs="Avva_Shenouda"/>
+                <w:sz w:val="10"/>
+              </w:rPr>
+              <w:t>`3mwn</w:t>
+            </w:r>
+            <w:r>
+              <w:rPr>
+                <w:sz w:val="10"/>
+              </w:rPr>
+              <w:t xml:space="preserve"> </w:t>
+            </w:r>
+            <w:r>
+              <w:rPr>
+                <w:rFonts w:ascii="Avva_Shenouda" w:hAnsi="Avva_Shenouda" w:eastAsia="Avva_Shenouda" w:cs="Avva_Shenouda"/>
+                <w:sz w:val="10"/>
+              </w:rPr>
+              <w:t>tov</w:t>
+            </w:r>
+            <w:r>
+              <w:rPr>
+                <w:sz w:val="10"/>
+              </w:rPr>
+              <w:t xml:space="preserve"> </w:t>
+            </w:r>
+            <w:r>
+              <w:rPr>
+                <w:rFonts w:ascii="Avva_Shenouda" w:hAnsi="Avva_Shenouda" w:eastAsia="Avva_Shenouda" w:cs="Avva_Shenouda"/>
+                <w:sz w:val="10"/>
+              </w:rPr>
+              <w:t>`epickopov</w:t>
+            </w:r>
+            <w:r>
+              <w:rPr>
+                <w:sz w:val="10"/>
+              </w:rPr>
+              <w:t xml:space="preserve"> (</w:t>
+            </w:r>
+            <w:r>
+              <w:rPr>
+                <w:rFonts w:ascii="Avva_Shenouda" w:hAnsi="Avva_Shenouda" w:eastAsia="Avva_Shenouda" w:cs="Avva_Shenouda"/>
+                <w:sz w:val="10"/>
+              </w:rPr>
+              <w:t>m3tropolitov</w:t>
+            </w:r>
+            <w:r>
+              <w:rPr>
+                <w:sz w:val="10"/>
+              </w:rPr>
+              <w:t xml:space="preserve">) </w:t>
+            </w:r>
+            <w:r>
+              <w:rPr>
+                <w:rFonts w:ascii="Avva_Shenouda" w:hAnsi="Avva_Shenouda" w:eastAsia="Avva_Shenouda" w:cs="Avva_Shenouda"/>
+                <w:sz w:val="10"/>
+              </w:rPr>
+              <w:t>abba</w:t>
+            </w:r>
+            <w:r>
+              <w:rPr>
+                <w:sz w:val="10"/>
+              </w:rPr>
+              <w:t xml:space="preserve"> </w:t>
+            </w:r>
+            <w:r>
+              <w:rPr>
+                <w:rFonts w:ascii="Avva_Shenouda" w:hAnsi="Avva_Shenouda" w:eastAsia="Avva_Shenouda" w:cs="Avva_Shenouda"/>
+                <w:sz w:val="10"/>
+              </w:rPr>
+              <w:t>Iwc3f</w:t>
+            </w:r>
+            <w:r>
+              <w:rPr>
+                <w:sz w:val="10"/>
+              </w:rPr>
+              <w:t xml:space="preserve">. </w:t>
+            </w:r>
+            <w:r>
+              <w:rPr>
+                <w:rFonts w:ascii="Avva_Shenouda" w:hAnsi="Avva_Shenouda" w:eastAsia="Avva_Shenouda" w:cs="Avva_Shenouda"/>
+                <w:sz w:val="10"/>
+              </w:rPr>
+              <w:t>Ke</w:t>
+            </w:r>
+            <w:r>
+              <w:rPr>
+                <w:sz w:val="10"/>
+              </w:rPr>
+              <w:t xml:space="preserve"> </w:t>
+            </w:r>
+            <w:r>
+              <w:rPr>
+                <w:rFonts w:ascii="Avva_Shenouda" w:hAnsi="Avva_Shenouda" w:eastAsia="Avva_Shenouda" w:cs="Avva_Shenouda"/>
+                <w:sz w:val="10"/>
+              </w:rPr>
+              <w:t>ton</w:t>
+            </w:r>
+            <w:r>
+              <w:rPr>
+                <w:sz w:val="10"/>
+              </w:rPr>
+              <w:t xml:space="preserve"> </w:t>
+            </w:r>
+            <w:r>
+              <w:rPr>
+                <w:rFonts w:ascii="Avva_Shenouda" w:hAnsi="Avva_Shenouda" w:eastAsia="Avva_Shenouda" w:cs="Avva_Shenouda"/>
+                <w:sz w:val="10"/>
+              </w:rPr>
+              <w:t>`or0odo7wn</w:t>
+            </w:r>
+            <w:r>
+              <w:rPr>
+                <w:sz w:val="10"/>
+              </w:rPr>
+              <w:t xml:space="preserve"> </w:t>
+            </w:r>
+            <w:r>
+              <w:rPr>
+                <w:rFonts w:ascii="Avva_Shenouda" w:hAnsi="Avva_Shenouda" w:eastAsia="Avva_Shenouda" w:cs="Avva_Shenouda"/>
+                <w:sz w:val="10"/>
+              </w:rPr>
+              <w:t>`3mwn</w:t>
+            </w:r>
+            <w:r>
+              <w:rPr>
+                <w:sz w:val="10"/>
+              </w:rPr>
+              <w:t xml:space="preserve"> </w:t>
+            </w:r>
+            <w:r>
+              <w:rPr>
+                <w:rFonts w:ascii="Avva_Shenouda" w:hAnsi="Avva_Shenouda" w:eastAsia="Avva_Shenouda" w:cs="Avva_Shenouda"/>
+                <w:sz w:val="10"/>
+              </w:rPr>
+              <w:t>`epickopwn</w:t>
+            </w:r>
+            <w:r>
+              <w:rPr>
+                <w:sz w:val="10"/>
+              </w:rPr>
+              <w:t>.</w:t>
             </w:r>
           </w:p>
         </w:tc>
@@ -923,7 +4551,130 @@
                 <w:rFonts w:ascii="Avva_Shenouda" w:hAnsi="Avva_Shenouda" w:eastAsia="Avva_Shenouda" w:cs="Avva_Shenouda"/>
                 <w:sz w:val="10"/>
               </w:rPr>
-              <w:t>`Proceve7ac0e `vper t3c agiac ekkl3ciac tavt3c ke twn cvnelevcewn `3mwn.</w:t>
+              <w:t>`Proceve7ac0e</w:t>
+            </w:r>
+            <w:r>
+              <w:rPr>
+                <w:sz w:val="10"/>
+              </w:rPr>
+              <w:t xml:space="preserve"> </w:t>
+            </w:r>
+            <w:r>
+              <w:rPr>
+                <w:rFonts w:ascii="Avva_Shenouda" w:hAnsi="Avva_Shenouda" w:eastAsia="Avva_Shenouda" w:cs="Avva_Shenouda"/>
+                <w:sz w:val="10"/>
+              </w:rPr>
+              <w:t>`vper</w:t>
+            </w:r>
+            <w:r>
+              <w:rPr>
+                <w:sz w:val="10"/>
+              </w:rPr>
+              <w:t xml:space="preserve"> </w:t>
+            </w:r>
+            <w:r>
+              <w:rPr>
+                <w:rFonts w:ascii="Avva_Shenouda" w:hAnsi="Avva_Shenouda" w:eastAsia="Avva_Shenouda" w:cs="Avva_Shenouda"/>
+                <w:sz w:val="10"/>
+              </w:rPr>
+              <w:t>t3c</w:t>
+            </w:r>
+            <w:r>
+              <w:rPr>
+                <w:sz w:val="10"/>
+              </w:rPr>
+              <w:t xml:space="preserve"> </w:t>
+            </w:r>
+            <w:r>
+              <w:rPr>
+                <w:rFonts w:ascii="Avva_Shenouda" w:hAnsi="Avva_Shenouda" w:eastAsia="Avva_Shenouda" w:cs="Avva_Shenouda"/>
+                <w:sz w:val="10"/>
+              </w:rPr>
+              <w:t>ajiac</w:t>
+            </w:r>
+            <w:r>
+              <w:rPr>
+                <w:sz w:val="10"/>
+              </w:rPr>
+              <w:t xml:space="preserve"> </w:t>
+            </w:r>
+            <w:r>
+              <w:rPr>
+                <w:rFonts w:ascii="Avva_Shenouda" w:hAnsi="Avva_Shenouda" w:eastAsia="Avva_Shenouda" w:cs="Avva_Shenouda"/>
+                <w:sz w:val="10"/>
+              </w:rPr>
+              <w:t>ekkl3ciac</w:t>
+            </w:r>
+            <w:r>
+              <w:rPr>
+                <w:sz w:val="10"/>
+              </w:rPr>
+              <w:t xml:space="preserve"> </w:t>
+            </w:r>
+            <w:r>
+              <w:rPr>
+                <w:rFonts w:ascii="Avva_Shenouda" w:hAnsi="Avva_Shenouda" w:eastAsia="Avva_Shenouda" w:cs="Avva_Shenouda"/>
+                <w:sz w:val="10"/>
+              </w:rPr>
+              <w:t>tavt3c</w:t>
+            </w:r>
+            <w:r>
+              <w:rPr>
+                <w:sz w:val="10"/>
+              </w:rPr>
+              <w:t xml:space="preserve"> </w:t>
+            </w:r>
+            <w:r>
+              <w:rPr>
+                <w:rFonts w:ascii="Avva_Shenouda" w:hAnsi="Avva_Shenouda" w:eastAsia="Avva_Shenouda" w:cs="Avva_Shenouda"/>
+                <w:sz w:val="10"/>
+              </w:rPr>
+              <w:t>ke</w:t>
+            </w:r>
+            <w:r>
+              <w:rPr>
+                <w:sz w:val="10"/>
+              </w:rPr>
+              <w:t xml:space="preserve"> </w:t>
+            </w:r>
+            <w:r>
+              <w:rPr>
+                <w:rFonts w:ascii="Avva_Shenouda" w:hAnsi="Avva_Shenouda" w:eastAsia="Avva_Shenouda" w:cs="Avva_Shenouda"/>
+                <w:sz w:val="10"/>
+              </w:rPr>
+              <w:t>twn</w:t>
+            </w:r>
+            <w:r>
+              <w:rPr>
+                <w:sz w:val="10"/>
+              </w:rPr>
+              <w:t xml:space="preserve"> </w:t>
+            </w:r>
+            <w:r>
+              <w:rPr>
+                <w:rFonts w:ascii="Avva_Shenouda" w:hAnsi="Avva_Shenouda" w:eastAsia="Avva_Shenouda" w:cs="Avva_Shenouda"/>
+                <w:sz w:val="10"/>
+              </w:rPr>
+              <w:t>cvnelevcewn</w:t>
+            </w:r>
+            <w:r>
+              <w:rPr>
+                <w:sz w:val="10"/>
+              </w:rPr>
+              <w:t xml:space="preserve"> </w:t>
+            </w:r>
+            <w:r>
+              <w:rPr>
+                <w:rFonts w:ascii="Avva_Shenouda" w:hAnsi="Avva_Shenouda" w:eastAsia="Avva_Shenouda" w:cs="Avva_Shenouda"/>
+                <w:sz w:val="10"/>
+              </w:rPr>
+              <w:t>`3mwn</w:t>
+            </w:r>
+            <w:r>
+              <w:rPr>
+                <w:sz w:val="10"/>
+              </w:rPr>
+              <w:t>.</w:t>
             </w:r>
           </w:p>
         </w:tc>
@@ -994,7 +4745,494 @@
                 <w:rFonts w:ascii="Avva_Shenouda" w:hAnsi="Avva_Shenouda" w:eastAsia="Avva_Shenouda" w:cs="Avva_Shenouda"/>
                 <w:sz w:val="10"/>
               </w:rPr>
-              <w:t>Twbh `egen ni`a3r `nte `tfe nem nikarpoc `nte `pkahi: `pginmo2i `e`p2wi `nte niiarwov `mmwov: nici5 nem nicim nem nirwt `nte `tkoi: hina `nte P=x=c pennov5 `cmov `erwov ovoh `nte42enh3t qa pe4`placma `eta ne4gig 0amio4 `nte4xa nennobi nan `ebol.</w:t>
+              <w:t>Twbh</w:t>
+            </w:r>
+            <w:r>
+              <w:rPr>
+                <w:sz w:val="10"/>
+              </w:rPr>
+              <w:t xml:space="preserve"> </w:t>
+            </w:r>
+            <w:r>
+              <w:rPr>
+                <w:rFonts w:ascii="Avva_Shenouda" w:hAnsi="Avva_Shenouda" w:eastAsia="Avva_Shenouda" w:cs="Avva_Shenouda"/>
+                <w:sz w:val="10"/>
+              </w:rPr>
+              <w:t>`egen</w:t>
+            </w:r>
+            <w:r>
+              <w:rPr>
+                <w:sz w:val="10"/>
+              </w:rPr>
+              <w:t xml:space="preserve"> </w:t>
+            </w:r>
+            <w:r>
+              <w:rPr>
+                <w:rFonts w:ascii="Avva_Shenouda" w:hAnsi="Avva_Shenouda" w:eastAsia="Avva_Shenouda" w:cs="Avva_Shenouda"/>
+                <w:sz w:val="10"/>
+              </w:rPr>
+              <w:t>ni`a3r</w:t>
+            </w:r>
+            <w:r>
+              <w:rPr>
+                <w:sz w:val="10"/>
+              </w:rPr>
+              <w:t xml:space="preserve"> </w:t>
+            </w:r>
+            <w:r>
+              <w:rPr>
+                <w:rFonts w:ascii="Avva_Shenouda" w:hAnsi="Avva_Shenouda" w:eastAsia="Avva_Shenouda" w:cs="Avva_Shenouda"/>
+                <w:sz w:val="10"/>
+              </w:rPr>
+              <w:t>`nte</w:t>
+            </w:r>
+            <w:r>
+              <w:rPr>
+                <w:sz w:val="10"/>
+              </w:rPr>
+              <w:t xml:space="preserve"> </w:t>
+            </w:r>
+            <w:r>
+              <w:rPr>
+                <w:rFonts w:ascii="Avva_Shenouda" w:hAnsi="Avva_Shenouda" w:eastAsia="Avva_Shenouda" w:cs="Avva_Shenouda"/>
+                <w:sz w:val="10"/>
+              </w:rPr>
+              <w:t>`tfe</w:t>
+            </w:r>
+            <w:r>
+              <w:rPr>
+                <w:sz w:val="10"/>
+              </w:rPr>
+              <w:t xml:space="preserve"> </w:t>
+            </w:r>
+            <w:r>
+              <w:rPr>
+                <w:rFonts w:ascii="Avva_Shenouda" w:hAnsi="Avva_Shenouda" w:eastAsia="Avva_Shenouda" w:cs="Avva_Shenouda"/>
+                <w:sz w:val="10"/>
+              </w:rPr>
+              <w:t>nem</w:t>
+            </w:r>
+            <w:r>
+              <w:rPr>
+                <w:sz w:val="10"/>
+              </w:rPr>
+              <w:t xml:space="preserve"> </w:t>
+            </w:r>
+            <w:r>
+              <w:rPr>
+                <w:rFonts w:ascii="Avva_Shenouda" w:hAnsi="Avva_Shenouda" w:eastAsia="Avva_Shenouda" w:cs="Avva_Shenouda"/>
+                <w:sz w:val="10"/>
+              </w:rPr>
+              <w:t>nikarpoc</w:t>
+            </w:r>
+            <w:r>
+              <w:rPr>
+                <w:sz w:val="10"/>
+              </w:rPr>
+              <w:t xml:space="preserve"> </w:t>
+            </w:r>
+            <w:r>
+              <w:rPr>
+                <w:rFonts w:ascii="Avva_Shenouda" w:hAnsi="Avva_Shenouda" w:eastAsia="Avva_Shenouda" w:cs="Avva_Shenouda"/>
+                <w:sz w:val="10"/>
+              </w:rPr>
+              <w:t>`nte</w:t>
+            </w:r>
+            <w:r>
+              <w:rPr>
+                <w:sz w:val="10"/>
+              </w:rPr>
+              <w:t xml:space="preserve"> </w:t>
+            </w:r>
+            <w:r>
+              <w:rPr>
+                <w:rFonts w:ascii="Avva_Shenouda" w:hAnsi="Avva_Shenouda" w:eastAsia="Avva_Shenouda" w:cs="Avva_Shenouda"/>
+                <w:sz w:val="10"/>
+              </w:rPr>
+              <w:t>`pkahi</w:t>
+            </w:r>
+            <w:r>
+              <w:rPr>
+                <w:sz w:val="10"/>
+              </w:rPr>
+              <w:t xml:space="preserve">: </w:t>
+            </w:r>
+            <w:r>
+              <w:rPr>
+                <w:rFonts w:ascii="Avva_Shenouda" w:hAnsi="Avva_Shenouda" w:eastAsia="Avva_Shenouda" w:cs="Avva_Shenouda"/>
+                <w:sz w:val="10"/>
+              </w:rPr>
+              <w:t>`pginmo2i</w:t>
+            </w:r>
+            <w:r>
+              <w:rPr>
+                <w:sz w:val="10"/>
+              </w:rPr>
+              <w:t xml:space="preserve"> </w:t>
+            </w:r>
+            <w:r>
+              <w:rPr>
+                <w:rFonts w:ascii="Avva_Shenouda" w:hAnsi="Avva_Shenouda" w:eastAsia="Avva_Shenouda" w:cs="Avva_Shenouda"/>
+                <w:sz w:val="10"/>
+              </w:rPr>
+              <w:t>`e`p2wi</w:t>
+            </w:r>
+            <w:r>
+              <w:rPr>
+                <w:sz w:val="10"/>
+              </w:rPr>
+              <w:t xml:space="preserve"> </w:t>
+            </w:r>
+            <w:r>
+              <w:rPr>
+                <w:rFonts w:ascii="Avva_Shenouda" w:hAnsi="Avva_Shenouda" w:eastAsia="Avva_Shenouda" w:cs="Avva_Shenouda"/>
+                <w:sz w:val="10"/>
+              </w:rPr>
+              <w:t>`nte</w:t>
+            </w:r>
+            <w:r>
+              <w:rPr>
+                <w:sz w:val="10"/>
+              </w:rPr>
+              <w:t xml:space="preserve"> </w:t>
+            </w:r>
+            <w:r>
+              <w:rPr>
+                <w:rFonts w:ascii="Avva_Shenouda" w:hAnsi="Avva_Shenouda" w:eastAsia="Avva_Shenouda" w:cs="Avva_Shenouda"/>
+                <w:sz w:val="10"/>
+              </w:rPr>
+              <w:t>niiarwov</w:t>
+            </w:r>
+            <w:r>
+              <w:rPr>
+                <w:sz w:val="10"/>
+              </w:rPr>
+              <w:t xml:space="preserve"> </w:t>
+            </w:r>
+            <w:r>
+              <w:rPr>
+                <w:rFonts w:ascii="Avva_Shenouda" w:hAnsi="Avva_Shenouda" w:eastAsia="Avva_Shenouda" w:cs="Avva_Shenouda"/>
+                <w:sz w:val="10"/>
+              </w:rPr>
+              <w:t>`mmwov</w:t>
+            </w:r>
+            <w:r>
+              <w:rPr>
+                <w:sz w:val="10"/>
+              </w:rPr>
+              <w:t xml:space="preserve">: </w:t>
+            </w:r>
+            <w:r>
+              <w:rPr>
+                <w:rFonts w:ascii="Avva_Shenouda" w:hAnsi="Avva_Shenouda" w:eastAsia="Avva_Shenouda" w:cs="Avva_Shenouda"/>
+                <w:sz w:val="10"/>
+              </w:rPr>
+              <w:t>nici5</w:t>
+            </w:r>
+            <w:r>
+              <w:rPr>
+                <w:sz w:val="10"/>
+              </w:rPr>
+              <w:t xml:space="preserve"> </w:t>
+            </w:r>
+            <w:r>
+              <w:rPr>
+                <w:rFonts w:ascii="Avva_Shenouda" w:hAnsi="Avva_Shenouda" w:eastAsia="Avva_Shenouda" w:cs="Avva_Shenouda"/>
+                <w:sz w:val="10"/>
+              </w:rPr>
+              <w:t>nem</w:t>
+            </w:r>
+            <w:r>
+              <w:rPr>
+                <w:sz w:val="10"/>
+              </w:rPr>
+              <w:t xml:space="preserve"> </w:t>
+            </w:r>
+            <w:r>
+              <w:rPr>
+                <w:rFonts w:ascii="Avva_Shenouda" w:hAnsi="Avva_Shenouda" w:eastAsia="Avva_Shenouda" w:cs="Avva_Shenouda"/>
+                <w:sz w:val="10"/>
+              </w:rPr>
+              <w:t>nicim</w:t>
+            </w:r>
+            <w:r>
+              <w:rPr>
+                <w:sz w:val="10"/>
+              </w:rPr>
+              <w:t xml:space="preserve"> </w:t>
+            </w:r>
+            <w:r>
+              <w:rPr>
+                <w:rFonts w:ascii="Avva_Shenouda" w:hAnsi="Avva_Shenouda" w:eastAsia="Avva_Shenouda" w:cs="Avva_Shenouda"/>
+                <w:sz w:val="10"/>
+              </w:rPr>
+              <w:t>nem</w:t>
+            </w:r>
+            <w:r>
+              <w:rPr>
+                <w:sz w:val="10"/>
+              </w:rPr>
+              <w:t xml:space="preserve"> </w:t>
+            </w:r>
+            <w:r>
+              <w:rPr>
+                <w:rFonts w:ascii="Avva_Shenouda" w:hAnsi="Avva_Shenouda" w:eastAsia="Avva_Shenouda" w:cs="Avva_Shenouda"/>
+                <w:sz w:val="10"/>
+              </w:rPr>
+              <w:t>nirwt</w:t>
+            </w:r>
+            <w:r>
+              <w:rPr>
+                <w:sz w:val="10"/>
+              </w:rPr>
+              <w:t xml:space="preserve"> </w:t>
+            </w:r>
+            <w:r>
+              <w:rPr>
+                <w:rFonts w:ascii="Avva_Shenouda" w:hAnsi="Avva_Shenouda" w:eastAsia="Avva_Shenouda" w:cs="Avva_Shenouda"/>
+                <w:sz w:val="10"/>
+              </w:rPr>
+              <w:t>`nte</w:t>
+            </w:r>
+            <w:r>
+              <w:rPr>
+                <w:sz w:val="10"/>
+              </w:rPr>
+              <w:t xml:space="preserve"> </w:t>
+            </w:r>
+            <w:r>
+              <w:rPr>
+                <w:rFonts w:ascii="Avva_Shenouda" w:hAnsi="Avva_Shenouda" w:eastAsia="Avva_Shenouda" w:cs="Avva_Shenouda"/>
+                <w:sz w:val="10"/>
+              </w:rPr>
+              <w:t>`tkoi</w:t>
+            </w:r>
+            <w:r>
+              <w:rPr>
+                <w:sz w:val="10"/>
+              </w:rPr>
+              <w:t xml:space="preserve">: </w:t>
+            </w:r>
+            <w:r>
+              <w:rPr>
+                <w:rFonts w:ascii="Avva_Shenouda" w:hAnsi="Avva_Shenouda" w:eastAsia="Avva_Shenouda" w:cs="Avva_Shenouda"/>
+                <w:sz w:val="10"/>
+              </w:rPr>
+              <w:t>hina</w:t>
+            </w:r>
+            <w:r>
+              <w:rPr>
+                <w:sz w:val="10"/>
+              </w:rPr>
+              <w:t xml:space="preserve"> </w:t>
+            </w:r>
+            <w:r>
+              <w:rPr>
+                <w:rFonts w:ascii="Avva_Shenouda" w:hAnsi="Avva_Shenouda" w:eastAsia="Avva_Shenouda" w:cs="Avva_Shenouda"/>
+                <w:sz w:val="10"/>
+              </w:rPr>
+              <w:t>`nte</w:t>
+            </w:r>
+            <w:r>
+              <w:rPr>
+                <w:sz w:val="10"/>
+              </w:rPr>
+              <w:t xml:space="preserve"> </w:t>
+            </w:r>
+            <w:r>
+              <w:rPr>
+                <w:rFonts w:ascii="Avva_Shenouda" w:hAnsi="Avva_Shenouda" w:eastAsia="Avva_Shenouda" w:cs="Avva_Shenouda"/>
+                <w:sz w:val="10"/>
+              </w:rPr>
+              <w:t>P=x=c</w:t>
+            </w:r>
+            <w:r>
+              <w:rPr>
+                <w:sz w:val="10"/>
+              </w:rPr>
+              <w:t xml:space="preserve"> </w:t>
+            </w:r>
+            <w:r>
+              <w:rPr>
+                <w:rFonts w:ascii="Avva_Shenouda" w:hAnsi="Avva_Shenouda" w:eastAsia="Avva_Shenouda" w:cs="Avva_Shenouda"/>
+                <w:sz w:val="10"/>
+              </w:rPr>
+              <w:t>pennov5</w:t>
+            </w:r>
+            <w:r>
+              <w:rPr>
+                <w:sz w:val="10"/>
+              </w:rPr>
+              <w:t xml:space="preserve"> </w:t>
+            </w:r>
+            <w:r>
+              <w:rPr>
+                <w:rFonts w:ascii="Avva_Shenouda" w:hAnsi="Avva_Shenouda" w:eastAsia="Avva_Shenouda" w:cs="Avva_Shenouda"/>
+                <w:sz w:val="10"/>
+              </w:rPr>
+              <w:t>`cmov</w:t>
+            </w:r>
+            <w:r>
+              <w:rPr>
+                <w:sz w:val="10"/>
+              </w:rPr>
+              <w:t xml:space="preserve"> </w:t>
+            </w:r>
+            <w:r>
+              <w:rPr>
+                <w:rFonts w:ascii="Avva_Shenouda" w:hAnsi="Avva_Shenouda" w:eastAsia="Avva_Shenouda" w:cs="Avva_Shenouda"/>
+                <w:sz w:val="10"/>
+              </w:rPr>
+              <w:t>`erwov</w:t>
+            </w:r>
+            <w:r>
+              <w:rPr>
+                <w:sz w:val="10"/>
+              </w:rPr>
+              <w:t xml:space="preserve"> </w:t>
+            </w:r>
+            <w:r>
+              <w:rPr>
+                <w:rFonts w:ascii="Avva_Shenouda" w:hAnsi="Avva_Shenouda" w:eastAsia="Avva_Shenouda" w:cs="Avva_Shenouda"/>
+                <w:sz w:val="10"/>
+              </w:rPr>
+              <w:t>ovoh</w:t>
+            </w:r>
+            <w:r>
+              <w:rPr>
+                <w:sz w:val="10"/>
+              </w:rPr>
+              <w:t xml:space="preserve"> </w:t>
+            </w:r>
+            <w:r>
+              <w:rPr>
+                <w:rFonts w:ascii="Avva_Shenouda" w:hAnsi="Avva_Shenouda" w:eastAsia="Avva_Shenouda" w:cs="Avva_Shenouda"/>
+                <w:sz w:val="10"/>
+              </w:rPr>
+              <w:t>`nte42enh3t</w:t>
+            </w:r>
+            <w:r>
+              <w:rPr>
+                <w:sz w:val="10"/>
+              </w:rPr>
+              <w:t xml:space="preserve"> </w:t>
+            </w:r>
+            <w:r>
+              <w:rPr>
+                <w:rFonts w:ascii="Avva_Shenouda" w:hAnsi="Avva_Shenouda" w:eastAsia="Avva_Shenouda" w:cs="Avva_Shenouda"/>
+                <w:sz w:val="10"/>
+              </w:rPr>
+              <w:t>qa</w:t>
+            </w:r>
+            <w:r>
+              <w:rPr>
+                <w:sz w:val="10"/>
+              </w:rPr>
+              <w:t xml:space="preserve"> </w:t>
+            </w:r>
+            <w:r>
+              <w:rPr>
+                <w:rFonts w:ascii="Avva_Shenouda" w:hAnsi="Avva_Shenouda" w:eastAsia="Avva_Shenouda" w:cs="Avva_Shenouda"/>
+                <w:sz w:val="10"/>
+              </w:rPr>
+              <w:t>pe4`placma</w:t>
+            </w:r>
+            <w:r>
+              <w:rPr>
+                <w:sz w:val="10"/>
+              </w:rPr>
+              <w:t xml:space="preserve"> </w:t>
+            </w:r>
+            <w:r>
+              <w:rPr>
+                <w:rFonts w:ascii="Avva_Shenouda" w:hAnsi="Avva_Shenouda" w:eastAsia="Avva_Shenouda" w:cs="Avva_Shenouda"/>
+                <w:sz w:val="10"/>
+              </w:rPr>
+              <w:t>`eta</w:t>
+            </w:r>
+            <w:r>
+              <w:rPr>
+                <w:sz w:val="10"/>
+              </w:rPr>
+              <w:t xml:space="preserve"> </w:t>
+            </w:r>
+            <w:r>
+              <w:rPr>
+                <w:rFonts w:ascii="Avva_Shenouda" w:hAnsi="Avva_Shenouda" w:eastAsia="Avva_Shenouda" w:cs="Avva_Shenouda"/>
+                <w:sz w:val="10"/>
+              </w:rPr>
+              <w:t>ne4gig</w:t>
+            </w:r>
+            <w:r>
+              <w:rPr>
+                <w:sz w:val="10"/>
+              </w:rPr>
+              <w:t xml:space="preserve"> </w:t>
+            </w:r>
+            <w:r>
+              <w:rPr>
+                <w:rFonts w:ascii="Avva_Shenouda" w:hAnsi="Avva_Shenouda" w:eastAsia="Avva_Shenouda" w:cs="Avva_Shenouda"/>
+                <w:sz w:val="10"/>
+              </w:rPr>
+              <w:t>0amio4</w:t>
+            </w:r>
+            <w:r>
+              <w:rPr>
+                <w:sz w:val="10"/>
+              </w:rPr>
+              <w:t xml:space="preserve"> </w:t>
+            </w:r>
+            <w:r>
+              <w:rPr>
+                <w:rFonts w:ascii="Avva_Shenouda" w:hAnsi="Avva_Shenouda" w:eastAsia="Avva_Shenouda" w:cs="Avva_Shenouda"/>
+                <w:sz w:val="10"/>
+              </w:rPr>
+              <w:t>`nte4xa</w:t>
+            </w:r>
+            <w:r>
+              <w:rPr>
+                <w:sz w:val="10"/>
+              </w:rPr>
+              <w:t xml:space="preserve"> </w:t>
+            </w:r>
+            <w:r>
+              <w:rPr>
+                <w:rFonts w:ascii="Avva_Shenouda" w:hAnsi="Avva_Shenouda" w:eastAsia="Avva_Shenouda" w:cs="Avva_Shenouda"/>
+                <w:sz w:val="10"/>
+              </w:rPr>
+              <w:t>nennobi</w:t>
+            </w:r>
+            <w:r>
+              <w:rPr>
+                <w:sz w:val="10"/>
+              </w:rPr>
+              <w:t xml:space="preserve"> </w:t>
+            </w:r>
+            <w:r>
+              <w:rPr>
+                <w:rFonts w:ascii="Avva_Shenouda" w:hAnsi="Avva_Shenouda" w:eastAsia="Avva_Shenouda" w:cs="Avva_Shenouda"/>
+                <w:sz w:val="10"/>
+              </w:rPr>
+              <w:t>nan</w:t>
+            </w:r>
+            <w:r>
+              <w:rPr>
+                <w:sz w:val="10"/>
+              </w:rPr>
+              <w:t xml:space="preserve"> </w:t>
+            </w:r>
+            <w:r>
+              <w:rPr>
+                <w:rFonts w:ascii="Avva_Shenouda" w:hAnsi="Avva_Shenouda" w:eastAsia="Avva_Shenouda" w:cs="Avva_Shenouda"/>
+                <w:sz w:val="10"/>
+              </w:rPr>
+              <w:t>`ebol</w:t>
+            </w:r>
+            <w:r>
+              <w:rPr>
+                <w:sz w:val="10"/>
+              </w:rPr>
+              <w:t>.</w:t>
             </w:r>
           </w:p>
         </w:tc>
@@ -1065,7 +5303,273 @@
                 <w:rFonts w:ascii="Avva_Shenouda" w:hAnsi="Avva_Shenouda" w:eastAsia="Avva_Shenouda" w:cs="Avva_Shenouda"/>
                 <w:sz w:val="10"/>
               </w:rPr>
-              <w:t>`Procev7ac0e `vper t3c cwt3rian tov kocmov ke t3c polewc `3mwn tavt3c ke pacwn polewn ke twn xwrwn ke n3cwn ke monact3rion.</w:t>
+              <w:t>`Procev7ac0e</w:t>
+            </w:r>
+            <w:r>
+              <w:rPr>
+                <w:sz w:val="10"/>
+              </w:rPr>
+              <w:t xml:space="preserve"> </w:t>
+            </w:r>
+            <w:r>
+              <w:rPr>
+                <w:rFonts w:ascii="Avva_Shenouda" w:hAnsi="Avva_Shenouda" w:eastAsia="Avva_Shenouda" w:cs="Avva_Shenouda"/>
+                <w:sz w:val="10"/>
+              </w:rPr>
+              <w:t>`vper</w:t>
+            </w:r>
+            <w:r>
+              <w:rPr>
+                <w:sz w:val="10"/>
+              </w:rPr>
+              <w:t xml:space="preserve"> </w:t>
+            </w:r>
+            <w:r>
+              <w:rPr>
+                <w:rFonts w:ascii="Avva_Shenouda" w:hAnsi="Avva_Shenouda" w:eastAsia="Avva_Shenouda" w:cs="Avva_Shenouda"/>
+                <w:sz w:val="10"/>
+              </w:rPr>
+              <w:t>t3c</w:t>
+            </w:r>
+            <w:r>
+              <w:rPr>
+                <w:sz w:val="10"/>
+              </w:rPr>
+              <w:t xml:space="preserve"> </w:t>
+            </w:r>
+            <w:r>
+              <w:rPr>
+                <w:rFonts w:ascii="Avva_Shenouda" w:hAnsi="Avva_Shenouda" w:eastAsia="Avva_Shenouda" w:cs="Avva_Shenouda"/>
+                <w:sz w:val="10"/>
+              </w:rPr>
+              <w:t>cwt3rian</w:t>
+            </w:r>
+            <w:r>
+              <w:rPr>
+                <w:sz w:val="10"/>
+              </w:rPr>
+              <w:t xml:space="preserve"> </w:t>
+            </w:r>
+            <w:r>
+              <w:rPr>
+                <w:rFonts w:ascii="Avva_Shenouda" w:hAnsi="Avva_Shenouda" w:eastAsia="Avva_Shenouda" w:cs="Avva_Shenouda"/>
+                <w:sz w:val="10"/>
+              </w:rPr>
+              <w:t>tov</w:t>
+            </w:r>
+            <w:r>
+              <w:rPr>
+                <w:sz w:val="10"/>
+              </w:rPr>
+              <w:t xml:space="preserve"> </w:t>
+            </w:r>
+            <w:r>
+              <w:rPr>
+                <w:rFonts w:ascii="Avva_Shenouda" w:hAnsi="Avva_Shenouda" w:eastAsia="Avva_Shenouda" w:cs="Avva_Shenouda"/>
+                <w:sz w:val="10"/>
+              </w:rPr>
+              <w:t>kocmov</w:t>
+            </w:r>
+            <w:r>
+              <w:rPr>
+                <w:sz w:val="10"/>
+              </w:rPr>
+              <w:t xml:space="preserve"> </w:t>
+            </w:r>
+            <w:r>
+              <w:rPr>
+                <w:rFonts w:ascii="Avva_Shenouda" w:hAnsi="Avva_Shenouda" w:eastAsia="Avva_Shenouda" w:cs="Avva_Shenouda"/>
+                <w:sz w:val="10"/>
+              </w:rPr>
+              <w:t>ke</w:t>
+            </w:r>
+            <w:r>
+              <w:rPr>
+                <w:sz w:val="10"/>
+              </w:rPr>
+              <w:t xml:space="preserve"> </w:t>
+            </w:r>
+            <w:r>
+              <w:rPr>
+                <w:rFonts w:ascii="Avva_Shenouda" w:hAnsi="Avva_Shenouda" w:eastAsia="Avva_Shenouda" w:cs="Avva_Shenouda"/>
+                <w:sz w:val="10"/>
+              </w:rPr>
+              <w:t>t3c</w:t>
+            </w:r>
+            <w:r>
+              <w:rPr>
+                <w:sz w:val="10"/>
+              </w:rPr>
+              <w:t xml:space="preserve"> </w:t>
+            </w:r>
+            <w:r>
+              <w:rPr>
+                <w:rFonts w:ascii="Avva_Shenouda" w:hAnsi="Avva_Shenouda" w:eastAsia="Avva_Shenouda" w:cs="Avva_Shenouda"/>
+                <w:sz w:val="10"/>
+              </w:rPr>
+              <w:t>polewc</w:t>
+            </w:r>
+            <w:r>
+              <w:rPr>
+                <w:sz w:val="10"/>
+              </w:rPr>
+              <w:t xml:space="preserve"> </w:t>
+            </w:r>
+            <w:r>
+              <w:rPr>
+                <w:rFonts w:ascii="Avva_Shenouda" w:hAnsi="Avva_Shenouda" w:eastAsia="Avva_Shenouda" w:cs="Avva_Shenouda"/>
+                <w:sz w:val="10"/>
+              </w:rPr>
+              <w:t>`3mwn</w:t>
+            </w:r>
+            <w:r>
+              <w:rPr>
+                <w:sz w:val="10"/>
+              </w:rPr>
+              <w:t xml:space="preserve"> </w:t>
+            </w:r>
+            <w:r>
+              <w:rPr>
+                <w:rFonts w:ascii="Avva_Shenouda" w:hAnsi="Avva_Shenouda" w:eastAsia="Avva_Shenouda" w:cs="Avva_Shenouda"/>
+                <w:sz w:val="10"/>
+              </w:rPr>
+              <w:t>tavt3c</w:t>
+            </w:r>
+            <w:r>
+              <w:rPr>
+                <w:sz w:val="10"/>
+              </w:rPr>
+              <w:t xml:space="preserve"> </w:t>
+            </w:r>
+            <w:r>
+              <w:rPr>
+                <w:rFonts w:ascii="Avva_Shenouda" w:hAnsi="Avva_Shenouda" w:eastAsia="Avva_Shenouda" w:cs="Avva_Shenouda"/>
+                <w:sz w:val="10"/>
+              </w:rPr>
+              <w:t>ke</w:t>
+            </w:r>
+            <w:r>
+              <w:rPr>
+                <w:sz w:val="10"/>
+              </w:rPr>
+              <w:t xml:space="preserve"> </w:t>
+            </w:r>
+            <w:r>
+              <w:rPr>
+                <w:rFonts w:ascii="Avva_Shenouda" w:hAnsi="Avva_Shenouda" w:eastAsia="Avva_Shenouda" w:cs="Avva_Shenouda"/>
+                <w:sz w:val="10"/>
+              </w:rPr>
+              <w:t>pacwn</w:t>
+            </w:r>
+            <w:r>
+              <w:rPr>
+                <w:sz w:val="10"/>
+              </w:rPr>
+              <w:t xml:space="preserve"> </w:t>
+            </w:r>
+            <w:r>
+              <w:rPr>
+                <w:rFonts w:ascii="Avva_Shenouda" w:hAnsi="Avva_Shenouda" w:eastAsia="Avva_Shenouda" w:cs="Avva_Shenouda"/>
+                <w:sz w:val="10"/>
+              </w:rPr>
+              <w:t>polewn</w:t>
+            </w:r>
+            <w:r>
+              <w:rPr>
+                <w:sz w:val="10"/>
+              </w:rPr>
+              <w:t xml:space="preserve"> </w:t>
+            </w:r>
+            <w:r>
+              <w:rPr>
+                <w:rFonts w:ascii="Avva_Shenouda" w:hAnsi="Avva_Shenouda" w:eastAsia="Avva_Shenouda" w:cs="Avva_Shenouda"/>
+                <w:sz w:val="10"/>
+              </w:rPr>
+              <w:t>ke</w:t>
+            </w:r>
+            <w:r>
+              <w:rPr>
+                <w:sz w:val="10"/>
+              </w:rPr>
+              <w:t xml:space="preserve"> </w:t>
+            </w:r>
+            <w:r>
+              <w:rPr>
+                <w:rFonts w:ascii="Avva_Shenouda" w:hAnsi="Avva_Shenouda" w:eastAsia="Avva_Shenouda" w:cs="Avva_Shenouda"/>
+                <w:sz w:val="10"/>
+              </w:rPr>
+              <w:t>twn</w:t>
+            </w:r>
+            <w:r>
+              <w:rPr>
+                <w:sz w:val="10"/>
+              </w:rPr>
+              <w:t xml:space="preserve"> </w:t>
+            </w:r>
+            <w:r>
+              <w:rPr>
+                <w:rFonts w:ascii="Avva_Shenouda" w:hAnsi="Avva_Shenouda" w:eastAsia="Avva_Shenouda" w:cs="Avva_Shenouda"/>
+                <w:sz w:val="10"/>
+              </w:rPr>
+              <w:t>xwrwn</w:t>
+            </w:r>
+            <w:r>
+              <w:rPr>
+                <w:sz w:val="10"/>
+              </w:rPr>
+              <w:t xml:space="preserve"> </w:t>
+            </w:r>
+            <w:r>
+              <w:rPr>
+                <w:rFonts w:ascii="Avva_Shenouda" w:hAnsi="Avva_Shenouda" w:eastAsia="Avva_Shenouda" w:cs="Avva_Shenouda"/>
+                <w:sz w:val="10"/>
+              </w:rPr>
+              <w:t>ke</w:t>
+            </w:r>
+            <w:r>
+              <w:rPr>
+                <w:sz w:val="10"/>
+              </w:rPr>
+              <w:t xml:space="preserve"> </w:t>
+            </w:r>
+            <w:r>
+              <w:rPr>
+                <w:rFonts w:ascii="Avva_Shenouda" w:hAnsi="Avva_Shenouda" w:eastAsia="Avva_Shenouda" w:cs="Avva_Shenouda"/>
+                <w:sz w:val="10"/>
+              </w:rPr>
+              <w:t>n3cwn</w:t>
+            </w:r>
+            <w:r>
+              <w:rPr>
+                <w:sz w:val="10"/>
+              </w:rPr>
+              <w:t xml:space="preserve"> </w:t>
+            </w:r>
+            <w:r>
+              <w:rPr>
+                <w:rFonts w:ascii="Avva_Shenouda" w:hAnsi="Avva_Shenouda" w:eastAsia="Avva_Shenouda" w:cs="Avva_Shenouda"/>
+                <w:sz w:val="10"/>
+              </w:rPr>
+              <w:t>ke</w:t>
+            </w:r>
+            <w:r>
+              <w:rPr>
+                <w:sz w:val="10"/>
+              </w:rPr>
+              <w:t xml:space="preserve"> </w:t>
+            </w:r>
+            <w:r>
+              <w:rPr>
+                <w:rFonts w:ascii="Avva_Shenouda" w:hAnsi="Avva_Shenouda" w:eastAsia="Avva_Shenouda" w:cs="Avva_Shenouda"/>
+                <w:sz w:val="10"/>
+              </w:rPr>
+              <w:t>monact3rion</w:t>
+            </w:r>
+            <w:r>
+              <w:rPr>
+                <w:sz w:val="10"/>
+              </w:rPr>
+              <w:t>.</w:t>
             </w:r>
           </w:p>
         </w:tc>
@@ -1136,7 +5640,78 @@
                 <w:rFonts w:ascii="Avva_Shenouda" w:hAnsi="Avva_Shenouda" w:eastAsia="Avva_Shenouda" w:cs="Avva_Shenouda"/>
                 <w:sz w:val="10"/>
               </w:rPr>
-              <w:t>Tac kefalac `vmwn tw Kvriw `klinnate.</w:t>
+              <w:t>Tac</w:t>
+            </w:r>
+            <w:r>
+              <w:rPr>
+                <w:sz w:val="10"/>
+              </w:rPr>
+              <w:t xml:space="preserve"> </w:t>
+            </w:r>
+            <w:r>
+              <w:rPr>
+                <w:rFonts w:ascii="Avva_Shenouda" w:hAnsi="Avva_Shenouda" w:eastAsia="Avva_Shenouda" w:cs="Avva_Shenouda"/>
+                <w:sz w:val="10"/>
+              </w:rPr>
+              <w:t>kefalac</w:t>
+            </w:r>
+            <w:r>
+              <w:rPr>
+                <w:sz w:val="10"/>
+              </w:rPr>
+              <w:t xml:space="preserve"> </w:t>
+            </w:r>
+            <w:r>
+              <w:rPr>
+                <w:rFonts w:ascii="Avva_Shenouda" w:hAnsi="Avva_Shenouda" w:eastAsia="Avva_Shenouda" w:cs="Avva_Shenouda"/>
+                <w:sz w:val="10"/>
+              </w:rPr>
+              <w:t>`vmwn</w:t>
+            </w:r>
+            <w:r>
+              <w:rPr>
+                <w:sz w:val="10"/>
+              </w:rPr>
+              <w:t xml:space="preserve"> </w:t>
+            </w:r>
+            <w:r>
+              <w:rPr>
+                <w:rFonts w:ascii="Avva_Shenouda" w:hAnsi="Avva_Shenouda" w:eastAsia="Avva_Shenouda" w:cs="Avva_Shenouda"/>
+                <w:sz w:val="10"/>
+              </w:rPr>
+              <w:t>tw</w:t>
+            </w:r>
+            <w:r>
+              <w:rPr>
+                <w:sz w:val="10"/>
+              </w:rPr>
+              <w:t xml:space="preserve"> </w:t>
+            </w:r>
+            <w:r>
+              <w:rPr>
+                <w:rFonts w:ascii="Avva_Shenouda" w:hAnsi="Avva_Shenouda" w:eastAsia="Avva_Shenouda" w:cs="Avva_Shenouda"/>
+                <w:sz w:val="10"/>
+              </w:rPr>
+              <w:t>Kvriw</w:t>
+            </w:r>
+            <w:r>
+              <w:rPr>
+                <w:sz w:val="10"/>
+              </w:rPr>
+              <w:t xml:space="preserve"> </w:t>
+            </w:r>
+            <w:r>
+              <w:rPr>
+                <w:rFonts w:ascii="Avva_Shenouda" w:hAnsi="Avva_Shenouda" w:eastAsia="Avva_Shenouda" w:cs="Avva_Shenouda"/>
+                <w:sz w:val="10"/>
+              </w:rPr>
+              <w:t>`klinnate</w:t>
+            </w:r>
+            <w:r>
+              <w:rPr>
+                <w:sz w:val="10"/>
+              </w:rPr>
+              <w:t>.</w:t>
             </w:r>
           </w:p>
         </w:tc>
@@ -1207,7 +5782,65 @@
                 <w:rFonts w:ascii="Avva_Shenouda" w:hAnsi="Avva_Shenouda" w:eastAsia="Avva_Shenouda" w:cs="Avva_Shenouda"/>
                 <w:sz w:val="10"/>
               </w:rPr>
-              <w:t>Procxwmen )ev meta fobov. Am3n.</w:t>
+              <w:t>Procxwmen</w:t>
+            </w:r>
+            <w:r>
+              <w:rPr>
+                <w:sz w:val="10"/>
+              </w:rPr>
+              <w:t xml:space="preserve"> </w:t>
+            </w:r>
+            <w:r>
+              <w:rPr>
+                <w:rFonts w:ascii="Avva_Shenouda" w:hAnsi="Avva_Shenouda" w:eastAsia="Avva_Shenouda" w:cs="Avva_Shenouda"/>
+                <w:sz w:val="10"/>
+              </w:rPr>
+              <w:t>)ev</w:t>
+            </w:r>
+            <w:r>
+              <w:rPr>
+                <w:sz w:val="10"/>
+              </w:rPr>
+              <w:t xml:space="preserve"> </w:t>
+            </w:r>
+            <w:r>
+              <w:rPr>
+                <w:rFonts w:ascii="Avva_Shenouda" w:hAnsi="Avva_Shenouda" w:eastAsia="Avva_Shenouda" w:cs="Avva_Shenouda"/>
+                <w:sz w:val="10"/>
+              </w:rPr>
+              <w:t>meta</w:t>
+            </w:r>
+            <w:r>
+              <w:rPr>
+                <w:sz w:val="10"/>
+              </w:rPr>
+              <w:t xml:space="preserve"> </w:t>
+            </w:r>
+            <w:r>
+              <w:rPr>
+                <w:rFonts w:ascii="Avva_Shenouda" w:hAnsi="Avva_Shenouda" w:eastAsia="Avva_Shenouda" w:cs="Avva_Shenouda"/>
+                <w:sz w:val="10"/>
+              </w:rPr>
+              <w:t>fobov</w:t>
+            </w:r>
+            <w:r>
+              <w:rPr>
+                <w:sz w:val="10"/>
+              </w:rPr>
+              <w:t xml:space="preserve">. </w:t>
+            </w:r>
+            <w:r>
+              <w:rPr>
+                <w:rFonts w:ascii="Avva_Shenouda" w:hAnsi="Avva_Shenouda" w:eastAsia="Avva_Shenouda" w:cs="Avva_Shenouda"/>
+                <w:sz w:val="10"/>
+              </w:rPr>
+              <w:t>Am3n</w:t>
+            </w:r>
+            <w:r>
+              <w:rPr>
+                <w:sz w:val="10"/>
+              </w:rPr>
+              <w:t>.</w:t>
             </w:r>
           </w:p>
         </w:tc>
@@ -1278,7 +5911,130 @@
                 <w:rFonts w:ascii="Avva_Shenouda" w:hAnsi="Avva_Shenouda" w:eastAsia="Avva_Shenouda" w:cs="Avva_Shenouda"/>
                 <w:sz w:val="10"/>
               </w:rPr>
-              <w:t>Cw0ic `am3n: ke tw `pnevmati cov: meta fobov )ev `procxwmen.</w:t>
+              <w:t>Cw0ic</w:t>
+            </w:r>
+            <w:r>
+              <w:rPr>
+                <w:sz w:val="10"/>
+              </w:rPr>
+              <w:t xml:space="preserve"> </w:t>
+            </w:r>
+            <w:r>
+              <w:rPr>
+                <w:rFonts w:ascii="Avva_Shenouda" w:hAnsi="Avva_Shenouda" w:eastAsia="Avva_Shenouda" w:cs="Avva_Shenouda"/>
+                <w:sz w:val="10"/>
+              </w:rPr>
+              <w:t>`am3n</w:t>
+            </w:r>
+            <w:r>
+              <w:rPr>
+                <w:sz w:val="10"/>
+              </w:rPr>
+              <w:t xml:space="preserve">: </w:t>
+            </w:r>
+            <w:r>
+              <w:rPr>
+                <w:rFonts w:ascii="Avva_Shenouda" w:hAnsi="Avva_Shenouda" w:eastAsia="Avva_Shenouda" w:cs="Avva_Shenouda"/>
+                <w:sz w:val="10"/>
+              </w:rPr>
+              <w:t>ke</w:t>
+            </w:r>
+            <w:r>
+              <w:rPr>
+                <w:sz w:val="10"/>
+              </w:rPr>
+              <w:t xml:space="preserve"> </w:t>
+            </w:r>
+            <w:r>
+              <w:rPr>
+                <w:rFonts w:ascii="Avva_Shenouda" w:hAnsi="Avva_Shenouda" w:eastAsia="Avva_Shenouda" w:cs="Avva_Shenouda"/>
+                <w:sz w:val="10"/>
+              </w:rPr>
+              <w:t>tw</w:t>
+            </w:r>
+            <w:r>
+              <w:rPr>
+                <w:sz w:val="10"/>
+              </w:rPr>
+              <w:t xml:space="preserve"> </w:t>
+            </w:r>
+            <w:r>
+              <w:rPr>
+                <w:rFonts w:ascii="Avva_Shenouda" w:hAnsi="Avva_Shenouda" w:eastAsia="Avva_Shenouda" w:cs="Avva_Shenouda"/>
+                <w:sz w:val="10"/>
+              </w:rPr>
+              <w:t>`pnevmati</w:t>
+            </w:r>
+            <w:r>
+              <w:rPr>
+                <w:sz w:val="10"/>
+              </w:rPr>
+              <w:t xml:space="preserve"> </w:t>
+            </w:r>
+            <w:r>
+              <w:rPr>
+                <w:rFonts w:ascii="Avva_Shenouda" w:hAnsi="Avva_Shenouda" w:eastAsia="Avva_Shenouda" w:cs="Avva_Shenouda"/>
+                <w:sz w:val="10"/>
+              </w:rPr>
+              <w:t>cov</w:t>
+            </w:r>
+            <w:r>
+              <w:rPr>
+                <w:sz w:val="10"/>
+              </w:rPr>
+              <w:t xml:space="preserve">: </w:t>
+            </w:r>
+            <w:r>
+              <w:rPr>
+                <w:rFonts w:ascii="Avva_Shenouda" w:hAnsi="Avva_Shenouda" w:eastAsia="Avva_Shenouda" w:cs="Avva_Shenouda"/>
+                <w:sz w:val="10"/>
+              </w:rPr>
+              <w:t>meta</w:t>
+            </w:r>
+            <w:r>
+              <w:rPr>
+                <w:sz w:val="10"/>
+              </w:rPr>
+              <w:t xml:space="preserve"> </w:t>
+            </w:r>
+            <w:r>
+              <w:rPr>
+                <w:rFonts w:ascii="Avva_Shenouda" w:hAnsi="Avva_Shenouda" w:eastAsia="Avva_Shenouda" w:cs="Avva_Shenouda"/>
+                <w:sz w:val="10"/>
+              </w:rPr>
+              <w:t>fobov</w:t>
+            </w:r>
+            <w:r>
+              <w:rPr>
+                <w:sz w:val="10"/>
+              </w:rPr>
+              <w:t xml:space="preserve"> </w:t>
+            </w:r>
+            <w:r>
+              <w:rPr>
+                <w:rFonts w:ascii="Avva_Shenouda" w:hAnsi="Avva_Shenouda" w:eastAsia="Avva_Shenouda" w:cs="Avva_Shenouda"/>
+                <w:sz w:val="10"/>
+              </w:rPr>
+              <w:t>)ev</w:t>
+            </w:r>
+            <w:r>
+              <w:rPr>
+                <w:sz w:val="10"/>
+              </w:rPr>
+              <w:t xml:space="preserve"> </w:t>
+            </w:r>
+            <w:r>
+              <w:rPr>
+                <w:rFonts w:ascii="Avva_Shenouda" w:hAnsi="Avva_Shenouda" w:eastAsia="Avva_Shenouda" w:cs="Avva_Shenouda"/>
+                <w:sz w:val="10"/>
+              </w:rPr>
+              <w:t>`procxwmen</w:t>
+            </w:r>
+            <w:r>
+              <w:rPr>
+                <w:sz w:val="10"/>
+              </w:rPr>
+              <w:t>.</w:t>
             </w:r>
           </w:p>
         </w:tc>

</xml_diff>